<commit_message>
OE3 deliverable republished with the corrected acta codes
</commit_message>
<xml_diff>
--- a/docs/Solucion_OE3_Prototipo_funcional.docx
+++ b/docs/Solucion_OE3_Prototipo_funcional.docx
@@ -24,7 +24,7 @@
       <w:r>
         <w:fldChar w:fldCharType="separate"/>
       </w:r>
-      <w:hyperlink w:anchor="_Toc242194817" w:history="1">
+      <w:hyperlink w:anchor="_Toc242198204" w:history="1">
         <w:r>
           <w:rPr>
             <w:rStyle w:val="Hipervnculo"/>
@@ -51,7 +51,7 @@
             <w:noProof/>
             <w:webHidden/>
           </w:rPr>
-          <w:instrText xml:space="preserve"> PAGEREF _Toc242194817 \h </w:instrText>
+          <w:instrText xml:space="preserve"> PAGEREF _Toc242198204 \h </w:instrText>
         </w:r>
         <w:r>
           <w:rPr>
@@ -95,7 +95,7 @@
           <w14:ligatures w14:val="standardContextual"/>
         </w:rPr>
       </w:pPr>
-      <w:hyperlink w:anchor="_Toc242194818" w:history="1">
+      <w:hyperlink w:anchor="_Toc242198205" w:history="1">
         <w:r>
           <w:rPr>
             <w:rStyle w:val="Hipervnculo"/>
@@ -122,7 +122,7 @@
             <w:noProof/>
             <w:webHidden/>
           </w:rPr>
-          <w:instrText xml:space="preserve"> PAGEREF _Toc242194818 \h </w:instrText>
+          <w:instrText xml:space="preserve"> PAGEREF _Toc242198205 \h </w:instrText>
         </w:r>
         <w:r>
           <w:rPr>
@@ -166,7 +166,7 @@
           <w14:ligatures w14:val="standardContextual"/>
         </w:rPr>
       </w:pPr>
-      <w:hyperlink w:anchor="_Toc242194819" w:history="1">
+      <w:hyperlink w:anchor="_Toc242198206" w:history="1">
         <w:r>
           <w:rPr>
             <w:rStyle w:val="Hipervnculo"/>
@@ -193,7 +193,7 @@
             <w:noProof/>
             <w:webHidden/>
           </w:rPr>
-          <w:instrText xml:space="preserve"> PAGEREF _Toc242194819 \h </w:instrText>
+          <w:instrText xml:space="preserve"> PAGEREF _Toc242198206 \h </w:instrText>
         </w:r>
         <w:r>
           <w:rPr>
@@ -237,7 +237,7 @@
           <w14:ligatures w14:val="standardContextual"/>
         </w:rPr>
       </w:pPr>
-      <w:hyperlink w:anchor="_Toc242194820" w:history="1">
+      <w:hyperlink w:anchor="_Toc242198207" w:history="1">
         <w:r>
           <w:rPr>
             <w:rStyle w:val="Hipervnculo"/>
@@ -264,7 +264,7 @@
             <w:noProof/>
             <w:webHidden/>
           </w:rPr>
-          <w:instrText xml:space="preserve"> PAGEREF _Toc242194820 \h </w:instrText>
+          <w:instrText xml:space="preserve"> PAGEREF _Toc242198207 \h </w:instrText>
         </w:r>
         <w:r>
           <w:rPr>
@@ -308,7 +308,7 @@
           <w14:ligatures w14:val="standardContextual"/>
         </w:rPr>
       </w:pPr>
-      <w:hyperlink w:anchor="_Toc242194821" w:history="1">
+      <w:hyperlink w:anchor="_Toc242198208" w:history="1">
         <w:r>
           <w:rPr>
             <w:rStyle w:val="Hipervnculo"/>
@@ -335,7 +335,7 @@
             <w:noProof/>
             <w:webHidden/>
           </w:rPr>
-          <w:instrText xml:space="preserve"> PAGEREF _Toc242194821 \h </w:instrText>
+          <w:instrText xml:space="preserve"> PAGEREF _Toc242198208 \h </w:instrText>
         </w:r>
         <w:r>
           <w:rPr>
@@ -379,7 +379,7 @@
           <w14:ligatures w14:val="standardContextual"/>
         </w:rPr>
       </w:pPr>
-      <w:hyperlink w:anchor="_Toc242194822" w:history="1">
+      <w:hyperlink w:anchor="_Toc242198209" w:history="1">
         <w:r>
           <w:rPr>
             <w:rStyle w:val="Hipervnculo"/>
@@ -406,7 +406,7 @@
             <w:noProof/>
             <w:webHidden/>
           </w:rPr>
-          <w:instrText xml:space="preserve"> PAGEREF _Toc242194822 \h </w:instrText>
+          <w:instrText xml:space="preserve"> PAGEREF _Toc242198209 \h </w:instrText>
         </w:r>
         <w:r>
           <w:rPr>
@@ -450,7 +450,7 @@
           <w14:ligatures w14:val="standardContextual"/>
         </w:rPr>
       </w:pPr>
-      <w:hyperlink w:anchor="_Toc242194823" w:history="1">
+      <w:hyperlink w:anchor="_Toc242198210" w:history="1">
         <w:r>
           <w:rPr>
             <w:rStyle w:val="Hipervnculo"/>
@@ -477,7 +477,7 @@
             <w:noProof/>
             <w:webHidden/>
           </w:rPr>
-          <w:instrText xml:space="preserve"> PAGEREF _Toc242194823 \h </w:instrText>
+          <w:instrText xml:space="preserve"> PAGEREF _Toc242198210 \h </w:instrText>
         </w:r>
         <w:r>
           <w:rPr>
@@ -521,7 +521,7 @@
           <w14:ligatures w14:val="standardContextual"/>
         </w:rPr>
       </w:pPr>
-      <w:hyperlink w:anchor="_Toc242194824" w:history="1">
+      <w:hyperlink w:anchor="_Toc242198211" w:history="1">
         <w:r>
           <w:rPr>
             <w:rStyle w:val="Hipervnculo"/>
@@ -548,7 +548,7 @@
             <w:noProof/>
             <w:webHidden/>
           </w:rPr>
-          <w:instrText xml:space="preserve"> PAGEREF _Toc242194824 \h </w:instrText>
+          <w:instrText xml:space="preserve"> PAGEREF _Toc242198211 \h </w:instrText>
         </w:r>
         <w:r>
           <w:rPr>
@@ -592,7 +592,7 @@
           <w14:ligatures w14:val="standardContextual"/>
         </w:rPr>
       </w:pPr>
-      <w:hyperlink w:anchor="_Toc242194825" w:history="1">
+      <w:hyperlink w:anchor="_Toc242198212" w:history="1">
         <w:r>
           <w:rPr>
             <w:rStyle w:val="Hipervnculo"/>
@@ -619,7 +619,7 @@
             <w:noProof/>
             <w:webHidden/>
           </w:rPr>
-          <w:instrText xml:space="preserve"> PAGEREF _Toc242194825 \h </w:instrText>
+          <w:instrText xml:space="preserve"> PAGEREF _Toc242198212 \h </w:instrText>
         </w:r>
         <w:r>
           <w:rPr>
@@ -663,7 +663,7 @@
           <w14:ligatures w14:val="standardContextual"/>
         </w:rPr>
       </w:pPr>
-      <w:hyperlink w:anchor="_Toc242194826" w:history="1">
+      <w:hyperlink w:anchor="_Toc242198213" w:history="1">
         <w:r>
           <w:rPr>
             <w:rStyle w:val="Hipervnculo"/>
@@ -690,7 +690,7 @@
             <w:noProof/>
             <w:webHidden/>
           </w:rPr>
-          <w:instrText xml:space="preserve"> PAGEREF _Toc242194826 \h </w:instrText>
+          <w:instrText xml:space="preserve"> PAGEREF _Toc242198213 \h </w:instrText>
         </w:r>
         <w:r>
           <w:rPr>
@@ -734,7 +734,7 @@
           <w14:ligatures w14:val="standardContextual"/>
         </w:rPr>
       </w:pPr>
-      <w:hyperlink w:anchor="_Toc242194827" w:history="1">
+      <w:hyperlink w:anchor="_Toc242198214" w:history="1">
         <w:r>
           <w:rPr>
             <w:rStyle w:val="Hipervnculo"/>
@@ -761,7 +761,7 @@
             <w:noProof/>
             <w:webHidden/>
           </w:rPr>
-          <w:instrText xml:space="preserve"> PAGEREF _Toc242194827 \h </w:instrText>
+          <w:instrText xml:space="preserve"> PAGEREF _Toc242198214 \h </w:instrText>
         </w:r>
         <w:r>
           <w:rPr>
@@ -805,7 +805,7 @@
           <w14:ligatures w14:val="standardContextual"/>
         </w:rPr>
       </w:pPr>
-      <w:hyperlink w:anchor="_Toc242194828" w:history="1">
+      <w:hyperlink w:anchor="_Toc242198215" w:history="1">
         <w:r>
           <w:rPr>
             <w:rStyle w:val="Hipervnculo"/>
@@ -832,7 +832,7 @@
             <w:noProof/>
             <w:webHidden/>
           </w:rPr>
-          <w:instrText xml:space="preserve"> PAGEREF _Toc242194828 \h </w:instrText>
+          <w:instrText xml:space="preserve"> PAGEREF _Toc242198215 \h </w:instrText>
         </w:r>
         <w:r>
           <w:rPr>
@@ -852,7 +852,7 @@
             <w:noProof/>
             <w:webHidden/>
           </w:rPr>
-          <w:t>17</w:t>
+          <w:t>16</w:t>
         </w:r>
         <w:r>
           <w:rPr>
@@ -876,7 +876,7 @@
           <w14:ligatures w14:val="standardContextual"/>
         </w:rPr>
       </w:pPr>
-      <w:hyperlink w:anchor="_Toc242194829" w:history="1">
+      <w:hyperlink w:anchor="_Toc242198216" w:history="1">
         <w:r>
           <w:rPr>
             <w:rStyle w:val="Hipervnculo"/>
@@ -903,7 +903,7 @@
             <w:noProof/>
             <w:webHidden/>
           </w:rPr>
-          <w:instrText xml:space="preserve"> PAGEREF _Toc242194829 \h </w:instrText>
+          <w:instrText xml:space="preserve"> PAGEREF _Toc242198216 \h </w:instrText>
         </w:r>
         <w:r>
           <w:rPr>
@@ -947,7 +947,7 @@
           <w14:ligatures w14:val="standardContextual"/>
         </w:rPr>
       </w:pPr>
-      <w:hyperlink w:anchor="_Toc242194830" w:history="1">
+      <w:hyperlink w:anchor="_Toc242198217" w:history="1">
         <w:r>
           <w:rPr>
             <w:rStyle w:val="Hipervnculo"/>
@@ -974,7 +974,7 @@
             <w:noProof/>
             <w:webHidden/>
           </w:rPr>
-          <w:instrText xml:space="preserve"> PAGEREF _Toc242194830 \h </w:instrText>
+          <w:instrText xml:space="preserve"> PAGEREF _Toc242198217 \h </w:instrText>
         </w:r>
         <w:r>
           <w:rPr>
@@ -1018,7 +1018,7 @@
           <w14:ligatures w14:val="standardContextual"/>
         </w:rPr>
       </w:pPr>
-      <w:hyperlink w:anchor="_Toc242194831" w:history="1">
+      <w:hyperlink w:anchor="_Toc242198218" w:history="1">
         <w:r>
           <w:rPr>
             <w:rStyle w:val="Hipervnculo"/>
@@ -1045,7 +1045,7 @@
             <w:noProof/>
             <w:webHidden/>
           </w:rPr>
-          <w:instrText xml:space="preserve"> PAGEREF _Toc242194831 \h </w:instrText>
+          <w:instrText xml:space="preserve"> PAGEREF _Toc242198218 \h </w:instrText>
         </w:r>
         <w:r>
           <w:rPr>
@@ -1089,7 +1089,7 @@
           <w14:ligatures w14:val="standardContextual"/>
         </w:rPr>
       </w:pPr>
-      <w:hyperlink w:anchor="_Toc242194832" w:history="1">
+      <w:hyperlink w:anchor="_Toc242198219" w:history="1">
         <w:r>
           <w:rPr>
             <w:rStyle w:val="Hipervnculo"/>
@@ -1116,7 +1116,7 @@
             <w:noProof/>
             <w:webHidden/>
           </w:rPr>
-          <w:instrText xml:space="preserve"> PAGEREF _Toc242194832 \h </w:instrText>
+          <w:instrText xml:space="preserve"> PAGEREF _Toc242198219 \h </w:instrText>
         </w:r>
         <w:r>
           <w:rPr>
@@ -1160,7 +1160,7 @@
           <w14:ligatures w14:val="standardContextual"/>
         </w:rPr>
       </w:pPr>
-      <w:hyperlink w:anchor="_Toc242194833" w:history="1">
+      <w:hyperlink w:anchor="_Toc242198220" w:history="1">
         <w:r>
           <w:rPr>
             <w:rStyle w:val="Hipervnculo"/>
@@ -1187,7 +1187,7 @@
             <w:noProof/>
             <w:webHidden/>
           </w:rPr>
-          <w:instrText xml:space="preserve"> PAGEREF _Toc242194833 \h </w:instrText>
+          <w:instrText xml:space="preserve"> PAGEREF _Toc242198220 \h </w:instrText>
         </w:r>
         <w:r>
           <w:rPr>
@@ -1231,7 +1231,7 @@
           <w14:ligatures w14:val="standardContextual"/>
         </w:rPr>
       </w:pPr>
-      <w:hyperlink w:anchor="_Toc242194834" w:history="1">
+      <w:hyperlink w:anchor="_Toc242198221" w:history="1">
         <w:r>
           <w:rPr>
             <w:rStyle w:val="Hipervnculo"/>
@@ -1258,7 +1258,7 @@
             <w:noProof/>
             <w:webHidden/>
           </w:rPr>
-          <w:instrText xml:space="preserve"> PAGEREF _Toc242194834 \h </w:instrText>
+          <w:instrText xml:space="preserve"> PAGEREF _Toc242198221 \h </w:instrText>
         </w:r>
         <w:r>
           <w:rPr>
@@ -1302,7 +1302,7 @@
           <w14:ligatures w14:val="standardContextual"/>
         </w:rPr>
       </w:pPr>
-      <w:hyperlink w:anchor="_Toc242194835" w:history="1">
+      <w:hyperlink w:anchor="_Toc242198222" w:history="1">
         <w:r>
           <w:rPr>
             <w:rStyle w:val="Hipervnculo"/>
@@ -1329,7 +1329,7 @@
             <w:noProof/>
             <w:webHidden/>
           </w:rPr>
-          <w:instrText xml:space="preserve"> PAGEREF _Toc242194835 \h </w:instrText>
+          <w:instrText xml:space="preserve"> PAGEREF _Toc242198222 \h </w:instrText>
         </w:r>
         <w:r>
           <w:rPr>
@@ -1373,7 +1373,7 @@
           <w14:ligatures w14:val="standardContextual"/>
         </w:rPr>
       </w:pPr>
-      <w:hyperlink w:anchor="_Toc242194836" w:history="1">
+      <w:hyperlink w:anchor="_Toc242198223" w:history="1">
         <w:r>
           <w:rPr>
             <w:rStyle w:val="Hipervnculo"/>
@@ -1400,7 +1400,7 @@
             <w:noProof/>
             <w:webHidden/>
           </w:rPr>
-          <w:instrText xml:space="preserve"> PAGEREF _Toc242194836 \h </w:instrText>
+          <w:instrText xml:space="preserve"> PAGEREF _Toc242198223 \h </w:instrText>
         </w:r>
         <w:r>
           <w:rPr>
@@ -1444,7 +1444,7 @@
           <w14:ligatures w14:val="standardContextual"/>
         </w:rPr>
       </w:pPr>
-      <w:hyperlink w:anchor="_Toc242194837" w:history="1">
+      <w:hyperlink w:anchor="_Toc242198224" w:history="1">
         <w:r>
           <w:rPr>
             <w:rStyle w:val="Hipervnculo"/>
@@ -1471,7 +1471,7 @@
             <w:noProof/>
             <w:webHidden/>
           </w:rPr>
-          <w:instrText xml:space="preserve"> PAGEREF _Toc242194837 \h </w:instrText>
+          <w:instrText xml:space="preserve"> PAGEREF _Toc242198224 \h </w:instrText>
         </w:r>
         <w:r>
           <w:rPr>
@@ -1515,7 +1515,7 @@
           <w14:ligatures w14:val="standardContextual"/>
         </w:rPr>
       </w:pPr>
-      <w:hyperlink w:anchor="_Toc242194838" w:history="1">
+      <w:hyperlink w:anchor="_Toc242198225" w:history="1">
         <w:r>
           <w:rPr>
             <w:rStyle w:val="Hipervnculo"/>
@@ -1542,7 +1542,7 @@
             <w:noProof/>
             <w:webHidden/>
           </w:rPr>
-          <w:instrText xml:space="preserve"> PAGEREF _Toc242194838 \h </w:instrText>
+          <w:instrText xml:space="preserve"> PAGEREF _Toc242198225 \h </w:instrText>
         </w:r>
         <w:r>
           <w:rPr>
@@ -1586,7 +1586,7 @@
           <w14:ligatures w14:val="standardContextual"/>
         </w:rPr>
       </w:pPr>
-      <w:hyperlink w:anchor="_Toc242194839" w:history="1">
+      <w:hyperlink w:anchor="_Toc242198226" w:history="1">
         <w:r>
           <w:rPr>
             <w:rStyle w:val="Hipervnculo"/>
@@ -1613,7 +1613,7 @@
             <w:noProof/>
             <w:webHidden/>
           </w:rPr>
-          <w:instrText xml:space="preserve"> PAGEREF _Toc242194839 \h </w:instrText>
+          <w:instrText xml:space="preserve"> PAGEREF _Toc242198226 \h </w:instrText>
         </w:r>
         <w:r>
           <w:rPr>
@@ -1657,7 +1657,7 @@
           <w14:ligatures w14:val="standardContextual"/>
         </w:rPr>
       </w:pPr>
-      <w:hyperlink w:anchor="_Toc242194840" w:history="1">
+      <w:hyperlink w:anchor="_Toc242198227" w:history="1">
         <w:r>
           <w:rPr>
             <w:rStyle w:val="Hipervnculo"/>
@@ -1684,7 +1684,7 @@
             <w:noProof/>
             <w:webHidden/>
           </w:rPr>
-          <w:instrText xml:space="preserve"> PAGEREF _Toc242194840 \h </w:instrText>
+          <w:instrText xml:space="preserve"> PAGEREF _Toc242198227 \h </w:instrText>
         </w:r>
         <w:r>
           <w:rPr>
@@ -1728,7 +1728,7 @@
           <w14:ligatures w14:val="standardContextual"/>
         </w:rPr>
       </w:pPr>
-      <w:hyperlink w:anchor="_Toc242194841" w:history="1">
+      <w:hyperlink w:anchor="_Toc242198228" w:history="1">
         <w:r>
           <w:rPr>
             <w:rStyle w:val="Hipervnculo"/>
@@ -1755,7 +1755,7 @@
             <w:noProof/>
             <w:webHidden/>
           </w:rPr>
-          <w:instrText xml:space="preserve"> PAGEREF _Toc242194841 \h </w:instrText>
+          <w:instrText xml:space="preserve"> PAGEREF _Toc242198228 \h </w:instrText>
         </w:r>
         <w:r>
           <w:rPr>
@@ -1799,7 +1799,7 @@
           <w14:ligatures w14:val="standardContextual"/>
         </w:rPr>
       </w:pPr>
-      <w:hyperlink w:anchor="_Toc242194842" w:history="1">
+      <w:hyperlink w:anchor="_Toc242198229" w:history="1">
         <w:r>
           <w:rPr>
             <w:rStyle w:val="Hipervnculo"/>
@@ -1826,7 +1826,7 @@
             <w:noProof/>
             <w:webHidden/>
           </w:rPr>
-          <w:instrText xml:space="preserve"> PAGEREF _Toc242194842 \h </w:instrText>
+          <w:instrText xml:space="preserve"> PAGEREF _Toc242198229 \h </w:instrText>
         </w:r>
         <w:r>
           <w:rPr>
@@ -1870,7 +1870,7 @@
           <w14:ligatures w14:val="standardContextual"/>
         </w:rPr>
       </w:pPr>
-      <w:hyperlink w:anchor="_Toc242194843" w:history="1">
+      <w:hyperlink w:anchor="_Toc242198230" w:history="1">
         <w:r>
           <w:rPr>
             <w:rStyle w:val="Hipervnculo"/>
@@ -1897,7 +1897,7 @@
             <w:noProof/>
             <w:webHidden/>
           </w:rPr>
-          <w:instrText xml:space="preserve"> PAGEREF _Toc242194843 \h </w:instrText>
+          <w:instrText xml:space="preserve"> PAGEREF _Toc242198230 \h </w:instrText>
         </w:r>
         <w:r>
           <w:rPr>
@@ -1941,7 +1941,7 @@
           <w14:ligatures w14:val="standardContextual"/>
         </w:rPr>
       </w:pPr>
-      <w:hyperlink w:anchor="_Toc242194844" w:history="1">
+      <w:hyperlink w:anchor="_Toc242198231" w:history="1">
         <w:r>
           <w:rPr>
             <w:rStyle w:val="Hipervnculo"/>
@@ -1968,7 +1968,7 @@
             <w:noProof/>
             <w:webHidden/>
           </w:rPr>
-          <w:instrText xml:space="preserve"> PAGEREF _Toc242194844 \h </w:instrText>
+          <w:instrText xml:space="preserve"> PAGEREF _Toc242198231 \h </w:instrText>
         </w:r>
         <w:r>
           <w:rPr>
@@ -2012,7 +2012,7 @@
           <w14:ligatures w14:val="standardContextual"/>
         </w:rPr>
       </w:pPr>
-      <w:hyperlink w:anchor="_Toc242194845" w:history="1">
+      <w:hyperlink w:anchor="_Toc242198232" w:history="1">
         <w:r>
           <w:rPr>
             <w:rStyle w:val="Hipervnculo"/>
@@ -2039,7 +2039,7 @@
             <w:noProof/>
             <w:webHidden/>
           </w:rPr>
-          <w:instrText xml:space="preserve"> PAGEREF _Toc242194845 \h </w:instrText>
+          <w:instrText xml:space="preserve"> PAGEREF _Toc242198232 \h </w:instrText>
         </w:r>
         <w:r>
           <w:rPr>
@@ -2083,7 +2083,7 @@
           <w14:ligatures w14:val="standardContextual"/>
         </w:rPr>
       </w:pPr>
-      <w:hyperlink w:anchor="_Toc242194846" w:history="1">
+      <w:hyperlink w:anchor="_Toc242198233" w:history="1">
         <w:r>
           <w:rPr>
             <w:rStyle w:val="Hipervnculo"/>
@@ -2110,7 +2110,7 @@
             <w:noProof/>
             <w:webHidden/>
           </w:rPr>
-          <w:instrText xml:space="preserve"> PAGEREF _Toc242194846 \h </w:instrText>
+          <w:instrText xml:space="preserve"> PAGEREF _Toc242198233 \h </w:instrText>
         </w:r>
         <w:r>
           <w:rPr>
@@ -2154,7 +2154,7 @@
           <w14:ligatures w14:val="standardContextual"/>
         </w:rPr>
       </w:pPr>
-      <w:hyperlink w:anchor="_Toc242194847" w:history="1">
+      <w:hyperlink w:anchor="_Toc242198234" w:history="1">
         <w:r>
           <w:rPr>
             <w:rStyle w:val="Hipervnculo"/>
@@ -2181,7 +2181,7 @@
             <w:noProof/>
             <w:webHidden/>
           </w:rPr>
-          <w:instrText xml:space="preserve"> PAGEREF _Toc242194847 \h </w:instrText>
+          <w:instrText xml:space="preserve"> PAGEREF _Toc242198234 \h </w:instrText>
         </w:r>
         <w:r>
           <w:rPr>
@@ -2225,7 +2225,7 @@
           <w14:ligatures w14:val="standardContextual"/>
         </w:rPr>
       </w:pPr>
-      <w:hyperlink w:anchor="_Toc242194848" w:history="1">
+      <w:hyperlink w:anchor="_Toc242198235" w:history="1">
         <w:r>
           <w:rPr>
             <w:rStyle w:val="Hipervnculo"/>
@@ -2252,7 +2252,7 @@
             <w:noProof/>
             <w:webHidden/>
           </w:rPr>
-          <w:instrText xml:space="preserve"> PAGEREF _Toc242194848 \h </w:instrText>
+          <w:instrText xml:space="preserve"> PAGEREF _Toc242198235 \h </w:instrText>
         </w:r>
         <w:r>
           <w:rPr>
@@ -2296,7 +2296,7 @@
           <w14:ligatures w14:val="standardContextual"/>
         </w:rPr>
       </w:pPr>
-      <w:hyperlink w:anchor="_Toc242194849" w:history="1">
+      <w:hyperlink w:anchor="_Toc242198236" w:history="1">
         <w:r>
           <w:rPr>
             <w:rStyle w:val="Hipervnculo"/>
@@ -2323,7 +2323,7 @@
             <w:noProof/>
             <w:webHidden/>
           </w:rPr>
-          <w:instrText xml:space="preserve"> PAGEREF _Toc242194849 \h </w:instrText>
+          <w:instrText xml:space="preserve"> PAGEREF _Toc242198236 \h </w:instrText>
         </w:r>
         <w:r>
           <w:rPr>
@@ -2367,7 +2367,7 @@
           <w14:ligatures w14:val="standardContextual"/>
         </w:rPr>
       </w:pPr>
-      <w:hyperlink w:anchor="_Toc242194850" w:history="1">
+      <w:hyperlink w:anchor="_Toc242198237" w:history="1">
         <w:r>
           <w:rPr>
             <w:rStyle w:val="Hipervnculo"/>
@@ -2394,7 +2394,7 @@
             <w:noProof/>
             <w:webHidden/>
           </w:rPr>
-          <w:instrText xml:space="preserve"> PAGEREF _Toc242194850 \h </w:instrText>
+          <w:instrText xml:space="preserve"> PAGEREF _Toc242198237 \h </w:instrText>
         </w:r>
         <w:r>
           <w:rPr>
@@ -2438,7 +2438,7 @@
           <w14:ligatures w14:val="standardContextual"/>
         </w:rPr>
       </w:pPr>
-      <w:hyperlink w:anchor="_Toc242194851" w:history="1">
+      <w:hyperlink w:anchor="_Toc242198238" w:history="1">
         <w:r>
           <w:rPr>
             <w:rStyle w:val="Hipervnculo"/>
@@ -2465,7 +2465,7 @@
             <w:noProof/>
             <w:webHidden/>
           </w:rPr>
-          <w:instrText xml:space="preserve"> PAGEREF _Toc242194851 \h </w:instrText>
+          <w:instrText xml:space="preserve"> PAGEREF _Toc242198238 \h </w:instrText>
         </w:r>
         <w:r>
           <w:rPr>
@@ -2509,7 +2509,7 @@
           <w14:ligatures w14:val="standardContextual"/>
         </w:rPr>
       </w:pPr>
-      <w:hyperlink w:anchor="_Toc242194852" w:history="1">
+      <w:hyperlink w:anchor="_Toc242198239" w:history="1">
         <w:r>
           <w:rPr>
             <w:rStyle w:val="Hipervnculo"/>
@@ -2536,7 +2536,7 @@
             <w:noProof/>
             <w:webHidden/>
           </w:rPr>
-          <w:instrText xml:space="preserve"> PAGEREF _Toc242194852 \h </w:instrText>
+          <w:instrText xml:space="preserve"> PAGEREF _Toc242198239 \h </w:instrText>
         </w:r>
         <w:r>
           <w:rPr>
@@ -2580,7 +2580,7 @@
           <w14:ligatures w14:val="standardContextual"/>
         </w:rPr>
       </w:pPr>
-      <w:hyperlink w:anchor="_Toc242194853" w:history="1">
+      <w:hyperlink w:anchor="_Toc242198240" w:history="1">
         <w:r>
           <w:rPr>
             <w:rStyle w:val="Hipervnculo"/>
@@ -2607,7 +2607,7 @@
             <w:noProof/>
             <w:webHidden/>
           </w:rPr>
-          <w:instrText xml:space="preserve"> PAGEREF _Toc242194853 \h </w:instrText>
+          <w:instrText xml:space="preserve"> PAGEREF _Toc242198240 \h </w:instrText>
         </w:r>
         <w:r>
           <w:rPr>
@@ -2651,7 +2651,7 @@
           <w14:ligatures w14:val="standardContextual"/>
         </w:rPr>
       </w:pPr>
-      <w:hyperlink w:anchor="_Toc242194854" w:history="1">
+      <w:hyperlink w:anchor="_Toc242198241" w:history="1">
         <w:r>
           <w:rPr>
             <w:rStyle w:val="Hipervnculo"/>
@@ -2678,7 +2678,7 @@
             <w:noProof/>
             <w:webHidden/>
           </w:rPr>
-          <w:instrText xml:space="preserve"> PAGEREF _Toc242194854 \h </w:instrText>
+          <w:instrText xml:space="preserve"> PAGEREF _Toc242198241 \h </w:instrText>
         </w:r>
         <w:r>
           <w:rPr>
@@ -2722,7 +2722,7 @@
           <w14:ligatures w14:val="standardContextual"/>
         </w:rPr>
       </w:pPr>
-      <w:hyperlink w:anchor="_Toc242194855" w:history="1">
+      <w:hyperlink w:anchor="_Toc242198242" w:history="1">
         <w:r>
           <w:rPr>
             <w:rStyle w:val="Hipervnculo"/>
@@ -2749,7 +2749,7 @@
             <w:noProof/>
             <w:webHidden/>
           </w:rPr>
-          <w:instrText xml:space="preserve"> PAGEREF _Toc242194855 \h </w:instrText>
+          <w:instrText xml:space="preserve"> PAGEREF _Toc242198242 \h </w:instrText>
         </w:r>
         <w:r>
           <w:rPr>
@@ -2793,7 +2793,7 @@
           <w14:ligatures w14:val="standardContextual"/>
         </w:rPr>
       </w:pPr>
-      <w:hyperlink w:anchor="_Toc242194856" w:history="1">
+      <w:hyperlink w:anchor="_Toc242198243" w:history="1">
         <w:r>
           <w:rPr>
             <w:rStyle w:val="Hipervnculo"/>
@@ -2820,7 +2820,7 @@
             <w:noProof/>
             <w:webHidden/>
           </w:rPr>
-          <w:instrText xml:space="preserve"> PAGEREF _Toc242194856 \h </w:instrText>
+          <w:instrText xml:space="preserve"> PAGEREF _Toc242198243 \h </w:instrText>
         </w:r>
         <w:r>
           <w:rPr>
@@ -2864,7 +2864,7 @@
           <w14:ligatures w14:val="standardContextual"/>
         </w:rPr>
       </w:pPr>
-      <w:hyperlink w:anchor="_Toc242194857" w:history="1">
+      <w:hyperlink w:anchor="_Toc242198244" w:history="1">
         <w:r>
           <w:rPr>
             <w:rStyle w:val="Hipervnculo"/>
@@ -2891,7 +2891,7 @@
             <w:noProof/>
             <w:webHidden/>
           </w:rPr>
-          <w:instrText xml:space="preserve"> PAGEREF _Toc242194857 \h </w:instrText>
+          <w:instrText xml:space="preserve"> PAGEREF _Toc242198244 \h </w:instrText>
         </w:r>
         <w:r>
           <w:rPr>
@@ -2935,7 +2935,7 @@
           <w14:ligatures w14:val="standardContextual"/>
         </w:rPr>
       </w:pPr>
-      <w:hyperlink w:anchor="_Toc242194858" w:history="1">
+      <w:hyperlink w:anchor="_Toc242198245" w:history="1">
         <w:r>
           <w:rPr>
             <w:rStyle w:val="Hipervnculo"/>
@@ -2962,7 +2962,7 @@
             <w:noProof/>
             <w:webHidden/>
           </w:rPr>
-          <w:instrText xml:space="preserve"> PAGEREF _Toc242194858 \h </w:instrText>
+          <w:instrText xml:space="preserve"> PAGEREF _Toc242198245 \h </w:instrText>
         </w:r>
         <w:r>
           <w:rPr>
@@ -3006,7 +3006,7 @@
           <w14:ligatures w14:val="standardContextual"/>
         </w:rPr>
       </w:pPr>
-      <w:hyperlink w:anchor="_Toc242194859" w:history="1">
+      <w:hyperlink w:anchor="_Toc242198246" w:history="1">
         <w:r>
           <w:rPr>
             <w:rStyle w:val="Hipervnculo"/>
@@ -3033,7 +3033,7 @@
             <w:noProof/>
             <w:webHidden/>
           </w:rPr>
-          <w:instrText xml:space="preserve"> PAGEREF _Toc242194859 \h </w:instrText>
+          <w:instrText xml:space="preserve"> PAGEREF _Toc242198246 \h </w:instrText>
         </w:r>
         <w:r>
           <w:rPr>
@@ -3077,7 +3077,7 @@
           <w14:ligatures w14:val="standardContextual"/>
         </w:rPr>
       </w:pPr>
-      <w:hyperlink w:anchor="_Toc242194860" w:history="1">
+      <w:hyperlink w:anchor="_Toc242198247" w:history="1">
         <w:r>
           <w:rPr>
             <w:rStyle w:val="Hipervnculo"/>
@@ -3104,7 +3104,7 @@
             <w:noProof/>
             <w:webHidden/>
           </w:rPr>
-          <w:instrText xml:space="preserve"> PAGEREF _Toc242194860 \h </w:instrText>
+          <w:instrText xml:space="preserve"> PAGEREF _Toc242198247 \h </w:instrText>
         </w:r>
         <w:r>
           <w:rPr>
@@ -3148,7 +3148,7 @@
           <w14:ligatures w14:val="standardContextual"/>
         </w:rPr>
       </w:pPr>
-      <w:hyperlink w:anchor="_Toc242194861" w:history="1">
+      <w:hyperlink w:anchor="_Toc242198248" w:history="1">
         <w:r>
           <w:rPr>
             <w:rStyle w:val="Hipervnculo"/>
@@ -3175,7 +3175,7 @@
             <w:noProof/>
             <w:webHidden/>
           </w:rPr>
-          <w:instrText xml:space="preserve"> PAGEREF _Toc242194861 \h </w:instrText>
+          <w:instrText xml:space="preserve"> PAGEREF _Toc242198248 \h </w:instrText>
         </w:r>
         <w:r>
           <w:rPr>
@@ -3219,7 +3219,7 @@
           <w14:ligatures w14:val="standardContextual"/>
         </w:rPr>
       </w:pPr>
-      <w:hyperlink w:anchor="_Toc242194862" w:history="1">
+      <w:hyperlink w:anchor="_Toc242198249" w:history="1">
         <w:r>
           <w:rPr>
             <w:rStyle w:val="Hipervnculo"/>
@@ -3246,7 +3246,7 @@
             <w:noProof/>
             <w:webHidden/>
           </w:rPr>
-          <w:instrText xml:space="preserve"> PAGEREF _Toc242194862 \h </w:instrText>
+          <w:instrText xml:space="preserve"> PAGEREF _Toc242198249 \h </w:instrText>
         </w:r>
         <w:r>
           <w:rPr>
@@ -3290,7 +3290,7 @@
           <w14:ligatures w14:val="standardContextual"/>
         </w:rPr>
       </w:pPr>
-      <w:hyperlink w:anchor="_Toc242194863" w:history="1">
+      <w:hyperlink w:anchor="_Toc242198250" w:history="1">
         <w:r>
           <w:rPr>
             <w:rStyle w:val="Hipervnculo"/>
@@ -3317,7 +3317,7 @@
             <w:noProof/>
             <w:webHidden/>
           </w:rPr>
-          <w:instrText xml:space="preserve"> PAGEREF _Toc242194863 \h </w:instrText>
+          <w:instrText xml:space="preserve"> PAGEREF _Toc242198250 \h </w:instrText>
         </w:r>
         <w:r>
           <w:rPr>
@@ -3361,7 +3361,7 @@
           <w14:ligatures w14:val="standardContextual"/>
         </w:rPr>
       </w:pPr>
-      <w:hyperlink w:anchor="_Toc242194864" w:history="1">
+      <w:hyperlink w:anchor="_Toc242198251" w:history="1">
         <w:r>
           <w:rPr>
             <w:rStyle w:val="Hipervnculo"/>
@@ -3388,7 +3388,7 @@
             <w:noProof/>
             <w:webHidden/>
           </w:rPr>
-          <w:instrText xml:space="preserve"> PAGEREF _Toc242194864 \h </w:instrText>
+          <w:instrText xml:space="preserve"> PAGEREF _Toc242198251 \h </w:instrText>
         </w:r>
         <w:r>
           <w:rPr>
@@ -3432,7 +3432,7 @@
           <w14:ligatures w14:val="standardContextual"/>
         </w:rPr>
       </w:pPr>
-      <w:hyperlink w:anchor="_Toc242194865" w:history="1">
+      <w:hyperlink w:anchor="_Toc242198252" w:history="1">
         <w:r>
           <w:rPr>
             <w:rStyle w:val="Hipervnculo"/>
@@ -3459,7 +3459,7 @@
             <w:noProof/>
             <w:webHidden/>
           </w:rPr>
-          <w:instrText xml:space="preserve"> PAGEREF _Toc242194865 \h </w:instrText>
+          <w:instrText xml:space="preserve"> PAGEREF _Toc242198252 \h </w:instrText>
         </w:r>
         <w:r>
           <w:rPr>
@@ -3503,7 +3503,7 @@
           <w14:ligatures w14:val="standardContextual"/>
         </w:rPr>
       </w:pPr>
-      <w:hyperlink w:anchor="_Toc242194866" w:history="1">
+      <w:hyperlink w:anchor="_Toc242198253" w:history="1">
         <w:r>
           <w:rPr>
             <w:rStyle w:val="Hipervnculo"/>
@@ -3530,7 +3530,7 @@
             <w:noProof/>
             <w:webHidden/>
           </w:rPr>
-          <w:instrText xml:space="preserve"> PAGEREF _Toc242194866 \h </w:instrText>
+          <w:instrText xml:space="preserve"> PAGEREF _Toc242198253 \h </w:instrText>
         </w:r>
         <w:r>
           <w:rPr>
@@ -3574,7 +3574,7 @@
           <w14:ligatures w14:val="standardContextual"/>
         </w:rPr>
       </w:pPr>
-      <w:hyperlink w:anchor="_Toc242194867" w:history="1">
+      <w:hyperlink w:anchor="_Toc242198254" w:history="1">
         <w:r>
           <w:rPr>
             <w:rStyle w:val="Hipervnculo"/>
@@ -3601,7 +3601,7 @@
             <w:noProof/>
             <w:webHidden/>
           </w:rPr>
-          <w:instrText xml:space="preserve"> PAGEREF _Toc242194867 \h </w:instrText>
+          <w:instrText xml:space="preserve"> PAGEREF _Toc242198254 \h </w:instrText>
         </w:r>
         <w:r>
           <w:rPr>
@@ -3645,7 +3645,7 @@
           <w14:ligatures w14:val="standardContextual"/>
         </w:rPr>
       </w:pPr>
-      <w:hyperlink w:anchor="_Toc242194868" w:history="1">
+      <w:hyperlink w:anchor="_Toc242198255" w:history="1">
         <w:r>
           <w:rPr>
             <w:rStyle w:val="Hipervnculo"/>
@@ -3672,7 +3672,7 @@
             <w:noProof/>
             <w:webHidden/>
           </w:rPr>
-          <w:instrText xml:space="preserve"> PAGEREF _Toc242194868 \h </w:instrText>
+          <w:instrText xml:space="preserve"> PAGEREF _Toc242198255 \h </w:instrText>
         </w:r>
         <w:r>
           <w:rPr>
@@ -3716,7 +3716,7 @@
           <w14:ligatures w14:val="standardContextual"/>
         </w:rPr>
       </w:pPr>
-      <w:hyperlink w:anchor="_Toc242194869" w:history="1">
+      <w:hyperlink w:anchor="_Toc242198256" w:history="1">
         <w:r>
           <w:rPr>
             <w:rStyle w:val="Hipervnculo"/>
@@ -3743,7 +3743,7 @@
             <w:noProof/>
             <w:webHidden/>
           </w:rPr>
-          <w:instrText xml:space="preserve"> PAGEREF _Toc242194869 \h </w:instrText>
+          <w:instrText xml:space="preserve"> PAGEREF _Toc242198256 \h </w:instrText>
         </w:r>
         <w:r>
           <w:rPr>
@@ -3787,7 +3787,7 @@
           <w14:ligatures w14:val="standardContextual"/>
         </w:rPr>
       </w:pPr>
-      <w:hyperlink w:anchor="_Toc242194870" w:history="1">
+      <w:hyperlink w:anchor="_Toc242198257" w:history="1">
         <w:r>
           <w:rPr>
             <w:rStyle w:val="Hipervnculo"/>
@@ -3814,7 +3814,7 @@
             <w:noProof/>
             <w:webHidden/>
           </w:rPr>
-          <w:instrText xml:space="preserve"> PAGEREF _Toc242194870 \h </w:instrText>
+          <w:instrText xml:space="preserve"> PAGEREF _Toc242198257 \h </w:instrText>
         </w:r>
         <w:r>
           <w:rPr>
@@ -3858,7 +3858,7 @@
           <w14:ligatures w14:val="standardContextual"/>
         </w:rPr>
       </w:pPr>
-      <w:hyperlink w:anchor="_Toc242194871" w:history="1">
+      <w:hyperlink w:anchor="_Toc242198258" w:history="1">
         <w:r>
           <w:rPr>
             <w:rStyle w:val="Hipervnculo"/>
@@ -3885,7 +3885,7 @@
             <w:noProof/>
             <w:webHidden/>
           </w:rPr>
-          <w:instrText xml:space="preserve"> PAGEREF _Toc242194871 \h </w:instrText>
+          <w:instrText xml:space="preserve"> PAGEREF _Toc242198258 \h </w:instrText>
         </w:r>
         <w:r>
           <w:rPr>
@@ -3929,7 +3929,7 @@
           <w14:ligatures w14:val="standardContextual"/>
         </w:rPr>
       </w:pPr>
-      <w:hyperlink w:anchor="_Toc242194872" w:history="1">
+      <w:hyperlink w:anchor="_Toc242198259" w:history="1">
         <w:r>
           <w:rPr>
             <w:rStyle w:val="Hipervnculo"/>
@@ -3956,7 +3956,7 @@
             <w:noProof/>
             <w:webHidden/>
           </w:rPr>
-          <w:instrText xml:space="preserve"> PAGEREF _Toc242194872 \h </w:instrText>
+          <w:instrText xml:space="preserve"> PAGEREF _Toc242198259 \h </w:instrText>
         </w:r>
         <w:r>
           <w:rPr>
@@ -4000,7 +4000,7 @@
           <w14:ligatures w14:val="standardContextual"/>
         </w:rPr>
       </w:pPr>
-      <w:hyperlink w:anchor="_Toc242194873" w:history="1">
+      <w:hyperlink w:anchor="_Toc242198260" w:history="1">
         <w:r>
           <w:rPr>
             <w:rStyle w:val="Hipervnculo"/>
@@ -4027,7 +4027,7 @@
             <w:noProof/>
             <w:webHidden/>
           </w:rPr>
-          <w:instrText xml:space="preserve"> PAGEREF _Toc242194873 \h </w:instrText>
+          <w:instrText xml:space="preserve"> PAGEREF _Toc242198260 \h </w:instrText>
         </w:r>
         <w:r>
           <w:rPr>
@@ -4071,7 +4071,7 @@
           <w14:ligatures w14:val="standardContextual"/>
         </w:rPr>
       </w:pPr>
-      <w:hyperlink w:anchor="_Toc242194874" w:history="1">
+      <w:hyperlink w:anchor="_Toc242198261" w:history="1">
         <w:r>
           <w:rPr>
             <w:rStyle w:val="Hipervnculo"/>
@@ -4098,7 +4098,7 @@
             <w:noProof/>
             <w:webHidden/>
           </w:rPr>
-          <w:instrText xml:space="preserve"> PAGEREF _Toc242194874 \h </w:instrText>
+          <w:instrText xml:space="preserve"> PAGEREF _Toc242198261 \h </w:instrText>
         </w:r>
         <w:r>
           <w:rPr>
@@ -4143,7 +4143,7 @@
       <w:pPr>
         <w:pStyle w:val="Ttulo1"/>
       </w:pPr>
-      <w:bookmarkStart w:id="0" w:name="_Toc242194817"/>
+      <w:bookmarkStart w:id="0" w:name="_Toc242198204"/>
       <w:r>
         <w:lastRenderedPageBreak/>
         <w:t>1. OBJETIVO, ALCANCE Y CRITERIOS DE CUMPLIMIENTO</w:t>
@@ -4204,7 +4204,7 @@
       <w:pPr>
         <w:pStyle w:val="Ttulo2"/>
       </w:pPr>
-      <w:bookmarkStart w:id="1" w:name="_Toc242194818"/>
+      <w:bookmarkStart w:id="1" w:name="_Toc242198205"/>
       <w:r>
         <w:t>1.1 El objetivo específico 3</w:t>
       </w:r>
@@ -4257,7 +4257,7 @@
       <w:pPr>
         <w:pStyle w:val="Ttulo2"/>
       </w:pPr>
-      <w:bookmarkStart w:id="2" w:name="_Toc242194819"/>
+      <w:bookmarkStart w:id="2" w:name="_Toc242198206"/>
       <w:r>
         <w:lastRenderedPageBreak/>
         <w:t>1.2 Alcance del prototipo entregado</w:t>
@@ -4966,7 +4966,7 @@
       <w:pPr>
         <w:pStyle w:val="Ttulo2"/>
       </w:pPr>
-      <w:bookmarkStart w:id="3" w:name="_Toc242194820"/>
+      <w:bookmarkStart w:id="3" w:name="_Toc242198207"/>
       <w:r>
         <w:t>1.3 Indicadores del objetivo y su cumplimiento</w:t>
       </w:r>
@@ -5403,7 +5403,7 @@
       <w:pPr>
         <w:pStyle w:val="Ttulo2"/>
       </w:pPr>
-      <w:bookmarkStart w:id="4" w:name="_Toc242194821"/>
+      <w:bookmarkStart w:id="4" w:name="_Toc242198208"/>
       <w:r>
         <w:t>1.4 Entregables del cronograma</w:t>
       </w:r>
@@ -5921,7 +5921,7 @@
       <w:pPr>
         <w:pStyle w:val="Ttulo2"/>
       </w:pPr>
-      <w:bookmarkStart w:id="5" w:name="_Toc242194822"/>
+      <w:bookmarkStart w:id="5" w:name="_Toc242198209"/>
       <w:r>
         <w:t>1.5 Organización del documento y anexos</w:t>
       </w:r>
@@ -6850,7 +6850,7 @@
       <w:pPr>
         <w:pStyle w:val="Ttulo1"/>
       </w:pPr>
-      <w:bookmarkStart w:id="6" w:name="_Toc242194823"/>
+      <w:bookmarkStart w:id="6" w:name="_Toc242198210"/>
       <w:r>
         <w:lastRenderedPageBreak/>
         <w:t>2. METODOLOGÍA DEL DESARROLLO</w:t>
@@ -6869,7 +6869,7 @@
       <w:pPr>
         <w:pStyle w:val="Ttulo2"/>
       </w:pPr>
-      <w:bookmarkStart w:id="7" w:name="_Toc242194824"/>
+      <w:bookmarkStart w:id="7" w:name="_Toc242198211"/>
       <w:r>
         <w:t>2.1 Árcade y Kanban en la fase de desarrollo</w:t>
       </w:r>
@@ -7491,7 +7491,7 @@
       <w:pPr>
         <w:pStyle w:val="Ttulo2"/>
       </w:pPr>
-      <w:bookmarkStart w:id="8" w:name="_Toc242194825"/>
+      <w:bookmarkStart w:id="8" w:name="_Toc242198212"/>
       <w:r>
         <w:t>2.2 Planificación por slices y carriles</w:t>
       </w:r>
@@ -8731,7 +8731,7 @@
         <w:pStyle w:val="PrimerprrafoOE3"/>
       </w:pPr>
       <w:r>
-        <w:t>Las personas se asignaron en las actas. Las dos primeras tareas de navegación quedaron a cargo de ambos estudiantes (D02). Santiago Valdiri García tomó las dos siguientes en la D03 (tarjeta D03-1) y la continuación del primer incremento en la D04 (tarjeta D04-2); las tareas T12 a T19 del Nivel 1 están en su cuenta del repositorio. Santiago Benavides Rey, entre tanto, abrió el segundo incremento desde el 10 de septiembre, compromiso que el tablero de la D05 registra como tarjeta D04-4. En la D05, Santiago Be</w:t>
+        <w:t>Las personas se asignaron en las actas. Las dos primeras tareas de navegación quedaron a cargo de ambos estudiantes (D02). Santiago Valdiri García tomó las dos siguientes en la D03 (tarjeta D03-1) y la continuación del primer incremento en la D04 (tarjeta D04-2); las tareas T12 a T19 del Nivel 1 están en su cuenta del repositorio. Santiago Benavides Rey, entre tanto, abrió el segundo incremento desde el 10 de septiembre, compromiso que el tablero de la D05 registra como tarjeta D05-1. En la D05, Santiago Be</w:t>
       </w:r>
       <w:r>
         <w:t>navides Rey asumió el cierre del Slice 2 y Santiago Valdiri García el sonido del juego; en la D07 el cierre del Slice 3 quedó en manos del primero; en la D08 el Slice 4 pasó al segundo, y la implementación de los sprites y sonidos restantes, al primero. Las ocho tarjetas de la D10 (correcciones de los tres niveles, arte, registro de cargas, arnés del ejecutable, este entregable y el capítulo 8 del trabajo de grado) son de Santiago Benavides Rey.</w:t>
@@ -8821,7 +8821,7 @@
       <w:pPr>
         <w:pStyle w:val="Ttulo2"/>
       </w:pPr>
-      <w:bookmarkStart w:id="9" w:name="_Toc242194826"/>
+      <w:bookmarkStart w:id="9" w:name="_Toc242198213"/>
       <w:r>
         <w:t>2.3 Seguimiento con actas (D01–D10)</w:t>
       </w:r>
@@ -8857,10 +8857,7 @@
         <w:t>una estructura: una cabecera que ubica la sesión en su fase de la metodología Árcade; asistentes, objetivo y desarrollo del trabajo; resultados de la sesión (calendario de entregas de assets en la D01 y plan de trabajo en la D02); decisiones adoptadas, compromisos con el tablero Kanban, puntos pendientes y próxima sesión. Los dos estudiantes asistieron de la D01 a la D09; a la D10 asistió Santiago Benavides Rey. La colaboradora de assets estuvo en las sesiones del</w:t>
       </w:r>
       <w:r>
-        <w:t xml:space="preserve"> 2, el 9, el 15 y el 24 de septiembre (D01, D04, D06 y D09). La D01 se registró en su momento como la tercera sesión de la serie del segundo objetivo y conserva ese número en la cabecera (acta «O03 de 05»); sus tarjetas reaparecen renumeradas en la serie D desde la D02. Los totales de las cabeceras tampoco coinciden con el número real en las dos actas siguientes: la D02 y la D03 se encabezan «de 03», y desde la D04 el total es el número del acta. La Tabla 2.4 recoge las decisiones principales de cada sesión</w:t>
-      </w:r>
-      <w:r>
-        <w:t xml:space="preserve"> y, en la última columna, cómo usó cada una el tablero y el ciclo; el código y la fecha son los de la cabecera de cada acta.</w:t>
+        <w:t xml:space="preserve"> 2, el 9, el 15 y el 24 de septiembre (D01, D04, D06 y D09). Las cabeceras llevan el código de la serie D y el total «de 10», de «D01 de 10» a «D10 de 10». La Tabla 2.4 recoge las decisiones principales de cada sesión y, en la última columna, cómo usó cada una el tablero y el ciclo; el código y la fecha son los de la cabecera de cada acta.</w:t>
       </w:r>
     </w:p>
     <w:p>
@@ -8895,8 +8892,8 @@
       <w:tblGrid>
         <w:gridCol w:w="696"/>
         <w:gridCol w:w="1418"/>
-        <w:gridCol w:w="3849"/>
-        <w:gridCol w:w="3999"/>
+        <w:gridCol w:w="3756"/>
+        <w:gridCol w:w="4092"/>
       </w:tblGrid>
       <w:tr>
         <w:trPr>
@@ -8950,7 +8947,7 @@
         </w:tc>
         <w:tc>
           <w:tcPr>
-            <w:tcW w:w="1932" w:type="pct"/>
+            <w:tcW w:w="1885" w:type="pct"/>
             <w:shd w:val="clear" w:color="auto" w:fill="D9D9D9"/>
           </w:tcPr>
           <w:p>
@@ -8973,7 +8970,7 @@
         </w:tc>
         <w:tc>
           <w:tcPr>
-            <w:tcW w:w="2007" w:type="pct"/>
+            <w:tcW w:w="2054" w:type="pct"/>
             <w:shd w:val="clear" w:color="auto" w:fill="D9D9D9"/>
           </w:tcPr>
           <w:p>
@@ -9040,7 +9037,7 @@
         </w:tc>
         <w:tc>
           <w:tcPr>
-            <w:tcW w:w="1932" w:type="pct"/>
+            <w:tcW w:w="1885" w:type="pct"/>
             <w:shd w:val="clear" w:color="auto" w:fill="auto"/>
           </w:tcPr>
           <w:p>
@@ -9061,22 +9058,22 @@
         </w:tc>
         <w:tc>
           <w:tcPr>
-            <w:tcW w:w="2007" w:type="pct"/>
-            <w:shd w:val="clear" w:color="auto" w:fill="auto"/>
-          </w:tcPr>
-          <w:p>
-            <w:pPr>
-              <w:pStyle w:val="CompactoOE3"/>
-              <w:spacing w:after="0"/>
-              <w:rPr>
-                <w:sz w:val="18"/>
-              </w:rPr>
-            </w:pPr>
-            <w:r>
-              <w:rPr>
-                <w:sz w:val="18"/>
-              </w:rPr>
-              <w:t>Fase de Diseño, momento 4 (assets). Pasa O02-1 a O02-3 de «en proceso» a «finalizado» y abre O03-1 a O03-3, con fecha límite 09/09</w:t>
+            <w:tcW w:w="2054" w:type="pct"/>
+            <w:shd w:val="clear" w:color="auto" w:fill="auto"/>
+          </w:tcPr>
+          <w:p>
+            <w:pPr>
+              <w:pStyle w:val="CompactoOE3"/>
+              <w:spacing w:after="0"/>
+              <w:rPr>
+                <w:sz w:val="18"/>
+              </w:rPr>
+            </w:pPr>
+            <w:r>
+              <w:rPr>
+                <w:sz w:val="18"/>
+              </w:rPr>
+              <w:t>Fase de Diseño, momento 4 (assets). Pasa O02-1 a O02-3 de «en proceso» a «finalizado» y abre D01-1 a D01-3, con fecha límite 09/09</w:t>
             </w:r>
           </w:p>
         </w:tc>
@@ -9126,7 +9123,7 @@
         </w:tc>
         <w:tc>
           <w:tcPr>
-            <w:tcW w:w="1932" w:type="pct"/>
+            <w:tcW w:w="1885" w:type="pct"/>
             <w:shd w:val="clear" w:color="auto" w:fill="auto"/>
           </w:tcPr>
           <w:p>
@@ -9147,7 +9144,7 @@
         </w:tc>
         <w:tc>
           <w:tcPr>
-            <w:tcW w:w="2007" w:type="pct"/>
+            <w:tcW w:w="2054" w:type="pct"/>
             <w:shd w:val="clear" w:color="auto" w:fill="auto"/>
           </w:tcPr>
           <w:p>
@@ -9212,7 +9209,7 @@
         </w:tc>
         <w:tc>
           <w:tcPr>
-            <w:tcW w:w="1932" w:type="pct"/>
+            <w:tcW w:w="1885" w:type="pct"/>
             <w:shd w:val="clear" w:color="auto" w:fill="auto"/>
           </w:tcPr>
           <w:p>
@@ -9233,7 +9230,7 @@
         </w:tc>
         <w:tc>
           <w:tcPr>
-            <w:tcW w:w="2007" w:type="pct"/>
+            <w:tcW w:w="2054" w:type="pct"/>
             <w:shd w:val="clear" w:color="auto" w:fill="auto"/>
           </w:tcPr>
           <w:p>
@@ -9298,7 +9295,7 @@
         </w:tc>
         <w:tc>
           <w:tcPr>
-            <w:tcW w:w="1932" w:type="pct"/>
+            <w:tcW w:w="1885" w:type="pct"/>
             <w:shd w:val="clear" w:color="auto" w:fill="auto"/>
           </w:tcPr>
           <w:p>
@@ -9319,7 +9316,7 @@
         </w:tc>
         <w:tc>
           <w:tcPr>
-            <w:tcW w:w="2007" w:type="pct"/>
+            <w:tcW w:w="2054" w:type="pct"/>
             <w:shd w:val="clear" w:color="auto" w:fill="auto"/>
           </w:tcPr>
           <w:p>
@@ -9391,58 +9388,43 @@
         </w:tc>
         <w:tc>
           <w:tcPr>
-            <w:tcW w:w="1932" w:type="pct"/>
-            <w:shd w:val="clear" w:color="auto" w:fill="auto"/>
-          </w:tcPr>
-          <w:p>
-            <w:pPr>
-              <w:pStyle w:val="CompactoOE3"/>
-              <w:spacing w:after="0"/>
-              <w:rPr>
-                <w:sz w:val="18"/>
-              </w:rPr>
-            </w:pPr>
-            <w:r>
-              <w:rPr>
-                <w:sz w:val="18"/>
-              </w:rPr>
-              <w:t xml:space="preserve">Lo que el texto nombra se ve sobre el cuadro de diálogo; fundidos en los cortes de cámara; </w:t>
-            </w:r>
-            <w:r>
-              <w:rPr>
-                <w:sz w:val="18"/>
-              </w:rPr>
-              <w:lastRenderedPageBreak/>
-              <w:t>cierre del Slice 2 y sonido repartidos</w:t>
-            </w:r>
-          </w:p>
-        </w:tc>
-        <w:tc>
-          <w:tcPr>
-            <w:tcW w:w="2007" w:type="pct"/>
-            <w:shd w:val="clear" w:color="auto" w:fill="auto"/>
-          </w:tcPr>
-          <w:p>
-            <w:pPr>
-              <w:pStyle w:val="CompactoOE3"/>
-              <w:spacing w:after="0"/>
-              <w:rPr>
-                <w:sz w:val="18"/>
-              </w:rPr>
-            </w:pPr>
-            <w:r>
-              <w:rPr>
-                <w:sz w:val="18"/>
-              </w:rPr>
-              <w:lastRenderedPageBreak/>
-              <w:t xml:space="preserve">Dos carriles en paralelo: D04-4 (Slice 2 mientras se cierra el Slice 1) y D05-2 (sonido), ambas con fecha límite 20/09. Un hallazgo del </w:t>
-            </w:r>
-            <w:r>
-              <w:rPr>
-                <w:sz w:val="18"/>
-              </w:rPr>
-              <w:lastRenderedPageBreak/>
-              <w:t>código, dos escenas del guion que nadie reproducía, vuelve al diseño de cámara y a una prueba que recorre las paradas</w:t>
+            <w:tcW w:w="1885" w:type="pct"/>
+            <w:shd w:val="clear" w:color="auto" w:fill="auto"/>
+          </w:tcPr>
+          <w:p>
+            <w:pPr>
+              <w:pStyle w:val="CompactoOE3"/>
+              <w:spacing w:after="0"/>
+              <w:rPr>
+                <w:sz w:val="18"/>
+              </w:rPr>
+            </w:pPr>
+            <w:r>
+              <w:rPr>
+                <w:sz w:val="18"/>
+              </w:rPr>
+              <w:t>Lo que el texto nombra se ve sobre el cuadro de diálogo; fundidos en los cortes de cámara; cierre del Slice 2 y sonido repartidos</w:t>
+            </w:r>
+          </w:p>
+        </w:tc>
+        <w:tc>
+          <w:tcPr>
+            <w:tcW w:w="2054" w:type="pct"/>
+            <w:shd w:val="clear" w:color="auto" w:fill="auto"/>
+          </w:tcPr>
+          <w:p>
+            <w:pPr>
+              <w:pStyle w:val="CompactoOE3"/>
+              <w:spacing w:after="0"/>
+              <w:rPr>
+                <w:sz w:val="18"/>
+              </w:rPr>
+            </w:pPr>
+            <w:r>
+              <w:rPr>
+                <w:sz w:val="18"/>
+              </w:rPr>
+              <w:t>Dos carriles en paralelo: D05-1 (Slice 2 mientras se cierra el Slice 1) y D05-2 (sonido), ambas con fecha límite 20/09. Un hallazgo del código, dos escenas del guion que nadie reproducía, vuelve al diseño de cámara y a una prueba que recorre las paradas</w:t>
             </w:r>
           </w:p>
         </w:tc>
@@ -9493,7 +9475,7 @@
         </w:tc>
         <w:tc>
           <w:tcPr>
-            <w:tcW w:w="1932" w:type="pct"/>
+            <w:tcW w:w="1885" w:type="pct"/>
             <w:shd w:val="clear" w:color="auto" w:fill="auto"/>
           </w:tcPr>
           <w:p>
@@ -9514,7 +9496,7 @@
         </w:tc>
         <w:tc>
           <w:tcPr>
-            <w:tcW w:w="2007" w:type="pct"/>
+            <w:tcW w:w="2054" w:type="pct"/>
             <w:shd w:val="clear" w:color="auto" w:fill="auto"/>
           </w:tcPr>
           <w:p>
@@ -9579,7 +9561,7 @@
         </w:tc>
         <w:tc>
           <w:tcPr>
-            <w:tcW w:w="1932" w:type="pct"/>
+            <w:tcW w:w="1885" w:type="pct"/>
             <w:shd w:val="clear" w:color="auto" w:fill="auto"/>
           </w:tcPr>
           <w:p>
@@ -9600,22 +9582,22 @@
         </w:tc>
         <w:tc>
           <w:tcPr>
-            <w:tcW w:w="2007" w:type="pct"/>
-            <w:shd w:val="clear" w:color="auto" w:fill="auto"/>
-          </w:tcPr>
-          <w:p>
-            <w:pPr>
-              <w:pStyle w:val="CompactoOE3"/>
-              <w:spacing w:after="0"/>
-              <w:rPr>
-                <w:sz w:val="18"/>
-              </w:rPr>
-            </w:pPr>
-            <w:r>
-              <w:rPr>
-                <w:sz w:val="18"/>
-              </w:rPr>
-              <w:t>D06-3 pasa a «finalizado»; abre D07-1 (Slice 3) y D07-2 (sonidos), 27/09. Lo construido en la recolección cambia el plan (se descarta la ventana superpuesta) y el encargo de arte (ocho piezas en lugar de treinta y cuatro láminas)</w:t>
+            <w:tcW w:w="2054" w:type="pct"/>
+            <w:shd w:val="clear" w:color="auto" w:fill="auto"/>
+          </w:tcPr>
+          <w:p>
+            <w:pPr>
+              <w:pStyle w:val="CompactoOE3"/>
+              <w:spacing w:after="0"/>
+              <w:rPr>
+                <w:sz w:val="18"/>
+              </w:rPr>
+            </w:pPr>
+            <w:r>
+              <w:rPr>
+                <w:sz w:val="18"/>
+              </w:rPr>
+              <w:t>D06-3 pasa a «finalizado»; abre D07-1 (Slice 3), D07-2 (sonidos) y D07-3 (sprites con la colaboradora), 27/09. Lo construido en la recolección cambia el plan (se descarta la ventana superpuesta) y el encargo de arte (ocho piezas en lugar de treinta y cuatro láminas)</w:t>
             </w:r>
           </w:p>
         </w:tc>
@@ -9665,7 +9647,7 @@
         </w:tc>
         <w:tc>
           <w:tcPr>
-            <w:tcW w:w="1932" w:type="pct"/>
+            <w:tcW w:w="1885" w:type="pct"/>
             <w:shd w:val="clear" w:color="auto" w:fill="auto"/>
           </w:tcPr>
           <w:p>
@@ -9686,7 +9668,7 @@
         </w:tc>
         <w:tc>
           <w:tcPr>
-            <w:tcW w:w="2007" w:type="pct"/>
+            <w:tcW w:w="2054" w:type="pct"/>
             <w:shd w:val="clear" w:color="auto" w:fill="auto"/>
           </w:tcPr>
           <w:p>
@@ -9751,7 +9733,7 @@
         </w:tc>
         <w:tc>
           <w:tcPr>
-            <w:tcW w:w="1932" w:type="pct"/>
+            <w:tcW w:w="1885" w:type="pct"/>
             <w:shd w:val="clear" w:color="auto" w:fill="auto"/>
           </w:tcPr>
           <w:p>
@@ -9772,7 +9754,7 @@
         </w:tc>
         <w:tc>
           <w:tcPr>
-            <w:tcW w:w="2007" w:type="pct"/>
+            <w:tcW w:w="2054" w:type="pct"/>
             <w:shd w:val="clear" w:color="auto" w:fill="auto"/>
           </w:tcPr>
           <w:p>
@@ -9837,7 +9819,7 @@
         </w:tc>
         <w:tc>
           <w:tcPr>
-            <w:tcW w:w="1932" w:type="pct"/>
+            <w:tcW w:w="1885" w:type="pct"/>
             <w:shd w:val="clear" w:color="auto" w:fill="auto"/>
           </w:tcPr>
           <w:p>
@@ -9858,22 +9840,22 @@
         </w:tc>
         <w:tc>
           <w:tcPr>
-            <w:tcW w:w="2007" w:type="pct"/>
-            <w:shd w:val="clear" w:color="auto" w:fill="auto"/>
-          </w:tcPr>
-          <w:p>
-            <w:pPr>
-              <w:pStyle w:val="CompactoOE3"/>
-              <w:spacing w:after="0"/>
-              <w:rPr>
-                <w:sz w:val="18"/>
-              </w:rPr>
-            </w:pPr>
-            <w:r>
-              <w:rPr>
-                <w:sz w:val="18"/>
-              </w:rPr>
-              <w:t>D09-1 pasa a «finalizado». Revisa las 119 casillas sin cerrar de los cuatro tableros (103 sin marcar y 16 parciales) y deja ocho abiertas; abre D10-1 a D10-7, con la D10-8 citada en el plan y en la adenda del 01/10</w:t>
+            <w:tcW w:w="2054" w:type="pct"/>
+            <w:shd w:val="clear" w:color="auto" w:fill="auto"/>
+          </w:tcPr>
+          <w:p>
+            <w:pPr>
+              <w:pStyle w:val="CompactoOE3"/>
+              <w:spacing w:after="0"/>
+              <w:rPr>
+                <w:sz w:val="18"/>
+              </w:rPr>
+            </w:pPr>
+            <w:r>
+              <w:rPr>
+                <w:sz w:val="18"/>
+              </w:rPr>
+              <w:t>D09-1 pasa a «finalizado». Revisa las 119 casillas sin cerrar de los cuatro tableros (103 sin marcar y 16 parciales) y deja ocho abiertas; abre D10-1 a D10-8, la D10-7 para este entregable y la D10-8 para el capítulo 8</w:t>
             </w:r>
           </w:p>
         </w:tc>
@@ -9895,11 +9877,11 @@
         <w:pStyle w:val="TextoOE3"/>
       </w:pPr>
       <w:r>
+        <w:t xml:space="preserve">Las actas y los documentos de resultados se remiten unos a otros, y el apartado 1 de cada anexo enumera las actas y tarjetas que gobernaron su incremento. La D07-1 se cumplió en su parte de código el 21 de septiembre, seis días antes de su fecha límite, y la D08 la declaró finalizada. La D08-1, que abrió el Slice 4, se declaró finalizada en la D09, con el incremento </w:t>
+      </w:r>
+      <w:r>
         <w:lastRenderedPageBreak/>
-        <w:t>Las actas y los documentos de resultados se remiten unos a otros, y el apartado 1 de cada anexo enumera las actas y tarjetas que gobernaron su incremento. La D07-1 se cumplió en su parte de código el 21 de septiembre, seis días antes de su fecha límite, y la D08 la declaró finalizada. La D08-1, que abrió el Slice 4, se declaró finalizada en la D09, con el incremento cerrado y fusionado en la rama principal (Anexo G, apartado 1). La D10 dio por cumplida la D09-1, porque los troncos del Nivel 2 ruedan en el m</w:t>
-      </w:r>
-      <w:r>
-        <w:t>otor desde el 24 de septiembre, dibujados a partir de una sola textura. Esa sesión no revisó las tarjetas D06-1, D07-3, D09-2, D09-3 y D09-4, que dependen de Sofía Valentina Giraldo Segovia o de Santiago Valdiri García, ausentes ese día.</w:t>
+        <w:t>cerrado y fusionado en la rama principal (Anexo G, apartado 1). La D10 dio por cumplida la D09-1, porque los troncos del Nivel 2 ruedan en el motor desde el 24 de septiembre, dibujados a partir de una sola textura. Esa sesión no revisó las tarjetas D06-1, D07-3, D09-2, D09-3 y D09-4, que dependen de Sofía Valentina Giraldo Segovia o de Santiago Valdiri García, ausentes ese día.</w:t>
       </w:r>
     </w:p>
     <w:p>
@@ -9917,7 +9899,7 @@
       <w:pPr>
         <w:pStyle w:val="Ttulo2"/>
       </w:pPr>
-      <w:bookmarkStart w:id="10" w:name="_Toc242194827"/>
+      <w:bookmarkStart w:id="10" w:name="_Toc242198214"/>
       <w:r>
         <w:t>2.4 Entorno y herramientas de desarrollo</w:t>
       </w:r>
@@ -10584,7 +10566,6 @@
               <w:rPr>
                 <w:sz w:val="18"/>
               </w:rPr>
-              <w:lastRenderedPageBreak/>
               <w:t>Control de versiones</w:t>
             </w:r>
           </w:p>
@@ -10715,6 +10696,7 @@
               <w:rPr>
                 <w:sz w:val="18"/>
               </w:rPr>
+              <w:lastRenderedPageBreak/>
               <w:t>Corredor de pruebas con el Editor abierto</w:t>
             </w:r>
           </w:p>
@@ -10743,13 +10725,7 @@
               <w:rPr>
                 <w:sz w:val="18"/>
               </w:rPr>
-              <w:t xml:space="preserve"> </w:t>
-            </w:r>
-            <w:r>
-              <w:rPr>
-                <w:sz w:val="18"/>
-              </w:rPr>
-              <w:t xml:space="preserve">(PowerShell 7) sobre el servidor HTTP local del paquete </w:t>
+              <w:t xml:space="preserve"> (PowerShell 7) sobre el servidor HTTP local del paquete </w:t>
             </w:r>
             <w:r>
               <w:rPr>
@@ -11226,23 +11202,133 @@
         <w:t xml:space="preserve">orredor del entorno de desarrollo desconectado o intermitente. Los puntos de control E y F del Slice 1, que verificaron la mecánica rehecha del Nivel 1, se corrieron por línea de comandos con el editor cerrado. La corrida del punto de control F, el 15 de septiembre, dio 221 de 221 casos en EditMode y 144 de 153 en PlayMode, y es la que declara la D06. Cuando el puente no respondía con el editor abierto se usó un tercer camino, un script temporal dentro del editor que invoca la interfaz de pruebas de Unity. </w:t>
       </w:r>
       <w:r>
-        <w:t xml:space="preserve">Con él se corrieron, entre otras, la suite del punto de control W-F del Slice 2, ese mismo 15 de septiembre (212 de 212 casos en EditMode y 146 de 148 en PlayMode, con los dos restantes en verde tras actualizar su expectativa; Anexo C, apartado </w:t>
-      </w:r>
+        <w:t xml:space="preserve">Con él se corrieron, entre otras, la suite del punto de control W-F del Slice 2, ese mismo 15 de septiembre (212 de 212 casos en EditMode y 146 de 148 en PlayMode, con los dos restantes en verde tras actualizar su expectativa; Anexo C, apartado 4), y la corrida completa del 25 de septiembre (Anexo G, apartado 4.2). Desde el 30 de septiembre las corridas con el editor abierto pasan por </w:t>
+      </w:r>
+      <w:r>
+        <w:rPr>
+          <w:rStyle w:val="CdigoenlneaOE3"/>
+        </w:rPr>
+        <w:t>editor.ps1</w:t>
+      </w:r>
+      <w:r>
+        <w:t xml:space="preserve"> (Tabla 2.5), que fija la vista de juego a 1920 × 1080 antes de cada corrida PlayMode; así se hicieron la línea ba</w:t>
+      </w:r>
+      <w:r>
+        <w:t>se del cierre y las corridas completas del 1 de octubre (Anexo G, apartado 4.2).</w:t>
+      </w:r>
+    </w:p>
+    <w:p>
+      <w:pPr>
+        <w:pStyle w:val="TextoOE3"/>
+      </w:pPr>
       <w:r>
         <w:lastRenderedPageBreak/>
-        <w:t xml:space="preserve">4), y la corrida completa del 25 de septiembre (Anexo G, apartado 4.2). Desde el 30 de septiembre las corridas con el editor abierto pasan por </w:t>
+        <w:t xml:space="preserve">El repositorio registra 104 commits entre el 29 de agosto y el 30 de septiembre de 2026, hasta </w:t>
       </w:r>
       <w:r>
         <w:rPr>
           <w:rStyle w:val="CdigoenlneaOE3"/>
         </w:rPr>
-        <w:t>editor.ps1</w:t>
-      </w:r>
-      <w:r>
-        <w:t xml:space="preserve"> (Tabla 2.5), que fija la vista de juego a 1920 × 1080 antes de cada corrida PlayMode; así se hicieron la línea ba</w:t>
-      </w:r>
-      <w:r>
-        <w:t>se del cierre y las corridas completas del 1 de octubre (Anexo G, apartado 4.2).</w:t>
+        <w:t>359365e</w:t>
+      </w:r>
+      <w:r>
+        <w:t xml:space="preserve">, hechos desde las cuentas de los dos estudiantes. El trabajo avanzó en ramas por fase, incremento o carril, que se integraron en la rama principal mediante solicitudes de integración (pull requests). El Slice 1 entró en cuatro ramas de fase, y sus fases 5 y 6 llegaron con la rama del Slice 2. Se fusionaron catorce solicitudes, de la n.º 49 (6 de septiembre, cimientos del Slice 1) a la n.º 88 (30 de septiembre); las dos últimas llevaron a la rama principal </w:t>
+      </w:r>
+      <w:r>
+        <w:rPr>
+          <w:rStyle w:val="CdigoenlneaOE3"/>
+        </w:rPr>
+        <w:t>44fd479</w:t>
+      </w:r>
+      <w:r>
+        <w:t>, el plan de pruebas del OE4 (</w:t>
+      </w:r>
+      <w:r>
+        <w:rPr>
+          <w:rStyle w:val="CdigoenlneaOE3"/>
+        </w:rPr>
+        <w:t>d105838</w:t>
+      </w:r>
+      <w:r>
+        <w:t>) y el cierre de inconsistencias (</w:t>
+      </w:r>
+      <w:r>
+        <w:rPr>
+          <w:rStyle w:val="CdigoenlneaOE3"/>
+        </w:rPr>
+        <w:t>37b3cb7</w:t>
+      </w:r>
+      <w:r>
+        <w:t xml:space="preserve"> y </w:t>
+      </w:r>
+      <w:r>
+        <w:rPr>
+          <w:rStyle w:val="CdigoenlneaOE3"/>
+        </w:rPr>
+        <w:t>5a22df1</w:t>
+      </w:r>
+      <w:r>
+        <w:t xml:space="preserve">). El cierre del 30 de septiembre y el 1 de octubre se trabajó en la rama </w:t>
+      </w:r>
+      <w:r>
+        <w:rPr>
+          <w:rStyle w:val="CdigoenlneaOE3"/>
+        </w:rPr>
+        <w:t>feat/cierre-de-slices-y-oe3</w:t>
+      </w:r>
+      <w:r>
+        <w:t xml:space="preserve">, abierta desde </w:t>
+      </w:r>
+      <w:r>
+        <w:rPr>
+          <w:rStyle w:val="CdigoenlneaOE3"/>
+        </w:rPr>
+        <w:t>359365e</w:t>
+      </w:r>
+      <w:r>
+        <w:t xml:space="preserve">, y de ella sale el corte del 1 de octubre de 2026 que describe este documento (capítulo 1). El trabajo posterior al corte, del 02 al 06/10/2026, está en la rama </w:t>
+      </w:r>
+      <w:r>
+        <w:rPr>
+          <w:rStyle w:val="CdigoenlneaOE3"/>
+        </w:rPr>
+        <w:t>feat/personajes-animados</w:t>
+      </w:r>
+      <w:r>
+        <w:t xml:space="preserve">, que no se ha fusionado a </w:t>
+      </w:r>
+      <w:r>
+        <w:rPr>
+          <w:rStyle w:val="CdigoenlneaOE3"/>
+        </w:rPr>
+        <w:t>main</w:t>
+      </w:r>
+      <w:r>
+        <w:t>. El desarrollo se apoyó además en un agente de programación asistida por inteligencia artificial (Claude Code, de Anthr</w:t>
+      </w:r>
+      <w:r>
+        <w:t>opic), que operó sobre el repositorio, el editor y las pruebas bajo la dirección y la revisión de los autores, como consta en el archivo de instrucciones del agente versionado en el repositorio y en los documentos de resultados.</w:t>
+      </w:r>
+    </w:p>
+    <w:p>
+      <w:pPr>
+        <w:pStyle w:val="Ttulo2"/>
+      </w:pPr>
+      <w:bookmarkStart w:id="11" w:name="_Toc242198215"/>
+      <w:r>
+        <w:t>2.5 Prácticas de ingeniería</w:t>
+      </w:r>
+      <w:bookmarkEnd w:id="11"/>
+    </w:p>
+    <w:p>
+      <w:pPr>
+        <w:pStyle w:val="PrimerprrafoOE3"/>
+      </w:pPr>
+      <w:r>
+        <w:t xml:space="preserve">El contrato de desarrollo obliga a escribir la prueba antes que la implementación y a verla fallar. Cada tarea sigue la secuencia de planeación, diseño de casos, prueba en rojo, implementación y refactorización; los defectos se reproducen, se diagnostican y luego se corrigen. En el cierre, cuando una prueba salía en verde desde el principio, una mutación temporal del código de producción, revertida después, demostraba que la prueba detectaba el defecto. La práctica descansa en la arquitectura: la lógica de </w:t>
+      </w:r>
+      <w:r>
+        <w:t>cada nivel está escrita en C# plano y se prueba en EditMode, sin escena ni fotogramas, y el componente del motor, un adaptador fino, se prueba en PlayMode con el cableado de la escena (apartado 3.1). La suite se organiza en diecisiete módulos de prueba, once de EditMode y seis de PlayMode, y su resultado en el corte está en el apartado 9.3.</w:t>
       </w:r>
     </w:p>
     <w:p>
@@ -11250,25 +11336,147 @@
         <w:pStyle w:val="TextoOE3"/>
       </w:pPr>
       <w:r>
-        <w:t xml:space="preserve">El repositorio registra 104 commits entre el 29 de agosto y el 30 de septiembre de 2026, hasta </w:t>
+        <w:t>Desde la D02 rige el acuerdo de que toda verificación declara cómo se ejecutó y qué dio, y de que ninguna casilla de prueba se marca dando por hecho que la suite pasó. Los documentos de resultados reportan las corridas tal como salieron, con los casos que fallan y su causa: en la D06 se declararon nueve casos no verdes, tres de ellos preexistentes, antes de fusionar el Slice 2. En el cierre, cada corrección se comparó con la línea base del 30 de septiembre y pasó por una revisión independiente antes de acep</w:t>
+      </w:r>
+      <w:r>
+        <w:t>tarse.</w:t>
+      </w:r>
+    </w:p>
+    <w:p>
+      <w:pPr>
+        <w:pStyle w:val="TextoOE3"/>
+      </w:pPr>
+      <w:r>
+        <w:t xml:space="preserve">Para la trazabilidad (CT-10), el nombre de cada prueba cita el requerimiento que verifica, con el patrón </w:t>
       </w:r>
       <w:r>
         <w:rPr>
           <w:rStyle w:val="CdigoenlneaOE3"/>
         </w:rPr>
-        <w:t>359365e</w:t>
-      </w:r>
-      <w:r>
-        <w:t xml:space="preserve">, hechos desde las cuentas de los dos estudiantes. El trabajo avanzó en ramas por fase, incremento o carril, que se integraron en la rama principal mediante solicitudes de integración (pull requests). El Slice 1 entró en cuatro ramas de fase, y sus fases 5 y 6 llegaron con la rama del Slice 2. Se fusionaron catorce solicitudes, de la n.º 49 (6 de septiembre, cimientos del Slice 1) a la n.º 88 (30 de septiembre); las dos últimas llevaron a la rama principal </w:t>
+        <w:t>&lt;Sujeto&gt;_&lt;Requisito&gt;_&lt;QuéHace&gt;</w:t>
+      </w:r>
+      <w:r>
+        <w:t>, y una prueba de trazabilidad falla si alguno de los cuarenta y siete RF carece de una que lo nombre. El mecanismo se detalla en los apartados 9.1 y 9.4, y la matriz del Anexo A se deriva de esos nombres.</w:t>
+      </w:r>
+    </w:p>
+    <w:p>
+      <w:pPr>
+        <w:pStyle w:val="TextoOE3"/>
+      </w:pPr>
+      <w:r>
+        <w:t>Los criterios pedagógicos y de arquitectura también son pruebas. Los invariantes pedagógicos, que el estudiante nunca pierde (CP-02) y nunca ve una cifra de desempeño (CP-03), y la regla de que ningún nivel referencia a otro (RNF-16) están fijados con pruebas automáticas (apartados 3.2 y 9.1).</w:t>
+      </w:r>
+    </w:p>
+    <w:p>
+      <w:pPr>
+        <w:pStyle w:val="TextoOE3"/>
+      </w:pPr>
+      <w:r>
+        <w:lastRenderedPageBreak/>
+        <w:t>Los conflictos entre los documentos radicados, y entre ellos y el juego, se registran en un documento propio con la corrección de cada uno y un orden de precedencia fijo. El 29/09/2026 se adoptó una regla única para cerrarlos: ante un conflicto gana el juego y se corrige el documento, lo que solo pide el documento se implementa y lo que solo tiene el juego se escribe en el documento. Con ella la revisión 14 (29/09) cerró los nueve hallazgos que seguían abiertos (INC-46 a INC-54) y registró y cerró sesenta n</w:t>
+      </w:r>
+      <w:r>
+        <w:t>uevos (INC-55 a INC-114); la revisión 15 (30/09) hizo lo mismo con INC-115 a INC-117, y la revisión 16 (01/10), con INC-118 a INC-130, que recogen las correcciones del acta D10 y la del peso del paquete de entrega. Al corte están cerrados INC-01 a INC-130. Después del corte, las revisiones 17 y 18 (05/10) y 19 (06/10) cerraron INC-131, INC-132 e INC-133, decisiones de Santiago Benavides Rey sobre el arte final de los personajes y el orden de dibujo de sus brazos y antebrazos, y con ellas el registro llega a</w:t>
+      </w:r>
+      <w:r>
+        <w:t xml:space="preserve"> INC-133. Los radicados se corrigieron por automatización de Word, con autorización expresa y con una fila fechada en el control de cambios de cada documento. Modificar un RF, un RNF o un criterio de aceptación sigue exigiendo consulta previa.</w:t>
+      </w:r>
+    </w:p>
+    <w:p>
+      <w:pPr>
+        <w:pStyle w:val="TextoOE3"/>
+      </w:pPr>
+      <w:r>
+        <w:t>Los textos visibles y los parámetros que se ajustan jugando residen en recursos de datos del motor y no en las clases (CT-05, RNF-18). Encadenar escenas narrativas, cambiar un mensaje del guía o ajustar un parámetro de nivel consiste en editar un recurso, sin tocar el programa; desde el 30/09/2026 la regla no tiene excepciones (apartado 3.4).</w:t>
+      </w:r>
+    </w:p>
+    <w:p>
+      <w:pPr>
+        <w:pStyle w:val="TextoOE3"/>
+      </w:pPr>
+      <w:r>
+        <w:t>CT-11 y RNF-17 piden que cada cambio quede en el repositorio asociado a su tarea del tablero. Entre el 1 y el 30 de septiembre hay 75 commits sin fusión, y 44 citan la tarea del incremento (T05, W01, R09–R12) o la tarjeta del acta (D05-2, D07-2, D08-2): 42 en el asunto y dos solo en el cuerpo del mensaje (</w:t>
       </w:r>
       <w:r>
         <w:rPr>
           <w:rStyle w:val="CdigoenlneaOE3"/>
         </w:rPr>
+        <w:t>9c34924</w:t>
+      </w:r>
+      <w:r>
+        <w:t xml:space="preserve"> y </w:t>
+      </w:r>
+      <w:r>
+        <w:rPr>
+          <w:rStyle w:val="CdigoenlneaOE3"/>
+        </w:rPr>
+        <w:t>1009c5a</w:t>
+      </w:r>
+      <w:r>
+        <w:t>). Muchos citan también los requerimientos que atienden. El cumplimiento es parcial. De los 31 restantes, cinco incorporan sonidos, uno ajusta la configuración del editor, trece son la estructura inicial, cierres de fase, documentación o la decisión de planeación del 10 de septiembre, tres son correcciones y nueve son funcionalidad sin tarjeta (</w:t>
+      </w:r>
+      <w:r>
+        <w:rPr>
+          <w:rStyle w:val="CdigoenlneaOE3"/>
+        </w:rPr>
+        <w:t>88fe0ee</w:t>
+      </w:r>
+      <w:r>
+        <w:t xml:space="preserve">, </w:t>
+      </w:r>
+      <w:r>
+        <w:rPr>
+          <w:rStyle w:val="CdigoenlneaOE3"/>
+        </w:rPr>
+        <w:t>d81cfc7</w:t>
+      </w:r>
+      <w:r>
+        <w:t xml:space="preserve">, </w:t>
+      </w:r>
+      <w:r>
+        <w:rPr>
+          <w:rStyle w:val="CdigoenlneaOE3"/>
+        </w:rPr>
+        <w:t>dc51804</w:t>
+      </w:r>
+      <w:r>
+        <w:t xml:space="preserve">, </w:t>
+      </w:r>
+      <w:r>
+        <w:rPr>
+          <w:rStyle w:val="CdigoenlneaOE3"/>
+        </w:rPr>
+        <w:t>b38c00b</w:t>
+      </w:r>
+      <w:r>
+        <w:t xml:space="preserve">, </w:t>
+      </w:r>
+      <w:r>
+        <w:rPr>
+          <w:rStyle w:val="CdigoenlneaOE3"/>
+        </w:rPr>
+        <w:t>1d5ce58</w:t>
+      </w:r>
+      <w:r>
+        <w:t xml:space="preserve">, </w:t>
+      </w:r>
+      <w:r>
+        <w:rPr>
+          <w:rStyle w:val="CdigoenlneaOE3"/>
+        </w:rPr>
+        <w:t>d3a6cc9</w:t>
+      </w:r>
+      <w:r>
+        <w:t xml:space="preserve">, </w:t>
+      </w:r>
+      <w:r>
+        <w:rPr>
+          <w:rStyle w:val="CdigoenlneaOE3"/>
+        </w:rPr>
         <w:t>44fd479</w:t>
       </w:r>
       <w:r>
-        <w:t>, el plan de pruebas del OE4 (</w:t>
+        <w:t xml:space="preserve">, </w:t>
       </w:r>
       <w:r>
         <w:rPr>
@@ -11277,7 +11485,7 @@
         <w:t>d105838</w:t>
       </w:r>
       <w:r>
-        <w:t>) y el cierre de inconsistencias (</w:t>
+        <w:t xml:space="preserve"> y </w:t>
       </w:r>
       <w:r>
         <w:rPr>
@@ -11286,76 +11494,10 @@
         <w:t>37b3cb7</w:t>
       </w:r>
       <w:r>
-        <w:t xml:space="preserve"> y </w:t>
-      </w:r>
-      <w:r>
-        <w:rPr>
-          <w:rStyle w:val="CdigoenlneaOE3"/>
-        </w:rPr>
-        <w:t>5a22df1</w:t>
-      </w:r>
-      <w:r>
-        <w:t xml:space="preserve">). El cierre del 30 de septiembre y el 1 de octubre se trabajó en la rama </w:t>
-      </w:r>
-      <w:r>
-        <w:rPr>
-          <w:rStyle w:val="CdigoenlneaOE3"/>
-        </w:rPr>
-        <w:t>feat/cierre-de-slices-y-oe3</w:t>
-      </w:r>
-      <w:r>
-        <w:t xml:space="preserve">, abierta desde </w:t>
-      </w:r>
-      <w:r>
-        <w:rPr>
-          <w:rStyle w:val="CdigoenlneaOE3"/>
-        </w:rPr>
-        <w:t>359365e</w:t>
-      </w:r>
-      <w:r>
-        <w:t xml:space="preserve">, y de ella sale el corte del 1 de octubre de 2026 que describe este documento (capítulo 1). El trabajo posterior al corte, del 02 al 06/10/2026, está en la rama </w:t>
-      </w:r>
-      <w:r>
-        <w:rPr>
-          <w:rStyle w:val="CdigoenlneaOE3"/>
-        </w:rPr>
-        <w:t>feat/personajes-animados</w:t>
-      </w:r>
-      <w:r>
-        <w:t xml:space="preserve">, que no se ha fusionado a </w:t>
-      </w:r>
-      <w:r>
-        <w:rPr>
-          <w:rStyle w:val="CdigoenlneaOE3"/>
-        </w:rPr>
-        <w:t>main</w:t>
-      </w:r>
-      <w:r>
-        <w:t>. El desarrollo se apoyó además en un agente de programación asistida por inteligencia artificial (Claude Code, de Anthr</w:t>
-      </w:r>
-      <w:r>
-        <w:t>opic), que operó sobre el repositorio, el editor y las pruebas bajo la dirección y la revisión de los autores, como consta en el archivo de instrucciones del agente versionado en el repositorio y en los documentos de resultados.</w:t>
-      </w:r>
-    </w:p>
-    <w:p>
-      <w:pPr>
-        <w:pStyle w:val="Ttulo2"/>
-      </w:pPr>
-      <w:bookmarkStart w:id="11" w:name="_Toc242194828"/>
-      <w:r>
-        <w:t>2.5 Prácticas de ingeniería</w:t>
-      </w:r>
-      <w:bookmarkEnd w:id="11"/>
-    </w:p>
-    <w:p>
-      <w:pPr>
-        <w:pStyle w:val="PrimerprrafoOE3"/>
-      </w:pPr>
-      <w:r>
-        <w:t xml:space="preserve">El contrato de desarrollo obliga a escribir la prueba antes que la implementación y a verla fallar. Cada tarea sigue la secuencia de planeación, diseño de casos, prueba en rojo, implementación y refactorización; los defectos se reproducen, se diagnostican y luego se corrigen. En el cierre, cuando una prueba salía en verde desde el principio, una mutación temporal del código de producción, revertida después, demostraba que la prueba detectaba el defecto. La práctica descansa en la arquitectura: la lógica de </w:t>
-      </w:r>
-      <w:r>
-        <w:t>cada nivel está escrita en C# plano y se prueba en EditMode, sin escena ni fotogramas, y el componente del motor, un adaptador fino, se prueba en PlayMode con el cableado de la escena (apartado 3.1). La suite se organiza en diecisiete módulos de prueba, once de EditMode y seis de PlayMode, y su resultado en el corte está en el apartado 9.3.</w:t>
+        <w:t xml:space="preserve">); cuatro de ellos llevan en el asunto el espacio de la tarjeta sin </w:t>
+      </w:r>
+      <w:r>
+        <w:t>completar. Los cambios del cierre se asocian a las tarjetas D10-1 a D10-8, que cita el mensaje de su commit.</w:t>
       </w:r>
     </w:p>
     <w:p>
@@ -11363,183 +11505,10 @@
         <w:pStyle w:val="TextoOE3"/>
       </w:pPr>
       <w:r>
-        <w:t>Desde la D02 rige el acuerdo de que toda verificación declara cómo se ejecutó y qué dio, y de que ninguna casilla de prueba se marca dando por hecho que la suite pasó. Los documentos de resultados reportan las corridas tal como salieron, con los casos que fallan y su causa: en la D06 se declararon nueve casos no verdes, tres de ellos preexistentes, antes de fusionar el Slice 2. En el cierre, cada corrección se comparó con la línea base del 30 de septiembre y pasó por una revisión independiente antes de acep</w:t>
-      </w:r>
-      <w:r>
-        <w:t>tarse.</w:t>
-      </w:r>
-    </w:p>
-    <w:p>
-      <w:pPr>
-        <w:pStyle w:val="TextoOE3"/>
-      </w:pPr>
-      <w:r>
-        <w:t xml:space="preserve">Para la trazabilidad (CT-10), el nombre de cada prueba cita el requerimiento que verifica, con el patrón </w:t>
-      </w:r>
-      <w:r>
-        <w:rPr>
-          <w:rStyle w:val="CdigoenlneaOE3"/>
-        </w:rPr>
-        <w:t>&lt;Sujeto&gt;_&lt;Requisito&gt;_&lt;QuéHace&gt;</w:t>
-      </w:r>
-      <w:r>
-        <w:t>, y una prueba de trazabilidad falla si alguno de los cuarenta y siete RF carece de una que lo nombre. El mecanismo se detalla en los apartados 9.1 y 9.4, y la matriz del Anexo A se deriva de esos nombres.</w:t>
-      </w:r>
-    </w:p>
-    <w:p>
-      <w:pPr>
-        <w:pStyle w:val="TextoOE3"/>
-      </w:pPr>
-      <w:r>
-        <w:lastRenderedPageBreak/>
-        <w:t>Los criterios pedagógicos y de arquitectura también son pruebas. Los invariantes pedagógicos, que el estudiante nunca pierde (CP-02) y nunca ve una cifra de desempeño (CP-03), y la regla de que ningún nivel referencia a otro (RNF-16) están fijados con pruebas automáticas (apartados 3.2 y 9.1).</w:t>
-      </w:r>
-    </w:p>
-    <w:p>
-      <w:pPr>
-        <w:pStyle w:val="TextoOE3"/>
-      </w:pPr>
-      <w:r>
-        <w:t>Los conflictos entre los documentos radicados, y entre ellos y el juego, se registran en un documento propio con la corrección de cada uno y un orden de precedencia fijo. El 29/09/2026 se adoptó una regla única para cerrarlos: ante un conflicto gana el juego y se corrige el documento, lo que solo pide el documento se implementa y lo que solo tiene el juego se escribe en el documento. Con ella la revisión 14 (29/09) cerró los nueve hallazgos que seguían abiertos (INC-46 a INC-54) y registró y cerró sesenta n</w:t>
-      </w:r>
-      <w:r>
-        <w:t>uevos (INC-55 a INC-114); la revisión 15 (30/09) hizo lo mismo con INC-115 a INC-117, y la revisión 16 (01/10), con INC-118 a INC-130, que recogen las correcciones del acta D10 y la del peso del paquete de entrega. Al corte están cerrados INC-01 a INC-130. Después del corte, las revisiones 17 y 18 (05/10) y 19 (06/10) cerraron INC-131, INC-132 e INC-133, decisiones de Santiago Benavides Rey sobre el arte final de los personajes y el orden de dibujo de sus brazos y antebrazos, y con ellas el registro llega a</w:t>
-      </w:r>
-      <w:r>
-        <w:t xml:space="preserve"> INC-133. Los radicados se corrigieron por automatización de Word, con autorización expresa y con una fila fechada en el control de cambios de cada documento. Modificar un RF, un RNF o un criterio de aceptación sigue exigiendo consulta previa.</w:t>
-      </w:r>
-    </w:p>
-    <w:p>
-      <w:pPr>
-        <w:pStyle w:val="TextoOE3"/>
-      </w:pPr>
-      <w:r>
-        <w:t>Los textos visibles y los parámetros que se ajustan jugando residen en recursos de datos del motor y no en las clases (CT-05, RNF-18). Encadenar escenas narrativas, cambiar un mensaje del guía o ajustar un parámetro de nivel consiste en editar un recurso, sin tocar el programa; desde el 30/09/2026 la regla no tiene excepciones (apartado 3.4).</w:t>
-      </w:r>
-    </w:p>
-    <w:p>
-      <w:pPr>
-        <w:pStyle w:val="TextoOE3"/>
-      </w:pPr>
-      <w:r>
-        <w:t>CT-11 y RNF-17 piden que cada cambio quede en el repositorio asociado a su tarea del tablero. Entre el 1 y el 30 de septiembre hay 75 commits sin fusión, y 44 citan la tarea del incremento (T05, W01, R09–R12) o la tarjeta del acta (D05-2, D07-2, D08-2): 42 en el asunto y dos solo en el cuerpo del mensaje (</w:t>
-      </w:r>
-      <w:r>
-        <w:rPr>
-          <w:rStyle w:val="CdigoenlneaOE3"/>
-        </w:rPr>
-        <w:t>9c34924</w:t>
-      </w:r>
-      <w:r>
-        <w:t xml:space="preserve"> y </w:t>
-      </w:r>
-      <w:r>
-        <w:rPr>
-          <w:rStyle w:val="CdigoenlneaOE3"/>
-        </w:rPr>
-        <w:t>1009c5a</w:t>
-      </w:r>
-      <w:r>
-        <w:t>). Muchos citan también los requerimientos que atienden. El cumplimiento es parcial. De los 31 restantes, cinco incorporan sonidos, uno ajusta la configuración del editor, trece son la estructura inicial, cierres de fase, documentación o la decisión de planeación del 10 de septiembre, tres son correcciones y nueve son funcionalidad sin tarjeta (</w:t>
-      </w:r>
-      <w:r>
-        <w:rPr>
-          <w:rStyle w:val="CdigoenlneaOE3"/>
-        </w:rPr>
-        <w:t>88fe0ee</w:t>
-      </w:r>
-      <w:r>
-        <w:t xml:space="preserve">, </w:t>
-      </w:r>
-      <w:r>
-        <w:rPr>
-          <w:rStyle w:val="CdigoenlneaOE3"/>
-        </w:rPr>
-        <w:t>d81cfc7</w:t>
-      </w:r>
-      <w:r>
-        <w:t xml:space="preserve">, </w:t>
-      </w:r>
-      <w:r>
-        <w:rPr>
-          <w:rStyle w:val="CdigoenlneaOE3"/>
-        </w:rPr>
-        <w:t>dc51804</w:t>
-      </w:r>
-      <w:r>
-        <w:t xml:space="preserve">, </w:t>
-      </w:r>
-      <w:r>
-        <w:rPr>
-          <w:rStyle w:val="CdigoenlneaOE3"/>
-        </w:rPr>
-        <w:t>b38c00b</w:t>
-      </w:r>
-      <w:r>
-        <w:t xml:space="preserve">, </w:t>
-      </w:r>
-      <w:r>
-        <w:rPr>
-          <w:rStyle w:val="CdigoenlneaOE3"/>
-        </w:rPr>
-        <w:t>1d5ce58</w:t>
-      </w:r>
-      <w:r>
-        <w:t xml:space="preserve">, </w:t>
-      </w:r>
-      <w:r>
-        <w:rPr>
-          <w:rStyle w:val="CdigoenlneaOE3"/>
-        </w:rPr>
-        <w:t>d3a6cc9</w:t>
-      </w:r>
-      <w:r>
-        <w:t xml:space="preserve">, </w:t>
-      </w:r>
-      <w:r>
-        <w:rPr>
-          <w:rStyle w:val="CdigoenlneaOE3"/>
-        </w:rPr>
-        <w:t>44fd479</w:t>
-      </w:r>
-      <w:r>
-        <w:t xml:space="preserve">, </w:t>
-      </w:r>
-      <w:r>
-        <w:rPr>
-          <w:rStyle w:val="CdigoenlneaOE3"/>
-        </w:rPr>
-        <w:t>d105838</w:t>
-      </w:r>
-      <w:r>
-        <w:t xml:space="preserve"> y </w:t>
-      </w:r>
-      <w:r>
-        <w:rPr>
-          <w:rStyle w:val="CdigoenlneaOE3"/>
-        </w:rPr>
-        <w:t>37b3cb7</w:t>
-      </w:r>
-      <w:r>
-        <w:t xml:space="preserve">); cuatro de ellos llevan en el asunto el espacio de la tarjeta sin </w:t>
-      </w:r>
-      <w:r>
-        <w:t>completar. Los cambios del cierre se asocian a las tarjetas D10-1 a D10-8, que cita el mensaje de su commit.</w:t>
-      </w:r>
-    </w:p>
-    <w:p>
-      <w:pPr>
-        <w:pStyle w:val="TextoOE3"/>
-      </w:pPr>
-      <w:r>
         <w:t>Cada fase o incremento tiene un documento de resultados que registra qué se construyó, con qué se verificó y qué quedó abierto en su momento; el de las fases 5 y 6 del Slice 1 se escribió a posteriori, el 25 de septiembre. Esos documentos no se reescriben. Cuando una afirmación deja de ser cierta se le añade una nota fechada, y los afectados por cambios posteriores llevan un anexo con lo que cambió después de su cierre, verificado contra el código; el último, del 01/10/2026, recoge las correcciones del acta</w:t>
       </w:r>
       <w:r>
-        <w:t xml:space="preserve"> D10. Los anexos B a G de </w:t>
-      </w:r>
-      <w:r>
-        <w:lastRenderedPageBreak/>
-        <w:t>este entregable parten de ellos, pero se redactaron aparte y describen el prototipo en su estado final (acta D10).</w:t>
+        <w:t xml:space="preserve"> D10. Los anexos B a G de este entregable parten de ellos, pero se redactaron aparte y describen el prototipo en su estado final (acta D10).</w:t>
       </w:r>
     </w:p>
     <w:p>
@@ -11551,7 +11520,7 @@
       <w:pPr>
         <w:pStyle w:val="Ttulo1"/>
       </w:pPr>
-      <w:bookmarkStart w:id="12" w:name="_Toc242194829"/>
+      <w:bookmarkStart w:id="12" w:name="_Toc242198216"/>
       <w:r>
         <w:lastRenderedPageBreak/>
         <w:t>3. ARQUITECTURA E IMPLEMENTACIÓN BASE</w:t>
@@ -11580,7 +11549,7 @@
       <w:pPr>
         <w:pStyle w:val="Ttulo2"/>
       </w:pPr>
-      <w:bookmarkStart w:id="13" w:name="_Toc242194830"/>
+      <w:bookmarkStart w:id="13" w:name="_Toc242198217"/>
       <w:r>
         <w:t>3.1 Arquitectura implementada frente a la diseñada</w:t>
       </w:r>
@@ -12698,7 +12667,7 @@
       <w:pPr>
         <w:pStyle w:val="Ttulo2"/>
       </w:pPr>
-      <w:bookmarkStart w:id="14" w:name="_Toc242194831"/>
+      <w:bookmarkStart w:id="14" w:name="_Toc242198218"/>
       <w:r>
         <w:t>3.2 Módulos y dependencias</w:t>
       </w:r>
@@ -13701,7 +13670,7 @@
       <w:pPr>
         <w:pStyle w:val="Ttulo2"/>
       </w:pPr>
-      <w:bookmarkStart w:id="15" w:name="_Toc242194832"/>
+      <w:bookmarkStart w:id="15" w:name="_Toc242198219"/>
       <w:r>
         <w:t>3.3 Flujo de estados y escenas</w:t>
       </w:r>
@@ -16038,7 +16007,7 @@
       <w:pPr>
         <w:pStyle w:val="Ttulo2"/>
       </w:pPr>
-      <w:bookmarkStart w:id="16" w:name="_Toc242194833"/>
+      <w:bookmarkStart w:id="16" w:name="_Toc242198220"/>
       <w:r>
         <w:t>3.4 Contenido parametrizable</w:t>
       </w:r>
@@ -16969,7 +16938,7 @@
           <w:noProof/>
         </w:rPr>
         <w:drawing>
-          <wp:inline distT="0" distB="0" distL="0" distR="0" wp14:anchorId="091F21BE" wp14:editId="0A5E22E9">
+          <wp:inline distT="0" distB="0" distL="0" distR="0" wp14:anchorId="31160158" wp14:editId="343E4F22">
             <wp:extent cx="5759999" cy="3239999"/>
             <wp:effectExtent l="0" t="0" r="0" b="0"/>
             <wp:docPr id="10" name="Picture" descr="Figura 3.1. La escena Narrative reproduciendo la secuencia N1_AparicionGuia (escena 1.1 del guion): Algoritm, en su forma de fuego, se presenta a la familia en la cueva a oscuras, con la luz concentrada a su alrededor. La ilustración, la capa de oscuridad del Nivel 1, la posición y la animación de los personajes y la línea de diálogo («¡Hola, familia! No tengan miedo. Me llamo Algoritm, y vine a acompañarlos.») se leen del asset; el cuadro de diálogo muestra el retrato y el nombre de quien habla junto al botón «Continuar». La misma escena de Unity reproduce las dieciocho secuencias del juego."/>
@@ -17056,7 +17025,7 @@
       <w:pPr>
         <w:pStyle w:val="Ttulo2"/>
       </w:pPr>
-      <w:bookmarkStart w:id="17" w:name="_Toc242194834"/>
+      <w:bookmarkStart w:id="17" w:name="_Toc242198221"/>
       <w:r>
         <w:t>3.5 Persistencia de perfiles y privacidad</w:t>
       </w:r>
@@ -17748,7 +17717,7 @@
       <w:pPr>
         <w:pStyle w:val="Ttulo2"/>
       </w:pPr>
-      <w:bookmarkStart w:id="18" w:name="_Toc242194835"/>
+      <w:bookmarkStart w:id="18" w:name="_Toc242198222"/>
       <w:r>
         <w:t>3.6 Distribución portable</w:t>
       </w:r>
@@ -18144,7 +18113,7 @@
       <w:pPr>
         <w:pStyle w:val="Ttulo1"/>
       </w:pPr>
-      <w:bookmarkStart w:id="19" w:name="_Toc242194836"/>
+      <w:bookmarkStart w:id="19" w:name="_Toc242198223"/>
       <w:r>
         <w:lastRenderedPageBreak/>
         <w:t>4. NIVELES Y DESAFÍOS PROGRESIVOS</w:t>
@@ -18234,7 +18203,7 @@
       <w:pPr>
         <w:pStyle w:val="Ttulo2"/>
       </w:pPr>
-      <w:bookmarkStart w:id="20" w:name="_Toc242194837"/>
+      <w:bookmarkStart w:id="20" w:name="_Toc242198224"/>
       <w:r>
         <w:t>4.1 Progresión del pensamiento computacional entre niveles</w:t>
       </w:r>
@@ -18579,7 +18548,7 @@
       <w:pPr>
         <w:pStyle w:val="Ttulo2"/>
       </w:pPr>
-      <w:bookmarkStart w:id="21" w:name="_Toc242194838"/>
+      <w:bookmarkStart w:id="21" w:name="_Toc242198225"/>
       <w:r>
         <w:t>4.2 Nivel 1 — La Oscuridad</w:t>
       </w:r>
@@ -19805,7 +19774,7 @@
           <w:noProof/>
         </w:rPr>
         <w:drawing>
-          <wp:inline distT="0" distB="0" distL="0" distR="0" wp14:anchorId="586DF08D" wp14:editId="0CB23C00">
+          <wp:inline distT="0" distB="0" distL="0" distR="0" wp14:anchorId="556E8DBD" wp14:editId="0D4062F4">
             <wp:extent cx="5759999" cy="3239999"/>
             <wp:effectExtent l="0" t="0" r="0" b="0"/>
             <wp:docPr id="13" name="Picture" descr="Figura 4.1. Inicio de la fase jugable del Nivel 1: las hojas, el sílex y el pedernal están regados por la cueva vista desde arriba, con Papá a un lado del círculo de luz central y el resto de la familia al otro; la tablilla superior pide «Reúne todas las hojas y las dos piedras en el centro de la pantalla.» y el botón de ayuda, arriba a la izquierda, lleva la figura de fuego de Algoritm."/>
@@ -19902,7 +19871,7 @@
           <w:noProof/>
         </w:rPr>
         <w:drawing>
-          <wp:inline distT="0" distB="0" distL="0" distR="0" wp14:anchorId="2CB47942" wp14:editId="229CA7BA">
+          <wp:inline distT="0" distB="0" distL="0" distR="0" wp14:anchorId="7A20F591" wp14:editId="5D79AE17">
             <wp:extent cx="5759999" cy="3239999"/>
             <wp:effectExtent l="0" t="0" r="0" b="0"/>
             <wp:docPr id="16" name="Picture" descr="Figura 4.2. Interfaz de encendido del Nivel 1 tras el primer golpe efectivo, antes de la convergencia: los deslizantes de fuerza (vertical, de «Suave» a «Fuerte») y de cercanía (horizontal, de «Lejos» a «Cerca») representan la hipótesis, las piedras se ven sobre el montón de hojas y la tablilla describe lo ocurrido («Una chispa cae dentro de las hojas. Brilla un instante y se apaga.»). «Golpear» pone a prueba la hipótesis y «Soplar» sigue atenuado y con candado, un doble indicador que no depende solo del color."/>
@@ -20083,7 +20052,7 @@
         </w:rPr>
         <w:lastRenderedPageBreak/>
         <w:drawing>
-          <wp:inline distT="0" distB="0" distL="0" distR="0" wp14:anchorId="6EDB60BC" wp14:editId="711B0827">
+          <wp:inline distT="0" distB="0" distL="0" distR="0" wp14:anchorId="20189049" wp14:editId="6963F185">
             <wp:extent cx="5759999" cy="3239999"/>
             <wp:effectExtent l="0" t="0" r="0" b="0"/>
             <wp:docPr id="19" name="Picture" descr="Figura 4.3. Cierre reflexivo del Nivel 1 (N1_NacimientoDelFuego): Algoritm, en su forma de fuego, sobre las brasas de la hoguera recién encendida, de la que sube humo, nombra la iteración ante la familia reunida («Eso tiene nombre: se llama iterar. Probar, mirar el resultado y ajustar.»)."/>
@@ -21128,7 +21097,7 @@
       <w:pPr>
         <w:pStyle w:val="Ttulo2"/>
       </w:pPr>
-      <w:bookmarkStart w:id="22" w:name="_Toc242194839"/>
+      <w:bookmarkStart w:id="22" w:name="_Toc242198226"/>
       <w:r>
         <w:t>4.3 Nivel 2 — La Rueda</w:t>
       </w:r>
@@ -23310,7 +23279,7 @@
         </w:rPr>
         <w:lastRenderedPageBreak/>
         <w:drawing>
-          <wp:inline distT="0" distB="0" distL="0" distR="0" wp14:anchorId="3514A3C0" wp14:editId="73DABFA8">
+          <wp:inline distT="0" distB="0" distL="0" distR="0" wp14:anchorId="3A357394" wp14:editId="2F9FBCB3">
             <wp:extent cx="5759999" cy="3239999"/>
             <wp:effectExtent l="0" t="0" r="0" b="0"/>
             <wp:docPr id="22" name="Picture" descr="Figura 4.4. Fase 1 del Nivel 2 tras seleccionar una piedra: el mensaje describe por qué no sirve («Esta piedra tiene esquinas. Cuando la empujas, se traba.»), con icono de alerta además de color; la piedra sigue en su sitio, el acopio conserva el tronco ya reunido («Troncos redondos: 1 de 5») y la Niña, junto a la caja, anima. Abajo a la derecha, el botón de ayuda con Algoritm en su forma de rueda."/>
@@ -23404,7 +23373,7 @@
         </w:rPr>
         <w:lastRenderedPageBreak/>
         <w:drawing>
-          <wp:inline distT="0" distB="0" distL="0" distR="0" wp14:anchorId="29F7981A" wp14:editId="1A92F1E4">
+          <wp:inline distT="0" distB="0" distL="0" distR="0" wp14:anchorId="1E16E0E4" wp14:editId="6EBE57B4">
             <wp:extent cx="5759999" cy="3239999"/>
             <wp:effectExtent l="0" t="0" r="0" b="0"/>
             <wp:docPr id="25" name="Picture" descr="Figura 4.5. Escena narrativa 2.2 («El patrón»): la caja llena que dejó la fase del bosque, con el mismo tamaño que tenía allí, junto a los troncos alineados, y Algoritm, en su forma de rueda, nombrando el patrón que el estudiante acaba de usar en la fase 1 («Acabas de encontrar un patrón.»)."/>
@@ -24195,7 +24164,7 @@
           <w:noProof/>
         </w:rPr>
         <w:drawing>
-          <wp:inline distT="0" distB="0" distL="0" distR="0" wp14:anchorId="12568682" wp14:editId="1C72D211">
+          <wp:inline distT="0" distB="0" distL="0" distR="0" wp14:anchorId="17377C2B" wp14:editId="46A34720">
             <wp:extent cx="5759999" cy="3239999"/>
             <wp:effectExtent l="0" t="0" r="0" b="0"/>
             <wp:docPr id="28" name="Picture" descr="Figura 4.6. Fase 2 del Nivel 2 tras intentar colocar la tabla antes del eje: la tabla vuelve a su sitio en la fila de piezas, el mensaje indica qué falta («La tabla no tiene sobre qué apoyarse todavía.») y la rueda ya perforada se conserva; «Mecanizar» aparece atenuado, con el candado y el rótulo «Aún no», porque no hay tronco resaltado."/>
@@ -24682,7 +24651,7 @@
           <w:noProof/>
         </w:rPr>
         <w:drawing>
-          <wp:inline distT="0" distB="0" distL="0" distR="0" wp14:anchorId="7BF1896C" wp14:editId="7C31FDB9">
+          <wp:inline distT="0" distB="0" distL="0" distR="0" wp14:anchorId="00EC77BC" wp14:editId="0ABA2A5C">
             <wp:extent cx="5759999" cy="3239999"/>
             <wp:effectExtent l="0" t="0" r="0" b="0"/>
             <wp:docPr id="31" name="Picture" descr="Figura 4.7. Fase 3 del Nivel 2 al atardecer: el laberinto en vista superior con su cuadrícula, la carretilla en la salida, con la Niña a su lado, y el resto de la familia en el refugio del extremo opuesto; a la derecha, la secuencia con un bloque «Girar» cuyo lado elegido, la izquierda, va en color de atención y con contorno, y el cajón «Bloques» abierto con «Avanzar», «Girar» y «Retroceder», cada uno con su silueta. Arriba, la tablilla mantiene el aviso que pide añadir al menos un bloque antes de ejecutar."/>
@@ -24785,7 +24754,7 @@
       <w:pPr>
         <w:pStyle w:val="Ttulo2"/>
       </w:pPr>
-      <w:bookmarkStart w:id="23" w:name="_Toc242194840"/>
+      <w:bookmarkStart w:id="23" w:name="_Toc242198227"/>
       <w:r>
         <w:t>4.4 Nivel 3 — El Río</w:t>
       </w:r>
@@ -25259,7 +25228,7 @@
         </w:rPr>
         <w:lastRenderedPageBreak/>
         <w:drawing>
-          <wp:inline distT="0" distB="0" distL="0" distR="0" wp14:anchorId="24DFAE66" wp14:editId="34325333">
+          <wp:inline distT="0" distB="0" distL="0" distR="0" wp14:anchorId="22F7D4B4" wp14:editId="18A7D519">
             <wp:extent cx="5759999" cy="3239999"/>
             <wp:effectExtent l="0" t="0" r="0" b="0"/>
             <wp:docPr id="34" name="Picture" descr="Figura 4.8. Recolección en el Nivel 3: la orilla encuadrada a ×1,4, con la familia y los materiales (cinco troncos, las sogas, la tela y el mástil) a la escala de las narrativas. Arriba, la lista de cuatro tareas, todas pendientes, y la tablilla con la consigna («Recorre la orilla y recoge lo que la balsa necesita. La lista te dice qué falta.»); abajo, el inventario de cuatro casillas y la cruceta de dirección; en el centro, el anillo de la zona de construcción, y a la derecha, el río al pie de la cascada."/>
@@ -25426,7 +25395,7 @@
         </w:rPr>
         <w:lastRenderedPageBreak/>
         <w:drawing>
-          <wp:inline distT="0" distB="0" distL="0" distR="0" wp14:anchorId="09AEA4B2" wp14:editId="0BF0F9FD">
+          <wp:inline distT="0" distB="0" distL="0" distR="0" wp14:anchorId="79A6D7CA" wp14:editId="10B14F51">
             <wp:extent cx="5759999" cy="3239999"/>
             <wp:effectExtent l="0" t="0" r="0" b="0"/>
             <wp:docPr id="37" name="Picture" descr="Figura 4.9. Fase de base rechazada: el mástil se había colocado en uno de los espacios de los troncos. Al pulsar «Listo», ese espacio queda señalado con color e icono de alerta, el mástil vuelve a su casilla del inventario, los cuatro troncos bien puestos permanecen y el mensaje dice «Algo de esta parte no encaja. Mira lo marcado: ¿esa pieza va ahí?»; debajo de la balsa, «Listo» y «Probar balsa» aparecen uno junto al otro, y la lista tiene marcadas las dos tareas de recolección."/>
@@ -25555,7 +25524,7 @@
           <w:noProof/>
         </w:rPr>
         <w:drawing>
-          <wp:inline distT="0" distB="0" distL="0" distR="0" wp14:anchorId="36B310AA" wp14:editId="0E93149D">
+          <wp:inline distT="0" distB="0" distL="0" distR="0" wp14:anchorId="7D3C9A15" wp14:editId="18F018A8">
             <wp:extent cx="5759999" cy="3239999"/>
             <wp:effectExtent l="0" t="0" r="0" b="0"/>
             <wp:docPr id="40" name="Picture" descr="Figura 4.10. Prueba de la balsa fallida con el mástil y la vela intercambiados: la base y el amarre, ya aprobados, siguen en su sitio; los dos espacios aparecen señalados con color e icono de alerta, las dos piezas volvieron al inventario y el mensaje indica qué revisar («La balsa se volteó. Mira el espacio marcado: ¿qué debería ir ahí?»). Debajo queda solo «Probar balsa», y la lista conserva marcadas las tres primeras tareas."/>
@@ -25641,7 +25610,7 @@
           <w:noProof/>
         </w:rPr>
         <w:drawing>
-          <wp:inline distT="0" distB="0" distL="0" distR="0" wp14:anchorId="3B8A901F" wp14:editId="4DC7BADF">
+          <wp:inline distT="0" distB="0" distL="0" distR="0" wp14:anchorId="4DEEB6C7" wp14:editId="59E6D0A6">
             <wp:extent cx="5759999" cy="3239999"/>
             <wp:effectExtent l="0" t="0" r="0" b="0"/>
             <wp:docPr id="43" name="Picture" descr="Figura 4.11. Escena 3.2, que solo aparece tras el primer fallo de la balsa terminada: la balsa hundida por un costado junto a la orilla, la familia en el agua y Algoritm, en su forma de gota, nombrando la depuración con una pregunta en lugar de dar la respuesta («No pasa nada. Esto se llama depurar. No hay que hacer todo otra vez: hay que encontrar la parte que falló. ¿Qué salió mal?»)."/>
@@ -25712,7 +25681,7 @@
       <w:pPr>
         <w:pStyle w:val="Ttulo2"/>
       </w:pPr>
-      <w:bookmarkStart w:id="24" w:name="_Toc242194841"/>
+      <w:bookmarkStart w:id="24" w:name="_Toc242198228"/>
       <w:r>
         <w:t>4.5 Escenas narrativas y puentes</w:t>
       </w:r>
@@ -28006,7 +27975,7 @@
       <w:pPr>
         <w:pStyle w:val="Ttulo2"/>
       </w:pPr>
-      <w:bookmarkStart w:id="25" w:name="_Toc242194842"/>
+      <w:bookmarkStart w:id="25" w:name="_Toc242198229"/>
       <w:r>
         <w:lastRenderedPageBreak/>
         <w:t>4.6 Síntesis de la progresión de dificultad</w:t>
@@ -28788,7 +28757,7 @@
       <w:pPr>
         <w:pStyle w:val="Ttulo1"/>
       </w:pPr>
-      <w:bookmarkStart w:id="26" w:name="_Toc242194843"/>
+      <w:bookmarkStart w:id="26" w:name="_Toc242198230"/>
       <w:r>
         <w:lastRenderedPageBreak/>
         <w:t>5. MECÁNICAS IMPLEMENTADAS</w:t>
@@ -28810,7 +28779,7 @@
       <w:pPr>
         <w:pStyle w:val="Ttulo2"/>
       </w:pPr>
-      <w:bookmarkStart w:id="27" w:name="_Toc242194844"/>
+      <w:bookmarkStart w:id="27" w:name="_Toc242198231"/>
       <w:r>
         <w:t>5.1 Mecánicas planeadas y mecánicas implementadas</w:t>
       </w:r>
@@ -30548,7 +30517,7 @@
       <w:pPr>
         <w:pStyle w:val="Ttulo2"/>
       </w:pPr>
-      <w:bookmarkStart w:id="28" w:name="_Toc242194845"/>
+      <w:bookmarkStart w:id="28" w:name="_Toc242198232"/>
       <w:r>
         <w:t>5.2 Formas de interacción y control</w:t>
       </w:r>
@@ -31169,7 +31138,7 @@
       <w:pPr>
         <w:pStyle w:val="Ttulo2"/>
       </w:pPr>
-      <w:bookmarkStart w:id="29" w:name="_Toc242194846"/>
+      <w:bookmarkStart w:id="29" w:name="_Toc242198233"/>
       <w:r>
         <w:t>5.3 Ajustes al diseño durante el desarrollo</w:t>
       </w:r>
@@ -33367,7 +33336,7 @@
       <w:pPr>
         <w:pStyle w:val="Ttulo1"/>
       </w:pPr>
-      <w:bookmarkStart w:id="30" w:name="_Toc242194847"/>
+      <w:bookmarkStart w:id="30" w:name="_Toc242198234"/>
       <w:r>
         <w:lastRenderedPageBreak/>
         <w:t>6. ANDAMIAJE PEDAGÓGICO, RETROALIMENTACIÓN Y REGISTRO</w:t>
@@ -33398,7 +33367,7 @@
       <w:pPr>
         <w:pStyle w:val="Ttulo2"/>
       </w:pPr>
-      <w:bookmarkStart w:id="31" w:name="_Toc242194848"/>
+      <w:bookmarkStart w:id="31" w:name="_Toc242198235"/>
       <w:r>
         <w:t>6.1 El guía Algoritm y las pistas</w:t>
       </w:r>
@@ -33816,7 +33785,7 @@
       <w:pPr>
         <w:pStyle w:val="Ttulo2"/>
       </w:pPr>
-      <w:bookmarkStart w:id="32" w:name="_Toc242194849"/>
+      <w:bookmarkStart w:id="32" w:name="_Toc242198236"/>
       <w:r>
         <w:t>6.2 Retroalimentación sin derrota ni puntajes</w:t>
       </w:r>
@@ -34419,7 +34388,7 @@
       <w:pPr>
         <w:pStyle w:val="Ttulo2"/>
       </w:pPr>
-      <w:bookmarkStart w:id="33" w:name="_Toc242194850"/>
+      <w:bookmarkStart w:id="33" w:name="_Toc242198237"/>
       <w:r>
         <w:t>6.3 Cierre reflexivo de cada nivel</w:t>
       </w:r>
@@ -34881,7 +34850,7 @@
       <w:pPr>
         <w:pStyle w:val="Ttulo2"/>
       </w:pPr>
-      <w:bookmarkStart w:id="34" w:name="_Toc242194851"/>
+      <w:bookmarkStart w:id="34" w:name="_Toc242198238"/>
       <w:r>
         <w:t>6.4 Progreso, indicadores de desempeño e informe docente</w:t>
       </w:r>
@@ -35461,7 +35430,7 @@
       <w:pPr>
         <w:pStyle w:val="Ttulo1"/>
       </w:pPr>
-      <w:bookmarkStart w:id="35" w:name="_Toc242194852"/>
+      <w:bookmarkStart w:id="35" w:name="_Toc242198239"/>
       <w:r>
         <w:lastRenderedPageBreak/>
         <w:t>7. INTERFAZ, ESCENARIOS Y ELEMENTOS AUDIOVISUALES</w:t>
@@ -35483,7 +35452,7 @@
       <w:pPr>
         <w:pStyle w:val="Ttulo2"/>
       </w:pPr>
-      <w:bookmarkStart w:id="36" w:name="_Toc242194853"/>
+      <w:bookmarkStart w:id="36" w:name="_Toc242198240"/>
       <w:r>
         <w:t>7.1 Pantallas del flujo</w:t>
       </w:r>
@@ -36520,7 +36489,7 @@
         </w:rPr>
         <w:lastRenderedPageBreak/>
         <w:drawing>
-          <wp:inline distT="0" distB="0" distL="0" distR="0" wp14:anchorId="0258CD0A" wp14:editId="23BEABD0">
+          <wp:inline distT="0" distB="0" distL="0" distR="0" wp14:anchorId="06DF60C7" wp14:editId="4290580F">
             <wp:extent cx="5759999" cy="3239999"/>
             <wp:effectExtent l="0" t="0" r="0" b="0"/>
             <wp:docPr id="46" name="Picture" descr="Figura 7.1. Pantalla de inicio: el título «Algoritmia» y el lema «Piensa el orden, enciende el fuego» sobre la tablilla marfil; debajo, el botón primario «Jugar», «Créditos» y «Salir» en una fila y «Progreso del equipo» en la siguiente, y a la derecha Algoritm en su forma de fuego. Los textos usan Baloo 2 y Nunito."/>
@@ -36615,7 +36584,7 @@
         </w:rPr>
         <w:lastRenderedPageBreak/>
         <w:drawing>
-          <wp:inline distT="0" distB="0" distL="0" distR="0" wp14:anchorId="64D2005D" wp14:editId="6764CA4C">
+          <wp:inline distT="0" distB="0" distL="0" distR="0" wp14:anchorId="368EFFE8" wp14:editId="26FC338F">
             <wp:extent cx="5759999" cy="3239999"/>
             <wp:effectExtent l="0" t="0" r="0" b="0"/>
             <wp:docPr id="49" name="Picture" descr="Figura 7.2. Menú de niveles con sus tres estados: el Nivel 1 completado, con el visto y el rótulo «Completado»; el Nivel 2 disponible, y el Nivel 3 bloqueado, con el botón oscurecido, el candado y el rótulo «Bloqueado» (RF-03, RNF-19). Cada tarjeta muestra la ilustración de su nivel: la cueva, el laberinto y el río."/>
@@ -36736,7 +36705,7 @@
       <w:pPr>
         <w:pStyle w:val="Ttulo2"/>
       </w:pPr>
-      <w:bookmarkStart w:id="37" w:name="_Toc242194854"/>
+      <w:bookmarkStart w:id="37" w:name="_Toc242198241"/>
       <w:r>
         <w:t>7.2 Escenarios, personajes y animación</w:t>
       </w:r>
@@ -37258,7 +37227,7 @@
         </w:rPr>
         <w:lastRenderedPageBreak/>
         <w:drawing>
-          <wp:inline distT="0" distB="0" distL="0" distR="0" wp14:anchorId="20B1AFA3" wp14:editId="5BABB483">
+          <wp:inline distT="0" distB="0" distL="0" distR="0" wp14:anchorId="3452CB58" wp14:editId="674FB300">
             <wp:extent cx="5759999" cy="3239999"/>
             <wp:effectExtent l="0" t="0" r="0" b="0"/>
             <wp:docPr id="52" name="Picture" descr="Figura 7.3. Escena final del juego: la familia, ya en el poblado al atardecer, entre las chozas, con Algoritm en su forma de gota en el aire, sobre Papá y Mamá; a la derecha del Niño arden las fogatas, de las que sube humo. El cuadro de diálogo muestra el retrato y el nombre de Algoritm, que dice «En el bosque miraste muchas cosas y encontraste lo que tenían en común.» (recorte de la captura a pantalla completa)."/>
@@ -37358,7 +37327,7 @@
       <w:pPr>
         <w:pStyle w:val="Ttulo2"/>
       </w:pPr>
-      <w:bookmarkStart w:id="38" w:name="_Toc242194855"/>
+      <w:bookmarkStart w:id="38" w:name="_Toc242198242"/>
       <w:r>
         <w:t>7.3 Sonido</w:t>
       </w:r>
@@ -37953,7 +37922,7 @@
       <w:pPr>
         <w:pStyle w:val="Ttulo2"/>
       </w:pPr>
-      <w:bookmarkStart w:id="39" w:name="_Toc242194856"/>
+      <w:bookmarkStart w:id="39" w:name="_Toc242198243"/>
       <w:r>
         <w:t>7.4 Accesibilidad</w:t>
       </w:r>
@@ -38590,7 +38559,7 @@
         </w:rPr>
         <w:lastRenderedPageBreak/>
         <w:drawing>
-          <wp:inline distT="0" distB="0" distL="0" distR="0" wp14:anchorId="6538FD8C" wp14:editId="5663DCA5">
+          <wp:inline distT="0" distB="0" distL="0" distR="0" wp14:anchorId="77930480" wp14:editId="5E20AC37">
             <wp:extent cx="5759999" cy="3239999"/>
             <wp:effectExtent l="0" t="0" r="0" b="0"/>
             <wp:docPr id="55" name="Picture" descr="Figura 7.4. Orilla del Nivel 3 en escala de grises, con los materiales ya reunidos: sin color, las dos tareas hechas se distinguen de las pendientes por el visto dentro del círculo, y el mensaje («Ya tienes todos los materiales. Ve a la zona marcada junto al agua.») lleva su propio icono. Abajo a la derecha, la cruceta de botones de dirección en pantalla que sustituye al teclado (RNF-02, INC-01)."/>
@@ -38763,7 +38732,7 @@
       <w:pPr>
         <w:pStyle w:val="Ttulo1"/>
       </w:pPr>
-      <w:bookmarkStart w:id="40" w:name="_Toc242194857"/>
+      <w:bookmarkStart w:id="40" w:name="_Toc242198244"/>
       <w:r>
         <w:lastRenderedPageBreak/>
         <w:t>8. RENDIMIENTO Y OPTIMIZACIÓN</w:t>
@@ -38795,7 +38764,7 @@
       <w:pPr>
         <w:pStyle w:val="Ttulo2"/>
       </w:pPr>
-      <w:bookmarkStart w:id="41" w:name="_Toc242194858"/>
+      <w:bookmarkStart w:id="41" w:name="_Toc242198245"/>
       <w:r>
         <w:t>8.1 Presupuestos de rendimiento y mediciones</w:t>
       </w:r>
@@ -41094,7 +41063,7 @@
       <w:pPr>
         <w:pStyle w:val="Ttulo2"/>
       </w:pPr>
-      <w:bookmarkStart w:id="42" w:name="_Toc242194859"/>
+      <w:bookmarkStart w:id="42" w:name="_Toc242198246"/>
       <w:r>
         <w:t>8.2 Optimizaciones aplicadas</w:t>
       </w:r>
@@ -41317,7 +41286,7 @@
       <w:pPr>
         <w:pStyle w:val="Ttulo2"/>
       </w:pPr>
-      <w:bookmarkStart w:id="43" w:name="_Toc242194860"/>
+      <w:bookmarkStart w:id="43" w:name="_Toc242198247"/>
       <w:r>
         <w:t>8.3 Mediciones sobre el ejecutable</w:t>
       </w:r>
@@ -43112,7 +43081,7 @@
       <w:pPr>
         <w:pStyle w:val="Ttulo1"/>
       </w:pPr>
-      <w:bookmarkStart w:id="44" w:name="_Toc242194861"/>
+      <w:bookmarkStart w:id="44" w:name="_Toc242198248"/>
       <w:r>
         <w:lastRenderedPageBreak/>
         <w:t>9. VERIFICACIÓN DEL PROTOTIPO</w:t>
@@ -43134,7 +43103,7 @@
       <w:pPr>
         <w:pStyle w:val="Ttulo2"/>
       </w:pPr>
-      <w:bookmarkStart w:id="45" w:name="_Toc242194862"/>
+      <w:bookmarkStart w:id="45" w:name="_Toc242198249"/>
       <w:r>
         <w:t>9.1 Estrategia de pruebas</w:t>
       </w:r>
@@ -46797,7 +46766,7 @@
       <w:pPr>
         <w:pStyle w:val="Ttulo2"/>
       </w:pPr>
-      <w:bookmarkStart w:id="46" w:name="_Toc242194863"/>
+      <w:bookmarkStart w:id="46" w:name="_Toc242198250"/>
       <w:r>
         <w:t>9.2 Golden Path</w:t>
       </w:r>
@@ -47133,7 +47102,7 @@
       <w:pPr>
         <w:pStyle w:val="Ttulo2"/>
       </w:pPr>
-      <w:bookmarkStart w:id="47" w:name="_Toc242194864"/>
+      <w:bookmarkStart w:id="47" w:name="_Toc242198251"/>
       <w:r>
         <w:t>9.3 Resultado de la suite completa (01/10/2026)</w:t>
       </w:r>
@@ -47808,7 +47777,7 @@
       <w:pPr>
         <w:pStyle w:val="Ttulo2"/>
       </w:pPr>
-      <w:bookmarkStart w:id="48" w:name="_Toc242194865"/>
+      <w:bookmarkStart w:id="48" w:name="_Toc242198252"/>
       <w:r>
         <w:t>9.4 Trazabilidad de requerimientos a pruebas</w:t>
       </w:r>
@@ -48771,7 +48740,7 @@
       <w:pPr>
         <w:pStyle w:val="Ttulo2"/>
       </w:pPr>
-      <w:bookmarkStart w:id="49" w:name="_Toc242194866"/>
+      <w:bookmarkStart w:id="49" w:name="_Toc242198253"/>
       <w:r>
         <w:t>9.5 Verificación sobre el ejecutable</w:t>
       </w:r>
@@ -51268,7 +51237,7 @@
       <w:pPr>
         <w:pStyle w:val="Ttulo1"/>
       </w:pPr>
-      <w:bookmarkStart w:id="50" w:name="_Toc242194867"/>
+      <w:bookmarkStart w:id="50" w:name="_Toc242198254"/>
       <w:r>
         <w:lastRenderedPageBreak/>
         <w:t>10. LIMITACIONES Y TRABAJO PENDIENTE</w:t>
@@ -51290,7 +51259,7 @@
       <w:pPr>
         <w:pStyle w:val="Ttulo2"/>
       </w:pPr>
-      <w:bookmarkStart w:id="51" w:name="_Toc242194868"/>
+      <w:bookmarkStart w:id="51" w:name="_Toc242198255"/>
       <w:r>
         <w:t>10.1 Consistencia documental y puntos abiertos</w:t>
       </w:r>
@@ -52115,7 +52084,7 @@
       <w:pPr>
         <w:pStyle w:val="Ttulo2"/>
       </w:pPr>
-      <w:bookmarkStart w:id="52" w:name="_Toc242194869"/>
+      <w:bookmarkStart w:id="52" w:name="_Toc242198256"/>
       <w:r>
         <w:t>10.2 Verificaciones que dependen de otro equipo</w:t>
       </w:r>
@@ -52241,7 +52210,7 @@
       <w:pPr>
         <w:pStyle w:val="Ttulo2"/>
       </w:pPr>
-      <w:bookmarkStart w:id="53" w:name="_Toc242194870"/>
+      <w:bookmarkStart w:id="53" w:name="_Toc242198257"/>
       <w:r>
         <w:t>10.3 Sonido y arte por incorporar</w:t>
       </w:r>
@@ -52546,7 +52515,7 @@
       <w:pPr>
         <w:pStyle w:val="Ttulo2"/>
       </w:pPr>
-      <w:bookmarkStart w:id="54" w:name="_Toc242194871"/>
+      <w:bookmarkStart w:id="54" w:name="_Toc242198258"/>
       <w:r>
         <w:t>10.4 Deuda técnica menor conocida</w:t>
       </w:r>
@@ -53089,7 +53058,7 @@
       <w:pPr>
         <w:pStyle w:val="Ttulo2"/>
       </w:pPr>
-      <w:bookmarkStart w:id="55" w:name="_Toc242194872"/>
+      <w:bookmarkStart w:id="55" w:name="_Toc242198259"/>
       <w:r>
         <w:lastRenderedPageBreak/>
         <w:t>10.5 Lo que pasa al objetivo específico 4</w:t>
@@ -53217,7 +53186,7 @@
       <w:pPr>
         <w:pStyle w:val="Ttulo1"/>
       </w:pPr>
-      <w:bookmarkStart w:id="56" w:name="_Toc242194873"/>
+      <w:bookmarkStart w:id="56" w:name="_Toc242198260"/>
       <w:r>
         <w:lastRenderedPageBreak/>
         <w:t>11. CONCLUSIONES</w:t>
@@ -53354,7 +53323,7 @@
       <w:pPr>
         <w:pStyle w:val="Ttulo1"/>
       </w:pPr>
-      <w:bookmarkStart w:id="57" w:name="_Toc242194874"/>
+      <w:bookmarkStart w:id="57" w:name="_Toc242198261"/>
       <w:r>
         <w:lastRenderedPageBreak/>
         <w:t>12. CONTROL DE CAMBIOS</w:t>
@@ -54282,7 +54251,7 @@
   <w:abstractNum w:abstractNumId="0" w15:restartNumberingAfterBreak="0">
     <w:nsid w:val="0000A990"/>
     <w:multiLevelType w:val="multilevel"/>
-    <w:tmpl w:val="0D8E7434"/>
+    <w:tmpl w:val="C7A8F40C"/>
     <w:lvl w:ilvl="0">
       <w:numFmt w:val="bullet"/>
       <w:lvlText w:val=" "/>
@@ -54359,7 +54328,7 @@
   <w:abstractNum w:abstractNumId="1" w15:restartNumberingAfterBreak="0">
     <w:nsid w:val="0000A991"/>
     <w:multiLevelType w:val="multilevel"/>
-    <w:tmpl w:val="FFFADA6E"/>
+    <w:tmpl w:val="471EAD00"/>
     <w:lvl w:ilvl="0">
       <w:numFmt w:val="bullet"/>
       <w:lvlText w:val=""/>
@@ -54659,64 +54628,64 @@
       </w:pPr>
     </w:lvl>
   </w:abstractNum>
-  <w:num w:numId="1" w16cid:durableId="490681555">
+  <w:num w:numId="1" w16cid:durableId="86080455">
     <w:abstractNumId w:val="2"/>
   </w:num>
-  <w:num w:numId="2" w16cid:durableId="126313770">
+  <w:num w:numId="2" w16cid:durableId="897085922">
     <w:abstractNumId w:val="3"/>
     <w:lvlOverride w:ilvl="0">
       <w:startOverride w:val="1"/>
     </w:lvlOverride>
   </w:num>
-  <w:num w:numId="3" w16cid:durableId="1199588368">
+  <w:num w:numId="3" w16cid:durableId="516122578">
     <w:abstractNumId w:val="0"/>
   </w:num>
-  <w:num w:numId="4" w16cid:durableId="812794545">
+  <w:num w:numId="4" w16cid:durableId="1552616775">
     <w:abstractNumId w:val="1"/>
   </w:num>
-  <w:num w:numId="5" w16cid:durableId="1326543829">
+  <w:num w:numId="5" w16cid:durableId="1211334367">
     <w:abstractNumId w:val="1"/>
   </w:num>
-  <w:num w:numId="6" w16cid:durableId="1236207243">
+  <w:num w:numId="6" w16cid:durableId="1412849560">
     <w:abstractNumId w:val="1"/>
   </w:num>
-  <w:num w:numId="7" w16cid:durableId="1601529899">
+  <w:num w:numId="7" w16cid:durableId="311057107">
     <w:abstractNumId w:val="1"/>
   </w:num>
-  <w:num w:numId="8" w16cid:durableId="1430858386">
+  <w:num w:numId="8" w16cid:durableId="159394183">
     <w:abstractNumId w:val="1"/>
   </w:num>
-  <w:num w:numId="9" w16cid:durableId="816149114">
+  <w:num w:numId="9" w16cid:durableId="622998481">
     <w:abstractNumId w:val="1"/>
   </w:num>
-  <w:num w:numId="10" w16cid:durableId="1682047779">
+  <w:num w:numId="10" w16cid:durableId="483861159">
     <w:abstractNumId w:val="1"/>
   </w:num>
-  <w:num w:numId="11" w16cid:durableId="839346655">
+  <w:num w:numId="11" w16cid:durableId="1228148761">
     <w:abstractNumId w:val="1"/>
   </w:num>
-  <w:num w:numId="12" w16cid:durableId="338119845">
+  <w:num w:numId="12" w16cid:durableId="1319458829">
     <w:abstractNumId w:val="1"/>
   </w:num>
-  <w:num w:numId="13" w16cid:durableId="875504367">
+  <w:num w:numId="13" w16cid:durableId="726952240">
     <w:abstractNumId w:val="1"/>
   </w:num>
-  <w:num w:numId="14" w16cid:durableId="1352026654">
+  <w:num w:numId="14" w16cid:durableId="1462767626">
     <w:abstractNumId w:val="1"/>
   </w:num>
-  <w:num w:numId="15" w16cid:durableId="629212610">
+  <w:num w:numId="15" w16cid:durableId="666397257">
     <w:abstractNumId w:val="1"/>
   </w:num>
-  <w:num w:numId="16" w16cid:durableId="1033269739">
+  <w:num w:numId="16" w16cid:durableId="876963519">
     <w:abstractNumId w:val="1"/>
   </w:num>
-  <w:num w:numId="17" w16cid:durableId="877549189">
+  <w:num w:numId="17" w16cid:durableId="84108850">
     <w:abstractNumId w:val="1"/>
   </w:num>
-  <w:num w:numId="18" w16cid:durableId="130052580">
+  <w:num w:numId="18" w16cid:durableId="111411836">
     <w:abstractNumId w:val="1"/>
   </w:num>
-  <w:num w:numId="19" w16cid:durableId="859046467">
+  <w:num w:numId="19" w16cid:durableId="297608754">
     <w:abstractNumId w:val="1"/>
   </w:num>
 </w:numbering>
@@ -55522,7 +55491,7 @@
     <w:link w:val="EncabezadoCar"/>
     <w:uiPriority w:val="99"/>
     <w:unhideWhenUsed/>
-    <w:rsid w:val="009C546C"/>
+    <w:rsid w:val="00455F36"/>
     <w:pPr>
       <w:tabs>
         <w:tab w:val="center" w:pos="4419"/>
@@ -55536,7 +55505,7 @@
     <w:basedOn w:val="Fuentedeprrafopredeter"/>
     <w:link w:val="Encabezado"/>
     <w:uiPriority w:val="99"/>
-    <w:rsid w:val="009C546C"/>
+    <w:rsid w:val="00455F36"/>
   </w:style>
   <w:style w:type="paragraph" w:styleId="Piedepgina">
     <w:name w:val="footer"/>
@@ -55544,7 +55513,7 @@
     <w:link w:val="PiedepginaCar"/>
     <w:uiPriority w:val="99"/>
     <w:unhideWhenUsed/>
-    <w:rsid w:val="009C546C"/>
+    <w:rsid w:val="00455F36"/>
     <w:pPr>
       <w:tabs>
         <w:tab w:val="center" w:pos="4419"/>
@@ -55558,7 +55527,7 @@
     <w:basedOn w:val="Fuentedeprrafopredeter"/>
     <w:link w:val="Piedepgina"/>
     <w:uiPriority w:val="99"/>
-    <w:rsid w:val="009C546C"/>
+    <w:rsid w:val="00455F36"/>
   </w:style>
   <w:style w:type="character" w:styleId="Nmerodepgina">
     <w:name w:val="page number"/>
@@ -55566,7 +55535,7 @@
     <w:uiPriority w:val="99"/>
     <w:semiHidden/>
     <w:unhideWhenUsed/>
-    <w:rsid w:val="009C546C"/>
+    <w:rsid w:val="00455F36"/>
   </w:style>
 </w:styles>
 </file>

</xml_diff>

<commit_message>
OE3 deliverable republished with the shoulder pivot and head gestures round
</commit_message>
<xml_diff>
--- a/docs/Solucion_OE3_Prototipo_funcional.docx
+++ b/docs/Solucion_OE3_Prototipo_funcional.docx
@@ -24,7 +24,7 @@
       <w:r>
         <w:fldChar w:fldCharType="separate"/>
       </w:r>
-      <w:hyperlink w:anchor="_Toc242198204" w:history="1">
+      <w:hyperlink w:anchor="_Toc242202591" w:history="1">
         <w:r>
           <w:rPr>
             <w:rStyle w:val="Hipervnculo"/>
@@ -51,7 +51,7 @@
             <w:noProof/>
             <w:webHidden/>
           </w:rPr>
-          <w:instrText xml:space="preserve"> PAGEREF _Toc242198204 \h </w:instrText>
+          <w:instrText xml:space="preserve"> PAGEREF _Toc242202591 \h </w:instrText>
         </w:r>
         <w:r>
           <w:rPr>
@@ -95,7 +95,7 @@
           <w14:ligatures w14:val="standardContextual"/>
         </w:rPr>
       </w:pPr>
-      <w:hyperlink w:anchor="_Toc242198205" w:history="1">
+      <w:hyperlink w:anchor="_Toc242202592" w:history="1">
         <w:r>
           <w:rPr>
             <w:rStyle w:val="Hipervnculo"/>
@@ -122,7 +122,7 @@
             <w:noProof/>
             <w:webHidden/>
           </w:rPr>
-          <w:instrText xml:space="preserve"> PAGEREF _Toc242198205 \h </w:instrText>
+          <w:instrText xml:space="preserve"> PAGEREF _Toc242202592 \h </w:instrText>
         </w:r>
         <w:r>
           <w:rPr>
@@ -166,7 +166,7 @@
           <w14:ligatures w14:val="standardContextual"/>
         </w:rPr>
       </w:pPr>
-      <w:hyperlink w:anchor="_Toc242198206" w:history="1">
+      <w:hyperlink w:anchor="_Toc242202593" w:history="1">
         <w:r>
           <w:rPr>
             <w:rStyle w:val="Hipervnculo"/>
@@ -193,7 +193,7 @@
             <w:noProof/>
             <w:webHidden/>
           </w:rPr>
-          <w:instrText xml:space="preserve"> PAGEREF _Toc242198206 \h </w:instrText>
+          <w:instrText xml:space="preserve"> PAGEREF _Toc242202593 \h </w:instrText>
         </w:r>
         <w:r>
           <w:rPr>
@@ -237,7 +237,7 @@
           <w14:ligatures w14:val="standardContextual"/>
         </w:rPr>
       </w:pPr>
-      <w:hyperlink w:anchor="_Toc242198207" w:history="1">
+      <w:hyperlink w:anchor="_Toc242202594" w:history="1">
         <w:r>
           <w:rPr>
             <w:rStyle w:val="Hipervnculo"/>
@@ -264,7 +264,7 @@
             <w:noProof/>
             <w:webHidden/>
           </w:rPr>
-          <w:instrText xml:space="preserve"> PAGEREF _Toc242198207 \h </w:instrText>
+          <w:instrText xml:space="preserve"> PAGEREF _Toc242202594 \h </w:instrText>
         </w:r>
         <w:r>
           <w:rPr>
@@ -308,7 +308,7 @@
           <w14:ligatures w14:val="standardContextual"/>
         </w:rPr>
       </w:pPr>
-      <w:hyperlink w:anchor="_Toc242198208" w:history="1">
+      <w:hyperlink w:anchor="_Toc242202595" w:history="1">
         <w:r>
           <w:rPr>
             <w:rStyle w:val="Hipervnculo"/>
@@ -335,7 +335,7 @@
             <w:noProof/>
             <w:webHidden/>
           </w:rPr>
-          <w:instrText xml:space="preserve"> PAGEREF _Toc242198208 \h </w:instrText>
+          <w:instrText xml:space="preserve"> PAGEREF _Toc242202595 \h </w:instrText>
         </w:r>
         <w:r>
           <w:rPr>
@@ -379,7 +379,7 @@
           <w14:ligatures w14:val="standardContextual"/>
         </w:rPr>
       </w:pPr>
-      <w:hyperlink w:anchor="_Toc242198209" w:history="1">
+      <w:hyperlink w:anchor="_Toc242202596" w:history="1">
         <w:r>
           <w:rPr>
             <w:rStyle w:val="Hipervnculo"/>
@@ -406,7 +406,7 @@
             <w:noProof/>
             <w:webHidden/>
           </w:rPr>
-          <w:instrText xml:space="preserve"> PAGEREF _Toc242198209 \h </w:instrText>
+          <w:instrText xml:space="preserve"> PAGEREF _Toc242202596 \h </w:instrText>
         </w:r>
         <w:r>
           <w:rPr>
@@ -450,7 +450,7 @@
           <w14:ligatures w14:val="standardContextual"/>
         </w:rPr>
       </w:pPr>
-      <w:hyperlink w:anchor="_Toc242198210" w:history="1">
+      <w:hyperlink w:anchor="_Toc242202597" w:history="1">
         <w:r>
           <w:rPr>
             <w:rStyle w:val="Hipervnculo"/>
@@ -477,7 +477,7 @@
             <w:noProof/>
             <w:webHidden/>
           </w:rPr>
-          <w:instrText xml:space="preserve"> PAGEREF _Toc242198210 \h </w:instrText>
+          <w:instrText xml:space="preserve"> PAGEREF _Toc242202597 \h </w:instrText>
         </w:r>
         <w:r>
           <w:rPr>
@@ -521,7 +521,7 @@
           <w14:ligatures w14:val="standardContextual"/>
         </w:rPr>
       </w:pPr>
-      <w:hyperlink w:anchor="_Toc242198211" w:history="1">
+      <w:hyperlink w:anchor="_Toc242202598" w:history="1">
         <w:r>
           <w:rPr>
             <w:rStyle w:val="Hipervnculo"/>
@@ -548,7 +548,7 @@
             <w:noProof/>
             <w:webHidden/>
           </w:rPr>
-          <w:instrText xml:space="preserve"> PAGEREF _Toc242198211 \h </w:instrText>
+          <w:instrText xml:space="preserve"> PAGEREF _Toc242202598 \h </w:instrText>
         </w:r>
         <w:r>
           <w:rPr>
@@ -592,7 +592,7 @@
           <w14:ligatures w14:val="standardContextual"/>
         </w:rPr>
       </w:pPr>
-      <w:hyperlink w:anchor="_Toc242198212" w:history="1">
+      <w:hyperlink w:anchor="_Toc242202599" w:history="1">
         <w:r>
           <w:rPr>
             <w:rStyle w:val="Hipervnculo"/>
@@ -619,7 +619,7 @@
             <w:noProof/>
             <w:webHidden/>
           </w:rPr>
-          <w:instrText xml:space="preserve"> PAGEREF _Toc242198212 \h </w:instrText>
+          <w:instrText xml:space="preserve"> PAGEREF _Toc242202599 \h </w:instrText>
         </w:r>
         <w:r>
           <w:rPr>
@@ -663,7 +663,7 @@
           <w14:ligatures w14:val="standardContextual"/>
         </w:rPr>
       </w:pPr>
-      <w:hyperlink w:anchor="_Toc242198213" w:history="1">
+      <w:hyperlink w:anchor="_Toc242202600" w:history="1">
         <w:r>
           <w:rPr>
             <w:rStyle w:val="Hipervnculo"/>
@@ -690,7 +690,7 @@
             <w:noProof/>
             <w:webHidden/>
           </w:rPr>
-          <w:instrText xml:space="preserve"> PAGEREF _Toc242198213 \h </w:instrText>
+          <w:instrText xml:space="preserve"> PAGEREF _Toc242202600 \h </w:instrText>
         </w:r>
         <w:r>
           <w:rPr>
@@ -734,7 +734,7 @@
           <w14:ligatures w14:val="standardContextual"/>
         </w:rPr>
       </w:pPr>
-      <w:hyperlink w:anchor="_Toc242198214" w:history="1">
+      <w:hyperlink w:anchor="_Toc242202601" w:history="1">
         <w:r>
           <w:rPr>
             <w:rStyle w:val="Hipervnculo"/>
@@ -761,7 +761,7 @@
             <w:noProof/>
             <w:webHidden/>
           </w:rPr>
-          <w:instrText xml:space="preserve"> PAGEREF _Toc242198214 \h </w:instrText>
+          <w:instrText xml:space="preserve"> PAGEREF _Toc242202601 \h </w:instrText>
         </w:r>
         <w:r>
           <w:rPr>
@@ -805,7 +805,7 @@
           <w14:ligatures w14:val="standardContextual"/>
         </w:rPr>
       </w:pPr>
-      <w:hyperlink w:anchor="_Toc242198215" w:history="1">
+      <w:hyperlink w:anchor="_Toc242202602" w:history="1">
         <w:r>
           <w:rPr>
             <w:rStyle w:val="Hipervnculo"/>
@@ -832,7 +832,7 @@
             <w:noProof/>
             <w:webHidden/>
           </w:rPr>
-          <w:instrText xml:space="preserve"> PAGEREF _Toc242198215 \h </w:instrText>
+          <w:instrText xml:space="preserve"> PAGEREF _Toc242202602 \h </w:instrText>
         </w:r>
         <w:r>
           <w:rPr>
@@ -876,7 +876,7 @@
           <w14:ligatures w14:val="standardContextual"/>
         </w:rPr>
       </w:pPr>
-      <w:hyperlink w:anchor="_Toc242198216" w:history="1">
+      <w:hyperlink w:anchor="_Toc242202603" w:history="1">
         <w:r>
           <w:rPr>
             <w:rStyle w:val="Hipervnculo"/>
@@ -903,7 +903,7 @@
             <w:noProof/>
             <w:webHidden/>
           </w:rPr>
-          <w:instrText xml:space="preserve"> PAGEREF _Toc242198216 \h </w:instrText>
+          <w:instrText xml:space="preserve"> PAGEREF _Toc242202603 \h </w:instrText>
         </w:r>
         <w:r>
           <w:rPr>
@@ -947,7 +947,7 @@
           <w14:ligatures w14:val="standardContextual"/>
         </w:rPr>
       </w:pPr>
-      <w:hyperlink w:anchor="_Toc242198217" w:history="1">
+      <w:hyperlink w:anchor="_Toc242202604" w:history="1">
         <w:r>
           <w:rPr>
             <w:rStyle w:val="Hipervnculo"/>
@@ -974,7 +974,7 @@
             <w:noProof/>
             <w:webHidden/>
           </w:rPr>
-          <w:instrText xml:space="preserve"> PAGEREF _Toc242198217 \h </w:instrText>
+          <w:instrText xml:space="preserve"> PAGEREF _Toc242202604 \h </w:instrText>
         </w:r>
         <w:r>
           <w:rPr>
@@ -1018,7 +1018,7 @@
           <w14:ligatures w14:val="standardContextual"/>
         </w:rPr>
       </w:pPr>
-      <w:hyperlink w:anchor="_Toc242198218" w:history="1">
+      <w:hyperlink w:anchor="_Toc242202605" w:history="1">
         <w:r>
           <w:rPr>
             <w:rStyle w:val="Hipervnculo"/>
@@ -1045,7 +1045,7 @@
             <w:noProof/>
             <w:webHidden/>
           </w:rPr>
-          <w:instrText xml:space="preserve"> PAGEREF _Toc242198218 \h </w:instrText>
+          <w:instrText xml:space="preserve"> PAGEREF _Toc242202605 \h </w:instrText>
         </w:r>
         <w:r>
           <w:rPr>
@@ -1089,7 +1089,7 @@
           <w14:ligatures w14:val="standardContextual"/>
         </w:rPr>
       </w:pPr>
-      <w:hyperlink w:anchor="_Toc242198219" w:history="1">
+      <w:hyperlink w:anchor="_Toc242202606" w:history="1">
         <w:r>
           <w:rPr>
             <w:rStyle w:val="Hipervnculo"/>
@@ -1116,7 +1116,7 @@
             <w:noProof/>
             <w:webHidden/>
           </w:rPr>
-          <w:instrText xml:space="preserve"> PAGEREF _Toc242198219 \h </w:instrText>
+          <w:instrText xml:space="preserve"> PAGEREF _Toc242202606 \h </w:instrText>
         </w:r>
         <w:r>
           <w:rPr>
@@ -1160,7 +1160,7 @@
           <w14:ligatures w14:val="standardContextual"/>
         </w:rPr>
       </w:pPr>
-      <w:hyperlink w:anchor="_Toc242198220" w:history="1">
+      <w:hyperlink w:anchor="_Toc242202607" w:history="1">
         <w:r>
           <w:rPr>
             <w:rStyle w:val="Hipervnculo"/>
@@ -1187,7 +1187,7 @@
             <w:noProof/>
             <w:webHidden/>
           </w:rPr>
-          <w:instrText xml:space="preserve"> PAGEREF _Toc242198220 \h </w:instrText>
+          <w:instrText xml:space="preserve"> PAGEREF _Toc242202607 \h </w:instrText>
         </w:r>
         <w:r>
           <w:rPr>
@@ -1231,7 +1231,7 @@
           <w14:ligatures w14:val="standardContextual"/>
         </w:rPr>
       </w:pPr>
-      <w:hyperlink w:anchor="_Toc242198221" w:history="1">
+      <w:hyperlink w:anchor="_Toc242202608" w:history="1">
         <w:r>
           <w:rPr>
             <w:rStyle w:val="Hipervnculo"/>
@@ -1258,7 +1258,7 @@
             <w:noProof/>
             <w:webHidden/>
           </w:rPr>
-          <w:instrText xml:space="preserve"> PAGEREF _Toc242198221 \h </w:instrText>
+          <w:instrText xml:space="preserve"> PAGEREF _Toc242202608 \h </w:instrText>
         </w:r>
         <w:r>
           <w:rPr>
@@ -1302,7 +1302,7 @@
           <w14:ligatures w14:val="standardContextual"/>
         </w:rPr>
       </w:pPr>
-      <w:hyperlink w:anchor="_Toc242198222" w:history="1">
+      <w:hyperlink w:anchor="_Toc242202609" w:history="1">
         <w:r>
           <w:rPr>
             <w:rStyle w:val="Hipervnculo"/>
@@ -1329,7 +1329,7 @@
             <w:noProof/>
             <w:webHidden/>
           </w:rPr>
-          <w:instrText xml:space="preserve"> PAGEREF _Toc242198222 \h </w:instrText>
+          <w:instrText xml:space="preserve"> PAGEREF _Toc242202609 \h </w:instrText>
         </w:r>
         <w:r>
           <w:rPr>
@@ -1373,7 +1373,7 @@
           <w14:ligatures w14:val="standardContextual"/>
         </w:rPr>
       </w:pPr>
-      <w:hyperlink w:anchor="_Toc242198223" w:history="1">
+      <w:hyperlink w:anchor="_Toc242202610" w:history="1">
         <w:r>
           <w:rPr>
             <w:rStyle w:val="Hipervnculo"/>
@@ -1400,7 +1400,7 @@
             <w:noProof/>
             <w:webHidden/>
           </w:rPr>
-          <w:instrText xml:space="preserve"> PAGEREF _Toc242198223 \h </w:instrText>
+          <w:instrText xml:space="preserve"> PAGEREF _Toc242202610 \h </w:instrText>
         </w:r>
         <w:r>
           <w:rPr>
@@ -1444,7 +1444,7 @@
           <w14:ligatures w14:val="standardContextual"/>
         </w:rPr>
       </w:pPr>
-      <w:hyperlink w:anchor="_Toc242198224" w:history="1">
+      <w:hyperlink w:anchor="_Toc242202611" w:history="1">
         <w:r>
           <w:rPr>
             <w:rStyle w:val="Hipervnculo"/>
@@ -1471,7 +1471,7 @@
             <w:noProof/>
             <w:webHidden/>
           </w:rPr>
-          <w:instrText xml:space="preserve"> PAGEREF _Toc242198224 \h </w:instrText>
+          <w:instrText xml:space="preserve"> PAGEREF _Toc242202611 \h </w:instrText>
         </w:r>
         <w:r>
           <w:rPr>
@@ -1515,7 +1515,7 @@
           <w14:ligatures w14:val="standardContextual"/>
         </w:rPr>
       </w:pPr>
-      <w:hyperlink w:anchor="_Toc242198225" w:history="1">
+      <w:hyperlink w:anchor="_Toc242202612" w:history="1">
         <w:r>
           <w:rPr>
             <w:rStyle w:val="Hipervnculo"/>
@@ -1542,7 +1542,7 @@
             <w:noProof/>
             <w:webHidden/>
           </w:rPr>
-          <w:instrText xml:space="preserve"> PAGEREF _Toc242198225 \h </w:instrText>
+          <w:instrText xml:space="preserve"> PAGEREF _Toc242202612 \h </w:instrText>
         </w:r>
         <w:r>
           <w:rPr>
@@ -1586,7 +1586,7 @@
           <w14:ligatures w14:val="standardContextual"/>
         </w:rPr>
       </w:pPr>
-      <w:hyperlink w:anchor="_Toc242198226" w:history="1">
+      <w:hyperlink w:anchor="_Toc242202613" w:history="1">
         <w:r>
           <w:rPr>
             <w:rStyle w:val="Hipervnculo"/>
@@ -1613,7 +1613,7 @@
             <w:noProof/>
             <w:webHidden/>
           </w:rPr>
-          <w:instrText xml:space="preserve"> PAGEREF _Toc242198226 \h </w:instrText>
+          <w:instrText xml:space="preserve"> PAGEREF _Toc242202613 \h </w:instrText>
         </w:r>
         <w:r>
           <w:rPr>
@@ -1657,7 +1657,7 @@
           <w14:ligatures w14:val="standardContextual"/>
         </w:rPr>
       </w:pPr>
-      <w:hyperlink w:anchor="_Toc242198227" w:history="1">
+      <w:hyperlink w:anchor="_Toc242202614" w:history="1">
         <w:r>
           <w:rPr>
             <w:rStyle w:val="Hipervnculo"/>
@@ -1684,7 +1684,7 @@
             <w:noProof/>
             <w:webHidden/>
           </w:rPr>
-          <w:instrText xml:space="preserve"> PAGEREF _Toc242198227 \h </w:instrText>
+          <w:instrText xml:space="preserve"> PAGEREF _Toc242202614 \h </w:instrText>
         </w:r>
         <w:r>
           <w:rPr>
@@ -1728,7 +1728,7 @@
           <w14:ligatures w14:val="standardContextual"/>
         </w:rPr>
       </w:pPr>
-      <w:hyperlink w:anchor="_Toc242198228" w:history="1">
+      <w:hyperlink w:anchor="_Toc242202615" w:history="1">
         <w:r>
           <w:rPr>
             <w:rStyle w:val="Hipervnculo"/>
@@ -1755,7 +1755,7 @@
             <w:noProof/>
             <w:webHidden/>
           </w:rPr>
-          <w:instrText xml:space="preserve"> PAGEREF _Toc242198228 \h </w:instrText>
+          <w:instrText xml:space="preserve"> PAGEREF _Toc242202615 \h </w:instrText>
         </w:r>
         <w:r>
           <w:rPr>
@@ -1799,7 +1799,7 @@
           <w14:ligatures w14:val="standardContextual"/>
         </w:rPr>
       </w:pPr>
-      <w:hyperlink w:anchor="_Toc242198229" w:history="1">
+      <w:hyperlink w:anchor="_Toc242202616" w:history="1">
         <w:r>
           <w:rPr>
             <w:rStyle w:val="Hipervnculo"/>
@@ -1826,7 +1826,7 @@
             <w:noProof/>
             <w:webHidden/>
           </w:rPr>
-          <w:instrText xml:space="preserve"> PAGEREF _Toc242198229 \h </w:instrText>
+          <w:instrText xml:space="preserve"> PAGEREF _Toc242202616 \h </w:instrText>
         </w:r>
         <w:r>
           <w:rPr>
@@ -1870,7 +1870,7 @@
           <w14:ligatures w14:val="standardContextual"/>
         </w:rPr>
       </w:pPr>
-      <w:hyperlink w:anchor="_Toc242198230" w:history="1">
+      <w:hyperlink w:anchor="_Toc242202617" w:history="1">
         <w:r>
           <w:rPr>
             <w:rStyle w:val="Hipervnculo"/>
@@ -1897,7 +1897,7 @@
             <w:noProof/>
             <w:webHidden/>
           </w:rPr>
-          <w:instrText xml:space="preserve"> PAGEREF _Toc242198230 \h </w:instrText>
+          <w:instrText xml:space="preserve"> PAGEREF _Toc242202617 \h </w:instrText>
         </w:r>
         <w:r>
           <w:rPr>
@@ -1941,7 +1941,7 @@
           <w14:ligatures w14:val="standardContextual"/>
         </w:rPr>
       </w:pPr>
-      <w:hyperlink w:anchor="_Toc242198231" w:history="1">
+      <w:hyperlink w:anchor="_Toc242202618" w:history="1">
         <w:r>
           <w:rPr>
             <w:rStyle w:val="Hipervnculo"/>
@@ -1968,7 +1968,7 @@
             <w:noProof/>
             <w:webHidden/>
           </w:rPr>
-          <w:instrText xml:space="preserve"> PAGEREF _Toc242198231 \h </w:instrText>
+          <w:instrText xml:space="preserve"> PAGEREF _Toc242202618 \h </w:instrText>
         </w:r>
         <w:r>
           <w:rPr>
@@ -2012,7 +2012,7 @@
           <w14:ligatures w14:val="standardContextual"/>
         </w:rPr>
       </w:pPr>
-      <w:hyperlink w:anchor="_Toc242198232" w:history="1">
+      <w:hyperlink w:anchor="_Toc242202619" w:history="1">
         <w:r>
           <w:rPr>
             <w:rStyle w:val="Hipervnculo"/>
@@ -2039,7 +2039,7 @@
             <w:noProof/>
             <w:webHidden/>
           </w:rPr>
-          <w:instrText xml:space="preserve"> PAGEREF _Toc242198232 \h </w:instrText>
+          <w:instrText xml:space="preserve"> PAGEREF _Toc242202619 \h </w:instrText>
         </w:r>
         <w:r>
           <w:rPr>
@@ -2083,7 +2083,7 @@
           <w14:ligatures w14:val="standardContextual"/>
         </w:rPr>
       </w:pPr>
-      <w:hyperlink w:anchor="_Toc242198233" w:history="1">
+      <w:hyperlink w:anchor="_Toc242202620" w:history="1">
         <w:r>
           <w:rPr>
             <w:rStyle w:val="Hipervnculo"/>
@@ -2110,7 +2110,7 @@
             <w:noProof/>
             <w:webHidden/>
           </w:rPr>
-          <w:instrText xml:space="preserve"> PAGEREF _Toc242198233 \h </w:instrText>
+          <w:instrText xml:space="preserve"> PAGEREF _Toc242202620 \h </w:instrText>
         </w:r>
         <w:r>
           <w:rPr>
@@ -2154,7 +2154,7 @@
           <w14:ligatures w14:val="standardContextual"/>
         </w:rPr>
       </w:pPr>
-      <w:hyperlink w:anchor="_Toc242198234" w:history="1">
+      <w:hyperlink w:anchor="_Toc242202621" w:history="1">
         <w:r>
           <w:rPr>
             <w:rStyle w:val="Hipervnculo"/>
@@ -2181,7 +2181,7 @@
             <w:noProof/>
             <w:webHidden/>
           </w:rPr>
-          <w:instrText xml:space="preserve"> PAGEREF _Toc242198234 \h </w:instrText>
+          <w:instrText xml:space="preserve"> PAGEREF _Toc242202621 \h </w:instrText>
         </w:r>
         <w:r>
           <w:rPr>
@@ -2225,7 +2225,7 @@
           <w14:ligatures w14:val="standardContextual"/>
         </w:rPr>
       </w:pPr>
-      <w:hyperlink w:anchor="_Toc242198235" w:history="1">
+      <w:hyperlink w:anchor="_Toc242202622" w:history="1">
         <w:r>
           <w:rPr>
             <w:rStyle w:val="Hipervnculo"/>
@@ -2252,7 +2252,7 @@
             <w:noProof/>
             <w:webHidden/>
           </w:rPr>
-          <w:instrText xml:space="preserve"> PAGEREF _Toc242198235 \h </w:instrText>
+          <w:instrText xml:space="preserve"> PAGEREF _Toc242202622 \h </w:instrText>
         </w:r>
         <w:r>
           <w:rPr>
@@ -2296,7 +2296,7 @@
           <w14:ligatures w14:val="standardContextual"/>
         </w:rPr>
       </w:pPr>
-      <w:hyperlink w:anchor="_Toc242198236" w:history="1">
+      <w:hyperlink w:anchor="_Toc242202623" w:history="1">
         <w:r>
           <w:rPr>
             <w:rStyle w:val="Hipervnculo"/>
@@ -2323,7 +2323,7 @@
             <w:noProof/>
             <w:webHidden/>
           </w:rPr>
-          <w:instrText xml:space="preserve"> PAGEREF _Toc242198236 \h </w:instrText>
+          <w:instrText xml:space="preserve"> PAGEREF _Toc242202623 \h </w:instrText>
         </w:r>
         <w:r>
           <w:rPr>
@@ -2367,7 +2367,7 @@
           <w14:ligatures w14:val="standardContextual"/>
         </w:rPr>
       </w:pPr>
-      <w:hyperlink w:anchor="_Toc242198237" w:history="1">
+      <w:hyperlink w:anchor="_Toc242202624" w:history="1">
         <w:r>
           <w:rPr>
             <w:rStyle w:val="Hipervnculo"/>
@@ -2394,7 +2394,7 @@
             <w:noProof/>
             <w:webHidden/>
           </w:rPr>
-          <w:instrText xml:space="preserve"> PAGEREF _Toc242198237 \h </w:instrText>
+          <w:instrText xml:space="preserve"> PAGEREF _Toc242202624 \h </w:instrText>
         </w:r>
         <w:r>
           <w:rPr>
@@ -2438,7 +2438,7 @@
           <w14:ligatures w14:val="standardContextual"/>
         </w:rPr>
       </w:pPr>
-      <w:hyperlink w:anchor="_Toc242198238" w:history="1">
+      <w:hyperlink w:anchor="_Toc242202625" w:history="1">
         <w:r>
           <w:rPr>
             <w:rStyle w:val="Hipervnculo"/>
@@ -2465,7 +2465,7 @@
             <w:noProof/>
             <w:webHidden/>
           </w:rPr>
-          <w:instrText xml:space="preserve"> PAGEREF _Toc242198238 \h </w:instrText>
+          <w:instrText xml:space="preserve"> PAGEREF _Toc242202625 \h </w:instrText>
         </w:r>
         <w:r>
           <w:rPr>
@@ -2509,7 +2509,7 @@
           <w14:ligatures w14:val="standardContextual"/>
         </w:rPr>
       </w:pPr>
-      <w:hyperlink w:anchor="_Toc242198239" w:history="1">
+      <w:hyperlink w:anchor="_Toc242202626" w:history="1">
         <w:r>
           <w:rPr>
             <w:rStyle w:val="Hipervnculo"/>
@@ -2536,7 +2536,7 @@
             <w:noProof/>
             <w:webHidden/>
           </w:rPr>
-          <w:instrText xml:space="preserve"> PAGEREF _Toc242198239 \h </w:instrText>
+          <w:instrText xml:space="preserve"> PAGEREF _Toc242202626 \h </w:instrText>
         </w:r>
         <w:r>
           <w:rPr>
@@ -2580,7 +2580,7 @@
           <w14:ligatures w14:val="standardContextual"/>
         </w:rPr>
       </w:pPr>
-      <w:hyperlink w:anchor="_Toc242198240" w:history="1">
+      <w:hyperlink w:anchor="_Toc242202627" w:history="1">
         <w:r>
           <w:rPr>
             <w:rStyle w:val="Hipervnculo"/>
@@ -2607,7 +2607,7 @@
             <w:noProof/>
             <w:webHidden/>
           </w:rPr>
-          <w:instrText xml:space="preserve"> PAGEREF _Toc242198240 \h </w:instrText>
+          <w:instrText xml:space="preserve"> PAGEREF _Toc242202627 \h </w:instrText>
         </w:r>
         <w:r>
           <w:rPr>
@@ -2651,7 +2651,7 @@
           <w14:ligatures w14:val="standardContextual"/>
         </w:rPr>
       </w:pPr>
-      <w:hyperlink w:anchor="_Toc242198241" w:history="1">
+      <w:hyperlink w:anchor="_Toc242202628" w:history="1">
         <w:r>
           <w:rPr>
             <w:rStyle w:val="Hipervnculo"/>
@@ -2678,7 +2678,7 @@
             <w:noProof/>
             <w:webHidden/>
           </w:rPr>
-          <w:instrText xml:space="preserve"> PAGEREF _Toc242198241 \h </w:instrText>
+          <w:instrText xml:space="preserve"> PAGEREF _Toc242202628 \h </w:instrText>
         </w:r>
         <w:r>
           <w:rPr>
@@ -2722,7 +2722,7 @@
           <w14:ligatures w14:val="standardContextual"/>
         </w:rPr>
       </w:pPr>
-      <w:hyperlink w:anchor="_Toc242198242" w:history="1">
+      <w:hyperlink w:anchor="_Toc242202629" w:history="1">
         <w:r>
           <w:rPr>
             <w:rStyle w:val="Hipervnculo"/>
@@ -2749,7 +2749,7 @@
             <w:noProof/>
             <w:webHidden/>
           </w:rPr>
-          <w:instrText xml:space="preserve"> PAGEREF _Toc242198242 \h </w:instrText>
+          <w:instrText xml:space="preserve"> PAGEREF _Toc242202629 \h </w:instrText>
         </w:r>
         <w:r>
           <w:rPr>
@@ -2793,7 +2793,7 @@
           <w14:ligatures w14:val="standardContextual"/>
         </w:rPr>
       </w:pPr>
-      <w:hyperlink w:anchor="_Toc242198243" w:history="1">
+      <w:hyperlink w:anchor="_Toc242202630" w:history="1">
         <w:r>
           <w:rPr>
             <w:rStyle w:val="Hipervnculo"/>
@@ -2820,7 +2820,7 @@
             <w:noProof/>
             <w:webHidden/>
           </w:rPr>
-          <w:instrText xml:space="preserve"> PAGEREF _Toc242198243 \h </w:instrText>
+          <w:instrText xml:space="preserve"> PAGEREF _Toc242202630 \h </w:instrText>
         </w:r>
         <w:r>
           <w:rPr>
@@ -2864,7 +2864,7 @@
           <w14:ligatures w14:val="standardContextual"/>
         </w:rPr>
       </w:pPr>
-      <w:hyperlink w:anchor="_Toc242198244" w:history="1">
+      <w:hyperlink w:anchor="_Toc242202631" w:history="1">
         <w:r>
           <w:rPr>
             <w:rStyle w:val="Hipervnculo"/>
@@ -2891,7 +2891,7 @@
             <w:noProof/>
             <w:webHidden/>
           </w:rPr>
-          <w:instrText xml:space="preserve"> PAGEREF _Toc242198244 \h </w:instrText>
+          <w:instrText xml:space="preserve"> PAGEREF _Toc242202631 \h </w:instrText>
         </w:r>
         <w:r>
           <w:rPr>
@@ -2935,7 +2935,7 @@
           <w14:ligatures w14:val="standardContextual"/>
         </w:rPr>
       </w:pPr>
-      <w:hyperlink w:anchor="_Toc242198245" w:history="1">
+      <w:hyperlink w:anchor="_Toc242202632" w:history="1">
         <w:r>
           <w:rPr>
             <w:rStyle w:val="Hipervnculo"/>
@@ -2962,7 +2962,7 @@
             <w:noProof/>
             <w:webHidden/>
           </w:rPr>
-          <w:instrText xml:space="preserve"> PAGEREF _Toc242198245 \h </w:instrText>
+          <w:instrText xml:space="preserve"> PAGEREF _Toc242202632 \h </w:instrText>
         </w:r>
         <w:r>
           <w:rPr>
@@ -3006,7 +3006,7 @@
           <w14:ligatures w14:val="standardContextual"/>
         </w:rPr>
       </w:pPr>
-      <w:hyperlink w:anchor="_Toc242198246" w:history="1">
+      <w:hyperlink w:anchor="_Toc242202633" w:history="1">
         <w:r>
           <w:rPr>
             <w:rStyle w:val="Hipervnculo"/>
@@ -3033,7 +3033,7 @@
             <w:noProof/>
             <w:webHidden/>
           </w:rPr>
-          <w:instrText xml:space="preserve"> PAGEREF _Toc242198246 \h </w:instrText>
+          <w:instrText xml:space="preserve"> PAGEREF _Toc242202633 \h </w:instrText>
         </w:r>
         <w:r>
           <w:rPr>
@@ -3077,7 +3077,7 @@
           <w14:ligatures w14:val="standardContextual"/>
         </w:rPr>
       </w:pPr>
-      <w:hyperlink w:anchor="_Toc242198247" w:history="1">
+      <w:hyperlink w:anchor="_Toc242202634" w:history="1">
         <w:r>
           <w:rPr>
             <w:rStyle w:val="Hipervnculo"/>
@@ -3104,7 +3104,7 @@
             <w:noProof/>
             <w:webHidden/>
           </w:rPr>
-          <w:instrText xml:space="preserve"> PAGEREF _Toc242198247 \h </w:instrText>
+          <w:instrText xml:space="preserve"> PAGEREF _Toc242202634 \h </w:instrText>
         </w:r>
         <w:r>
           <w:rPr>
@@ -3148,7 +3148,7 @@
           <w14:ligatures w14:val="standardContextual"/>
         </w:rPr>
       </w:pPr>
-      <w:hyperlink w:anchor="_Toc242198248" w:history="1">
+      <w:hyperlink w:anchor="_Toc242202635" w:history="1">
         <w:r>
           <w:rPr>
             <w:rStyle w:val="Hipervnculo"/>
@@ -3175,7 +3175,7 @@
             <w:noProof/>
             <w:webHidden/>
           </w:rPr>
-          <w:instrText xml:space="preserve"> PAGEREF _Toc242198248 \h </w:instrText>
+          <w:instrText xml:space="preserve"> PAGEREF _Toc242202635 \h </w:instrText>
         </w:r>
         <w:r>
           <w:rPr>
@@ -3219,7 +3219,7 @@
           <w14:ligatures w14:val="standardContextual"/>
         </w:rPr>
       </w:pPr>
-      <w:hyperlink w:anchor="_Toc242198249" w:history="1">
+      <w:hyperlink w:anchor="_Toc242202636" w:history="1">
         <w:r>
           <w:rPr>
             <w:rStyle w:val="Hipervnculo"/>
@@ -3246,7 +3246,7 @@
             <w:noProof/>
             <w:webHidden/>
           </w:rPr>
-          <w:instrText xml:space="preserve"> PAGEREF _Toc242198249 \h </w:instrText>
+          <w:instrText xml:space="preserve"> PAGEREF _Toc242202636 \h </w:instrText>
         </w:r>
         <w:r>
           <w:rPr>
@@ -3290,7 +3290,7 @@
           <w14:ligatures w14:val="standardContextual"/>
         </w:rPr>
       </w:pPr>
-      <w:hyperlink w:anchor="_Toc242198250" w:history="1">
+      <w:hyperlink w:anchor="_Toc242202637" w:history="1">
         <w:r>
           <w:rPr>
             <w:rStyle w:val="Hipervnculo"/>
@@ -3317,7 +3317,7 @@
             <w:noProof/>
             <w:webHidden/>
           </w:rPr>
-          <w:instrText xml:space="preserve"> PAGEREF _Toc242198250 \h </w:instrText>
+          <w:instrText xml:space="preserve"> PAGEREF _Toc242202637 \h </w:instrText>
         </w:r>
         <w:r>
           <w:rPr>
@@ -3361,7 +3361,7 @@
           <w14:ligatures w14:val="standardContextual"/>
         </w:rPr>
       </w:pPr>
-      <w:hyperlink w:anchor="_Toc242198251" w:history="1">
+      <w:hyperlink w:anchor="_Toc242202638" w:history="1">
         <w:r>
           <w:rPr>
             <w:rStyle w:val="Hipervnculo"/>
@@ -3388,7 +3388,7 @@
             <w:noProof/>
             <w:webHidden/>
           </w:rPr>
-          <w:instrText xml:space="preserve"> PAGEREF _Toc242198251 \h </w:instrText>
+          <w:instrText xml:space="preserve"> PAGEREF _Toc242202638 \h </w:instrText>
         </w:r>
         <w:r>
           <w:rPr>
@@ -3432,7 +3432,7 @@
           <w14:ligatures w14:val="standardContextual"/>
         </w:rPr>
       </w:pPr>
-      <w:hyperlink w:anchor="_Toc242198252" w:history="1">
+      <w:hyperlink w:anchor="_Toc242202639" w:history="1">
         <w:r>
           <w:rPr>
             <w:rStyle w:val="Hipervnculo"/>
@@ -3459,7 +3459,7 @@
             <w:noProof/>
             <w:webHidden/>
           </w:rPr>
-          <w:instrText xml:space="preserve"> PAGEREF _Toc242198252 \h </w:instrText>
+          <w:instrText xml:space="preserve"> PAGEREF _Toc242202639 \h </w:instrText>
         </w:r>
         <w:r>
           <w:rPr>
@@ -3503,7 +3503,7 @@
           <w14:ligatures w14:val="standardContextual"/>
         </w:rPr>
       </w:pPr>
-      <w:hyperlink w:anchor="_Toc242198253" w:history="1">
+      <w:hyperlink w:anchor="_Toc242202640" w:history="1">
         <w:r>
           <w:rPr>
             <w:rStyle w:val="Hipervnculo"/>
@@ -3530,7 +3530,7 @@
             <w:noProof/>
             <w:webHidden/>
           </w:rPr>
-          <w:instrText xml:space="preserve"> PAGEREF _Toc242198253 \h </w:instrText>
+          <w:instrText xml:space="preserve"> PAGEREF _Toc242202640 \h </w:instrText>
         </w:r>
         <w:r>
           <w:rPr>
@@ -3574,7 +3574,7 @@
           <w14:ligatures w14:val="standardContextual"/>
         </w:rPr>
       </w:pPr>
-      <w:hyperlink w:anchor="_Toc242198254" w:history="1">
+      <w:hyperlink w:anchor="_Toc242202641" w:history="1">
         <w:r>
           <w:rPr>
             <w:rStyle w:val="Hipervnculo"/>
@@ -3601,7 +3601,7 @@
             <w:noProof/>
             <w:webHidden/>
           </w:rPr>
-          <w:instrText xml:space="preserve"> PAGEREF _Toc242198254 \h </w:instrText>
+          <w:instrText xml:space="preserve"> PAGEREF _Toc242202641 \h </w:instrText>
         </w:r>
         <w:r>
           <w:rPr>
@@ -3645,7 +3645,7 @@
           <w14:ligatures w14:val="standardContextual"/>
         </w:rPr>
       </w:pPr>
-      <w:hyperlink w:anchor="_Toc242198255" w:history="1">
+      <w:hyperlink w:anchor="_Toc242202642" w:history="1">
         <w:r>
           <w:rPr>
             <w:rStyle w:val="Hipervnculo"/>
@@ -3672,7 +3672,7 @@
             <w:noProof/>
             <w:webHidden/>
           </w:rPr>
-          <w:instrText xml:space="preserve"> PAGEREF _Toc242198255 \h </w:instrText>
+          <w:instrText xml:space="preserve"> PAGEREF _Toc242202642 \h </w:instrText>
         </w:r>
         <w:r>
           <w:rPr>
@@ -3716,7 +3716,7 @@
           <w14:ligatures w14:val="standardContextual"/>
         </w:rPr>
       </w:pPr>
-      <w:hyperlink w:anchor="_Toc242198256" w:history="1">
+      <w:hyperlink w:anchor="_Toc242202643" w:history="1">
         <w:r>
           <w:rPr>
             <w:rStyle w:val="Hipervnculo"/>
@@ -3743,7 +3743,78 @@
             <w:noProof/>
             <w:webHidden/>
           </w:rPr>
-          <w:instrText xml:space="preserve"> PAGEREF _Toc242198256 \h </w:instrText>
+          <w:instrText xml:space="preserve"> PAGEREF _Toc242202643 \h </w:instrText>
+        </w:r>
+        <w:r>
+          <w:rPr>
+            <w:noProof/>
+            <w:webHidden/>
+          </w:rPr>
+        </w:r>
+        <w:r>
+          <w:rPr>
+            <w:noProof/>
+            <w:webHidden/>
+          </w:rPr>
+          <w:fldChar w:fldCharType="separate"/>
+        </w:r>
+        <w:r>
+          <w:rPr>
+            <w:noProof/>
+            <w:webHidden/>
+          </w:rPr>
+          <w:t>99</w:t>
+        </w:r>
+        <w:r>
+          <w:rPr>
+            <w:noProof/>
+            <w:webHidden/>
+          </w:rPr>
+          <w:fldChar w:fldCharType="end"/>
+        </w:r>
+      </w:hyperlink>
+    </w:p>
+    <w:p>
+      <w:pPr>
+        <w:pStyle w:val="TDC2"/>
+        <w:tabs>
+          <w:tab w:val="right" w:leader="dot" w:pos="9962"/>
+        </w:tabs>
+        <w:rPr>
+          <w:rFonts w:asciiTheme="minorHAnsi" w:eastAsiaTheme="minorEastAsia" w:hAnsiTheme="minorHAnsi" w:cstheme="minorBidi"/>
+          <w:noProof/>
+          <w:kern w:val="2"/>
+          <w14:ligatures w14:val="standardContextual"/>
+        </w:rPr>
+      </w:pPr>
+      <w:hyperlink w:anchor="_Toc242202644" w:history="1">
+        <w:r>
+          <w:rPr>
+            <w:rStyle w:val="Hipervnculo"/>
+            <w:noProof/>
+          </w:rPr>
+          <w:t>10.3 Sonido y arte por incorporar</w:t>
+        </w:r>
+        <w:r>
+          <w:rPr>
+            <w:noProof/>
+            <w:webHidden/>
+          </w:rPr>
+          <w:tab/>
+        </w:r>
+        <w:r>
+          <w:rPr>
+            <w:noProof/>
+            <w:webHidden/>
+          </w:rPr>
+          <w:fldChar w:fldCharType="begin"/>
+        </w:r>
+        <w:r>
+          <w:rPr>
+            <w:noProof/>
+            <w:webHidden/>
+          </w:rPr>
+          <w:instrText xml:space="preserve"> PAGEREF _Toc242202644 \h </w:instrText>
         </w:r>
         <w:r>
           <w:rPr>
@@ -3787,78 +3858,7 @@
           <w14:ligatures w14:val="standardContextual"/>
         </w:rPr>
       </w:pPr>
-      <w:hyperlink w:anchor="_Toc242198257" w:history="1">
-        <w:r>
-          <w:rPr>
-            <w:rStyle w:val="Hipervnculo"/>
-            <w:noProof/>
-          </w:rPr>
-          <w:t>10.3 Sonido y arte por incorporar</w:t>
-        </w:r>
-        <w:r>
-          <w:rPr>
-            <w:noProof/>
-            <w:webHidden/>
-          </w:rPr>
-          <w:tab/>
-        </w:r>
-        <w:r>
-          <w:rPr>
-            <w:noProof/>
-            <w:webHidden/>
-          </w:rPr>
-          <w:fldChar w:fldCharType="begin"/>
-        </w:r>
-        <w:r>
-          <w:rPr>
-            <w:noProof/>
-            <w:webHidden/>
-          </w:rPr>
-          <w:instrText xml:space="preserve"> PAGEREF _Toc242198257 \h </w:instrText>
-        </w:r>
-        <w:r>
-          <w:rPr>
-            <w:noProof/>
-            <w:webHidden/>
-          </w:rPr>
-        </w:r>
-        <w:r>
-          <w:rPr>
-            <w:noProof/>
-            <w:webHidden/>
-          </w:rPr>
-          <w:fldChar w:fldCharType="separate"/>
-        </w:r>
-        <w:r>
-          <w:rPr>
-            <w:noProof/>
-            <w:webHidden/>
-          </w:rPr>
-          <w:t>100</w:t>
-        </w:r>
-        <w:r>
-          <w:rPr>
-            <w:noProof/>
-            <w:webHidden/>
-          </w:rPr>
-          <w:fldChar w:fldCharType="end"/>
-        </w:r>
-      </w:hyperlink>
-    </w:p>
-    <w:p>
-      <w:pPr>
-        <w:pStyle w:val="TDC2"/>
-        <w:tabs>
-          <w:tab w:val="right" w:leader="dot" w:pos="9962"/>
-        </w:tabs>
-        <w:rPr>
-          <w:rFonts w:asciiTheme="minorHAnsi" w:eastAsiaTheme="minorEastAsia" w:hAnsiTheme="minorHAnsi" w:cstheme="minorBidi"/>
-          <w:noProof/>
-          <w:kern w:val="2"/>
-          <w14:ligatures w14:val="standardContextual"/>
-        </w:rPr>
-      </w:pPr>
-      <w:hyperlink w:anchor="_Toc242198258" w:history="1">
+      <w:hyperlink w:anchor="_Toc242202645" w:history="1">
         <w:r>
           <w:rPr>
             <w:rStyle w:val="Hipervnculo"/>
@@ -3885,7 +3885,7 @@
             <w:noProof/>
             <w:webHidden/>
           </w:rPr>
-          <w:instrText xml:space="preserve"> PAGEREF _Toc242198258 \h </w:instrText>
+          <w:instrText xml:space="preserve"> PAGEREF _Toc242202645 \h </w:instrText>
         </w:r>
         <w:r>
           <w:rPr>
@@ -3929,7 +3929,7 @@
           <w14:ligatures w14:val="standardContextual"/>
         </w:rPr>
       </w:pPr>
-      <w:hyperlink w:anchor="_Toc242198259" w:history="1">
+      <w:hyperlink w:anchor="_Toc242202646" w:history="1">
         <w:r>
           <w:rPr>
             <w:rStyle w:val="Hipervnculo"/>
@@ -3956,7 +3956,7 @@
             <w:noProof/>
             <w:webHidden/>
           </w:rPr>
-          <w:instrText xml:space="preserve"> PAGEREF _Toc242198259 \h </w:instrText>
+          <w:instrText xml:space="preserve"> PAGEREF _Toc242202646 \h </w:instrText>
         </w:r>
         <w:r>
           <w:rPr>
@@ -4000,7 +4000,7 @@
           <w14:ligatures w14:val="standardContextual"/>
         </w:rPr>
       </w:pPr>
-      <w:hyperlink w:anchor="_Toc242198260" w:history="1">
+      <w:hyperlink w:anchor="_Toc242202647" w:history="1">
         <w:r>
           <w:rPr>
             <w:rStyle w:val="Hipervnculo"/>
@@ -4027,7 +4027,7 @@
             <w:noProof/>
             <w:webHidden/>
           </w:rPr>
-          <w:instrText xml:space="preserve"> PAGEREF _Toc242198260 \h </w:instrText>
+          <w:instrText xml:space="preserve"> PAGEREF _Toc242202647 \h </w:instrText>
         </w:r>
         <w:r>
           <w:rPr>
@@ -4071,7 +4071,7 @@
           <w14:ligatures w14:val="standardContextual"/>
         </w:rPr>
       </w:pPr>
-      <w:hyperlink w:anchor="_Toc242198261" w:history="1">
+      <w:hyperlink w:anchor="_Toc242202648" w:history="1">
         <w:r>
           <w:rPr>
             <w:rStyle w:val="Hipervnculo"/>
@@ -4098,7 +4098,7 @@
             <w:noProof/>
             <w:webHidden/>
           </w:rPr>
-          <w:instrText xml:space="preserve"> PAGEREF _Toc242198261 \h </w:instrText>
+          <w:instrText xml:space="preserve"> PAGEREF _Toc242202648 \h </w:instrText>
         </w:r>
         <w:r>
           <w:rPr>
@@ -4143,7 +4143,7 @@
       <w:pPr>
         <w:pStyle w:val="Ttulo1"/>
       </w:pPr>
-      <w:bookmarkStart w:id="0" w:name="_Toc242198204"/>
+      <w:bookmarkStart w:id="0" w:name="_Toc242202591"/>
       <w:r>
         <w:lastRenderedPageBreak/>
         <w:t>1. OBJETIVO, ALCANCE Y CRITERIOS DE CUMPLIMIENTO</w:t>
@@ -4204,7 +4204,7 @@
       <w:pPr>
         <w:pStyle w:val="Ttulo2"/>
       </w:pPr>
-      <w:bookmarkStart w:id="1" w:name="_Toc242198205"/>
+      <w:bookmarkStart w:id="1" w:name="_Toc242202592"/>
       <w:r>
         <w:t>1.1 El objetivo específico 3</w:t>
       </w:r>
@@ -4257,7 +4257,7 @@
       <w:pPr>
         <w:pStyle w:val="Ttulo2"/>
       </w:pPr>
-      <w:bookmarkStart w:id="2" w:name="_Toc242198206"/>
+      <w:bookmarkStart w:id="2" w:name="_Toc242202593"/>
       <w:r>
         <w:lastRenderedPageBreak/>
         <w:t>1.2 Alcance del prototipo entregado</w:t>
@@ -4966,7 +4966,7 @@
       <w:pPr>
         <w:pStyle w:val="Ttulo2"/>
       </w:pPr>
-      <w:bookmarkStart w:id="3" w:name="_Toc242198207"/>
+      <w:bookmarkStart w:id="3" w:name="_Toc242202594"/>
       <w:r>
         <w:t>1.3 Indicadores del objetivo y su cumplimiento</w:t>
       </w:r>
@@ -5403,7 +5403,7 @@
       <w:pPr>
         <w:pStyle w:val="Ttulo2"/>
       </w:pPr>
-      <w:bookmarkStart w:id="4" w:name="_Toc242198208"/>
+      <w:bookmarkStart w:id="4" w:name="_Toc242202595"/>
       <w:r>
         <w:t>1.4 Entregables del cronograma</w:t>
       </w:r>
@@ -5921,7 +5921,7 @@
       <w:pPr>
         <w:pStyle w:val="Ttulo2"/>
       </w:pPr>
-      <w:bookmarkStart w:id="5" w:name="_Toc242198209"/>
+      <w:bookmarkStart w:id="5" w:name="_Toc242202596"/>
       <w:r>
         <w:t>1.5 Organización del documento y anexos</w:t>
       </w:r>
@@ -6850,7 +6850,7 @@
       <w:pPr>
         <w:pStyle w:val="Ttulo1"/>
       </w:pPr>
-      <w:bookmarkStart w:id="6" w:name="_Toc242198210"/>
+      <w:bookmarkStart w:id="6" w:name="_Toc242202597"/>
       <w:r>
         <w:lastRenderedPageBreak/>
         <w:t>2. METODOLOGÍA DEL DESARROLLO</w:t>
@@ -6869,7 +6869,7 @@
       <w:pPr>
         <w:pStyle w:val="Ttulo2"/>
       </w:pPr>
-      <w:bookmarkStart w:id="7" w:name="_Toc242198211"/>
+      <w:bookmarkStart w:id="7" w:name="_Toc242202598"/>
       <w:r>
         <w:t>2.1 Árcade y Kanban en la fase de desarrollo</w:t>
       </w:r>
@@ -7491,7 +7491,7 @@
       <w:pPr>
         <w:pStyle w:val="Ttulo2"/>
       </w:pPr>
-      <w:bookmarkStart w:id="8" w:name="_Toc242198212"/>
+      <w:bookmarkStart w:id="8" w:name="_Toc242202599"/>
       <w:r>
         <w:t>2.2 Planificación por slices y carriles</w:t>
       </w:r>
@@ -8821,7 +8821,7 @@
       <w:pPr>
         <w:pStyle w:val="Ttulo2"/>
       </w:pPr>
-      <w:bookmarkStart w:id="9" w:name="_Toc242198213"/>
+      <w:bookmarkStart w:id="9" w:name="_Toc242202600"/>
       <w:r>
         <w:t>2.3 Seguimiento con actas (D01–D10)</w:t>
       </w:r>
@@ -9899,7 +9899,7 @@
       <w:pPr>
         <w:pStyle w:val="Ttulo2"/>
       </w:pPr>
-      <w:bookmarkStart w:id="10" w:name="_Toc242198214"/>
+      <w:bookmarkStart w:id="10" w:name="_Toc242202601"/>
       <w:r>
         <w:t>2.4 Entorno y herramientas de desarrollo</w:t>
       </w:r>
@@ -11314,7 +11314,7 @@
       <w:pPr>
         <w:pStyle w:val="Ttulo2"/>
       </w:pPr>
-      <w:bookmarkStart w:id="11" w:name="_Toc242198215"/>
+      <w:bookmarkStart w:id="11" w:name="_Toc242202602"/>
       <w:r>
         <w:t>2.5 Prácticas de ingeniería</w:t>
       </w:r>
@@ -11520,7 +11520,7 @@
       <w:pPr>
         <w:pStyle w:val="Ttulo1"/>
       </w:pPr>
-      <w:bookmarkStart w:id="12" w:name="_Toc242198216"/>
+      <w:bookmarkStart w:id="12" w:name="_Toc242202603"/>
       <w:r>
         <w:lastRenderedPageBreak/>
         <w:t>3. ARQUITECTURA E IMPLEMENTACIÓN BASE</w:t>
@@ -11549,7 +11549,7 @@
       <w:pPr>
         <w:pStyle w:val="Ttulo2"/>
       </w:pPr>
-      <w:bookmarkStart w:id="13" w:name="_Toc242198217"/>
+      <w:bookmarkStart w:id="13" w:name="_Toc242202604"/>
       <w:r>
         <w:t>3.1 Arquitectura implementada frente a la diseñada</w:t>
       </w:r>
@@ -12667,7 +12667,7 @@
       <w:pPr>
         <w:pStyle w:val="Ttulo2"/>
       </w:pPr>
-      <w:bookmarkStart w:id="14" w:name="_Toc242198218"/>
+      <w:bookmarkStart w:id="14" w:name="_Toc242202605"/>
       <w:r>
         <w:t>3.2 Módulos y dependencias</w:t>
       </w:r>
@@ -13670,7 +13670,7 @@
       <w:pPr>
         <w:pStyle w:val="Ttulo2"/>
       </w:pPr>
-      <w:bookmarkStart w:id="15" w:name="_Toc242198219"/>
+      <w:bookmarkStart w:id="15" w:name="_Toc242202606"/>
       <w:r>
         <w:t>3.3 Flujo de estados y escenas</w:t>
       </w:r>
@@ -16007,7 +16007,7 @@
       <w:pPr>
         <w:pStyle w:val="Ttulo2"/>
       </w:pPr>
-      <w:bookmarkStart w:id="16" w:name="_Toc242198220"/>
+      <w:bookmarkStart w:id="16" w:name="_Toc242202607"/>
       <w:r>
         <w:t>3.4 Contenido parametrizable</w:t>
       </w:r>
@@ -16938,7 +16938,7 @@
           <w:noProof/>
         </w:rPr>
         <w:drawing>
-          <wp:inline distT="0" distB="0" distL="0" distR="0" wp14:anchorId="31160158" wp14:editId="343E4F22">
+          <wp:inline distT="0" distB="0" distL="0" distR="0" wp14:anchorId="31FE020D" wp14:editId="78A16C2F">
             <wp:extent cx="5759999" cy="3239999"/>
             <wp:effectExtent l="0" t="0" r="0" b="0"/>
             <wp:docPr id="10" name="Picture" descr="Figura 3.1. La escena Narrative reproduciendo la secuencia N1_AparicionGuia (escena 1.1 del guion): Algoritm, en su forma de fuego, se presenta a la familia en la cueva a oscuras, con la luz concentrada a su alrededor. La ilustración, la capa de oscuridad del Nivel 1, la posición y la animación de los personajes y la línea de diálogo («¡Hola, familia! No tengan miedo. Me llamo Algoritm, y vine a acompañarlos.») se leen del asset; el cuadro de diálogo muestra el retrato y el nombre de quien habla junto al botón «Continuar». La misma escena de Unity reproduce las dieciocho secuencias del juego."/>
@@ -17025,7 +17025,7 @@
       <w:pPr>
         <w:pStyle w:val="Ttulo2"/>
       </w:pPr>
-      <w:bookmarkStart w:id="17" w:name="_Toc242198221"/>
+      <w:bookmarkStart w:id="17" w:name="_Toc242202608"/>
       <w:r>
         <w:t>3.5 Persistencia de perfiles y privacidad</w:t>
       </w:r>
@@ -17717,7 +17717,7 @@
       <w:pPr>
         <w:pStyle w:val="Ttulo2"/>
       </w:pPr>
-      <w:bookmarkStart w:id="18" w:name="_Toc242198222"/>
+      <w:bookmarkStart w:id="18" w:name="_Toc242202609"/>
       <w:r>
         <w:t>3.6 Distribución portable</w:t>
       </w:r>
@@ -18113,7 +18113,7 @@
       <w:pPr>
         <w:pStyle w:val="Ttulo1"/>
       </w:pPr>
-      <w:bookmarkStart w:id="19" w:name="_Toc242198223"/>
+      <w:bookmarkStart w:id="19" w:name="_Toc242202610"/>
       <w:r>
         <w:lastRenderedPageBreak/>
         <w:t>4. NIVELES Y DESAFÍOS PROGRESIVOS</w:t>
@@ -18203,7 +18203,7 @@
       <w:pPr>
         <w:pStyle w:val="Ttulo2"/>
       </w:pPr>
-      <w:bookmarkStart w:id="20" w:name="_Toc242198224"/>
+      <w:bookmarkStart w:id="20" w:name="_Toc242202611"/>
       <w:r>
         <w:t>4.1 Progresión del pensamiento computacional entre niveles</w:t>
       </w:r>
@@ -18548,7 +18548,7 @@
       <w:pPr>
         <w:pStyle w:val="Ttulo2"/>
       </w:pPr>
-      <w:bookmarkStart w:id="21" w:name="_Toc242198225"/>
+      <w:bookmarkStart w:id="21" w:name="_Toc242202612"/>
       <w:r>
         <w:t>4.2 Nivel 1 — La Oscuridad</w:t>
       </w:r>
@@ -19774,7 +19774,7 @@
           <w:noProof/>
         </w:rPr>
         <w:drawing>
-          <wp:inline distT="0" distB="0" distL="0" distR="0" wp14:anchorId="556E8DBD" wp14:editId="0D4062F4">
+          <wp:inline distT="0" distB="0" distL="0" distR="0" wp14:anchorId="63C04181" wp14:editId="619DEA92">
             <wp:extent cx="5759999" cy="3239999"/>
             <wp:effectExtent l="0" t="0" r="0" b="0"/>
             <wp:docPr id="13" name="Picture" descr="Figura 4.1. Inicio de la fase jugable del Nivel 1: las hojas, el sílex y el pedernal están regados por la cueva vista desde arriba, con Papá a un lado del círculo de luz central y el resto de la familia al otro; la tablilla superior pide «Reúne todas las hojas y las dos piedras en el centro de la pantalla.» y el botón de ayuda, arriba a la izquierda, lleva la figura de fuego de Algoritm."/>
@@ -19871,7 +19871,7 @@
           <w:noProof/>
         </w:rPr>
         <w:drawing>
-          <wp:inline distT="0" distB="0" distL="0" distR="0" wp14:anchorId="7A20F591" wp14:editId="5D79AE17">
+          <wp:inline distT="0" distB="0" distL="0" distR="0" wp14:anchorId="023CD4C9" wp14:editId="72BBCC27">
             <wp:extent cx="5759999" cy="3239999"/>
             <wp:effectExtent l="0" t="0" r="0" b="0"/>
             <wp:docPr id="16" name="Picture" descr="Figura 4.2. Interfaz de encendido del Nivel 1 tras el primer golpe efectivo, antes de la convergencia: los deslizantes de fuerza (vertical, de «Suave» a «Fuerte») y de cercanía (horizontal, de «Lejos» a «Cerca») representan la hipótesis, las piedras se ven sobre el montón de hojas y la tablilla describe lo ocurrido («Una chispa cae dentro de las hojas. Brilla un instante y se apaga.»). «Golpear» pone a prueba la hipótesis y «Soplar» sigue atenuado y con candado, un doble indicador que no depende solo del color."/>
@@ -20052,7 +20052,7 @@
         </w:rPr>
         <w:lastRenderedPageBreak/>
         <w:drawing>
-          <wp:inline distT="0" distB="0" distL="0" distR="0" wp14:anchorId="20189049" wp14:editId="6963F185">
+          <wp:inline distT="0" distB="0" distL="0" distR="0" wp14:anchorId="2993E9A9" wp14:editId="2A77BBC2">
             <wp:extent cx="5759999" cy="3239999"/>
             <wp:effectExtent l="0" t="0" r="0" b="0"/>
             <wp:docPr id="19" name="Picture" descr="Figura 4.3. Cierre reflexivo del Nivel 1 (N1_NacimientoDelFuego): Algoritm, en su forma de fuego, sobre las brasas de la hoguera recién encendida, de la que sube humo, nombra la iteración ante la familia reunida («Eso tiene nombre: se llama iterar. Probar, mirar el resultado y ajustar.»)."/>
@@ -21097,7 +21097,7 @@
       <w:pPr>
         <w:pStyle w:val="Ttulo2"/>
       </w:pPr>
-      <w:bookmarkStart w:id="22" w:name="_Toc242198226"/>
+      <w:bookmarkStart w:id="22" w:name="_Toc242202613"/>
       <w:r>
         <w:t>4.3 Nivel 2 — La Rueda</w:t>
       </w:r>
@@ -23279,7 +23279,7 @@
         </w:rPr>
         <w:lastRenderedPageBreak/>
         <w:drawing>
-          <wp:inline distT="0" distB="0" distL="0" distR="0" wp14:anchorId="3A357394" wp14:editId="2F9FBCB3">
+          <wp:inline distT="0" distB="0" distL="0" distR="0" wp14:anchorId="4E6AC044" wp14:editId="705ED2C8">
             <wp:extent cx="5759999" cy="3239999"/>
             <wp:effectExtent l="0" t="0" r="0" b="0"/>
             <wp:docPr id="22" name="Picture" descr="Figura 4.4. Fase 1 del Nivel 2 tras seleccionar una piedra: el mensaje describe por qué no sirve («Esta piedra tiene esquinas. Cuando la empujas, se traba.»), con icono de alerta además de color; la piedra sigue en su sitio, el acopio conserva el tronco ya reunido («Troncos redondos: 1 de 5») y la Niña, junto a la caja, anima. Abajo a la derecha, el botón de ayuda con Algoritm en su forma de rueda."/>
@@ -23373,7 +23373,7 @@
         </w:rPr>
         <w:lastRenderedPageBreak/>
         <w:drawing>
-          <wp:inline distT="0" distB="0" distL="0" distR="0" wp14:anchorId="1E16E0E4" wp14:editId="6EBE57B4">
+          <wp:inline distT="0" distB="0" distL="0" distR="0" wp14:anchorId="00C939F2" wp14:editId="42C0B2FC">
             <wp:extent cx="5759999" cy="3239999"/>
             <wp:effectExtent l="0" t="0" r="0" b="0"/>
             <wp:docPr id="25" name="Picture" descr="Figura 4.5. Escena narrativa 2.2 («El patrón»): la caja llena que dejó la fase del bosque, con el mismo tamaño que tenía allí, junto a los troncos alineados, y Algoritm, en su forma de rueda, nombrando el patrón que el estudiante acaba de usar en la fase 1 («Acabas de encontrar un patrón.»)."/>
@@ -24164,7 +24164,7 @@
           <w:noProof/>
         </w:rPr>
         <w:drawing>
-          <wp:inline distT="0" distB="0" distL="0" distR="0" wp14:anchorId="17377C2B" wp14:editId="46A34720">
+          <wp:inline distT="0" distB="0" distL="0" distR="0" wp14:anchorId="759F3E9E" wp14:editId="79322D3B">
             <wp:extent cx="5759999" cy="3239999"/>
             <wp:effectExtent l="0" t="0" r="0" b="0"/>
             <wp:docPr id="28" name="Picture" descr="Figura 4.6. Fase 2 del Nivel 2 tras intentar colocar la tabla antes del eje: la tabla vuelve a su sitio en la fila de piezas, el mensaje indica qué falta («La tabla no tiene sobre qué apoyarse todavía.») y la rueda ya perforada se conserva; «Mecanizar» aparece atenuado, con el candado y el rótulo «Aún no», porque no hay tronco resaltado."/>
@@ -24651,7 +24651,7 @@
           <w:noProof/>
         </w:rPr>
         <w:drawing>
-          <wp:inline distT="0" distB="0" distL="0" distR="0" wp14:anchorId="00EC77BC" wp14:editId="0ABA2A5C">
+          <wp:inline distT="0" distB="0" distL="0" distR="0" wp14:anchorId="14FE17C3" wp14:editId="72E259E5">
             <wp:extent cx="5759999" cy="3239999"/>
             <wp:effectExtent l="0" t="0" r="0" b="0"/>
             <wp:docPr id="31" name="Picture" descr="Figura 4.7. Fase 3 del Nivel 2 al atardecer: el laberinto en vista superior con su cuadrícula, la carretilla en la salida, con la Niña a su lado, y el resto de la familia en el refugio del extremo opuesto; a la derecha, la secuencia con un bloque «Girar» cuyo lado elegido, la izquierda, va en color de atención y con contorno, y el cajón «Bloques» abierto con «Avanzar», «Girar» y «Retroceder», cada uno con su silueta. Arriba, la tablilla mantiene el aviso que pide añadir al menos un bloque antes de ejecutar."/>
@@ -24754,7 +24754,7 @@
       <w:pPr>
         <w:pStyle w:val="Ttulo2"/>
       </w:pPr>
-      <w:bookmarkStart w:id="23" w:name="_Toc242198227"/>
+      <w:bookmarkStart w:id="23" w:name="_Toc242202614"/>
       <w:r>
         <w:t>4.4 Nivel 3 — El Río</w:t>
       </w:r>
@@ -25228,7 +25228,7 @@
         </w:rPr>
         <w:lastRenderedPageBreak/>
         <w:drawing>
-          <wp:inline distT="0" distB="0" distL="0" distR="0" wp14:anchorId="22F7D4B4" wp14:editId="18A7D519">
+          <wp:inline distT="0" distB="0" distL="0" distR="0" wp14:anchorId="709FA006" wp14:editId="36CAED82">
             <wp:extent cx="5759999" cy="3239999"/>
             <wp:effectExtent l="0" t="0" r="0" b="0"/>
             <wp:docPr id="34" name="Picture" descr="Figura 4.8. Recolección en el Nivel 3: la orilla encuadrada a ×1,4, con la familia y los materiales (cinco troncos, las sogas, la tela y el mástil) a la escala de las narrativas. Arriba, la lista de cuatro tareas, todas pendientes, y la tablilla con la consigna («Recorre la orilla y recoge lo que la balsa necesita. La lista te dice qué falta.»); abajo, el inventario de cuatro casillas y la cruceta de dirección; en el centro, el anillo de la zona de construcción, y a la derecha, el río al pie de la cascada."/>
@@ -25395,7 +25395,7 @@
         </w:rPr>
         <w:lastRenderedPageBreak/>
         <w:drawing>
-          <wp:inline distT="0" distB="0" distL="0" distR="0" wp14:anchorId="79A6D7CA" wp14:editId="10B14F51">
+          <wp:inline distT="0" distB="0" distL="0" distR="0" wp14:anchorId="22065A49" wp14:editId="68C275FD">
             <wp:extent cx="5759999" cy="3239999"/>
             <wp:effectExtent l="0" t="0" r="0" b="0"/>
             <wp:docPr id="37" name="Picture" descr="Figura 4.9. Fase de base rechazada: el mástil se había colocado en uno de los espacios de los troncos. Al pulsar «Listo», ese espacio queda señalado con color e icono de alerta, el mástil vuelve a su casilla del inventario, los cuatro troncos bien puestos permanecen y el mensaje dice «Algo de esta parte no encaja. Mira lo marcado: ¿esa pieza va ahí?»; debajo de la balsa, «Listo» y «Probar balsa» aparecen uno junto al otro, y la lista tiene marcadas las dos tareas de recolección."/>
@@ -25524,7 +25524,7 @@
           <w:noProof/>
         </w:rPr>
         <w:drawing>
-          <wp:inline distT="0" distB="0" distL="0" distR="0" wp14:anchorId="7D3C9A15" wp14:editId="18F018A8">
+          <wp:inline distT="0" distB="0" distL="0" distR="0" wp14:anchorId="07355217" wp14:editId="239AF467">
             <wp:extent cx="5759999" cy="3239999"/>
             <wp:effectExtent l="0" t="0" r="0" b="0"/>
             <wp:docPr id="40" name="Picture" descr="Figura 4.10. Prueba de la balsa fallida con el mástil y la vela intercambiados: la base y el amarre, ya aprobados, siguen en su sitio; los dos espacios aparecen señalados con color e icono de alerta, las dos piezas volvieron al inventario y el mensaje indica qué revisar («La balsa se volteó. Mira el espacio marcado: ¿qué debería ir ahí?»). Debajo queda solo «Probar balsa», y la lista conserva marcadas las tres primeras tareas."/>
@@ -25610,7 +25610,7 @@
           <w:noProof/>
         </w:rPr>
         <w:drawing>
-          <wp:inline distT="0" distB="0" distL="0" distR="0" wp14:anchorId="4DEEB6C7" wp14:editId="59E6D0A6">
+          <wp:inline distT="0" distB="0" distL="0" distR="0" wp14:anchorId="0A9EE82A" wp14:editId="0D3D5772">
             <wp:extent cx="5759999" cy="3239999"/>
             <wp:effectExtent l="0" t="0" r="0" b="0"/>
             <wp:docPr id="43" name="Picture" descr="Figura 4.11. Escena 3.2, que solo aparece tras el primer fallo de la balsa terminada: la balsa hundida por un costado junto a la orilla, la familia en el agua y Algoritm, en su forma de gota, nombrando la depuración con una pregunta en lugar de dar la respuesta («No pasa nada. Esto se llama depurar. No hay que hacer todo otra vez: hay que encontrar la parte que falló. ¿Qué salió mal?»)."/>
@@ -25681,7 +25681,7 @@
       <w:pPr>
         <w:pStyle w:val="Ttulo2"/>
       </w:pPr>
-      <w:bookmarkStart w:id="24" w:name="_Toc242198228"/>
+      <w:bookmarkStart w:id="24" w:name="_Toc242202615"/>
       <w:r>
         <w:t>4.5 Escenas narrativas y puentes</w:t>
       </w:r>
@@ -27975,7 +27975,7 @@
       <w:pPr>
         <w:pStyle w:val="Ttulo2"/>
       </w:pPr>
-      <w:bookmarkStart w:id="25" w:name="_Toc242198229"/>
+      <w:bookmarkStart w:id="25" w:name="_Toc242202616"/>
       <w:r>
         <w:lastRenderedPageBreak/>
         <w:t>4.6 Síntesis de la progresión de dificultad</w:t>
@@ -28757,7 +28757,7 @@
       <w:pPr>
         <w:pStyle w:val="Ttulo1"/>
       </w:pPr>
-      <w:bookmarkStart w:id="26" w:name="_Toc242198230"/>
+      <w:bookmarkStart w:id="26" w:name="_Toc242202617"/>
       <w:r>
         <w:lastRenderedPageBreak/>
         <w:t>5. MECÁNICAS IMPLEMENTADAS</w:t>
@@ -28779,7 +28779,7 @@
       <w:pPr>
         <w:pStyle w:val="Ttulo2"/>
       </w:pPr>
-      <w:bookmarkStart w:id="27" w:name="_Toc242198231"/>
+      <w:bookmarkStart w:id="27" w:name="_Toc242202618"/>
       <w:r>
         <w:t>5.1 Mecánicas planeadas y mecánicas implementadas</w:t>
       </w:r>
@@ -30517,7 +30517,7 @@
       <w:pPr>
         <w:pStyle w:val="Ttulo2"/>
       </w:pPr>
-      <w:bookmarkStart w:id="28" w:name="_Toc242198232"/>
+      <w:bookmarkStart w:id="28" w:name="_Toc242202619"/>
       <w:r>
         <w:t>5.2 Formas de interacción y control</w:t>
       </w:r>
@@ -31138,7 +31138,7 @@
       <w:pPr>
         <w:pStyle w:val="Ttulo2"/>
       </w:pPr>
-      <w:bookmarkStart w:id="29" w:name="_Toc242198233"/>
+      <w:bookmarkStart w:id="29" w:name="_Toc242202620"/>
       <w:r>
         <w:t>5.3 Ajustes al diseño durante el desarrollo</w:t>
       </w:r>
@@ -33336,7 +33336,7 @@
       <w:pPr>
         <w:pStyle w:val="Ttulo1"/>
       </w:pPr>
-      <w:bookmarkStart w:id="30" w:name="_Toc242198234"/>
+      <w:bookmarkStart w:id="30" w:name="_Toc242202621"/>
       <w:r>
         <w:lastRenderedPageBreak/>
         <w:t>6. ANDAMIAJE PEDAGÓGICO, RETROALIMENTACIÓN Y REGISTRO</w:t>
@@ -33367,7 +33367,7 @@
       <w:pPr>
         <w:pStyle w:val="Ttulo2"/>
       </w:pPr>
-      <w:bookmarkStart w:id="31" w:name="_Toc242198235"/>
+      <w:bookmarkStart w:id="31" w:name="_Toc242202622"/>
       <w:r>
         <w:t>6.1 El guía Algoritm y las pistas</w:t>
       </w:r>
@@ -33785,7 +33785,7 @@
       <w:pPr>
         <w:pStyle w:val="Ttulo2"/>
       </w:pPr>
-      <w:bookmarkStart w:id="32" w:name="_Toc242198236"/>
+      <w:bookmarkStart w:id="32" w:name="_Toc242202623"/>
       <w:r>
         <w:t>6.2 Retroalimentación sin derrota ni puntajes</w:t>
       </w:r>
@@ -34388,7 +34388,7 @@
       <w:pPr>
         <w:pStyle w:val="Ttulo2"/>
       </w:pPr>
-      <w:bookmarkStart w:id="33" w:name="_Toc242198237"/>
+      <w:bookmarkStart w:id="33" w:name="_Toc242202624"/>
       <w:r>
         <w:t>6.3 Cierre reflexivo de cada nivel</w:t>
       </w:r>
@@ -34850,7 +34850,7 @@
       <w:pPr>
         <w:pStyle w:val="Ttulo2"/>
       </w:pPr>
-      <w:bookmarkStart w:id="34" w:name="_Toc242198238"/>
+      <w:bookmarkStart w:id="34" w:name="_Toc242202625"/>
       <w:r>
         <w:t>6.4 Progreso, indicadores de desempeño e informe docente</w:t>
       </w:r>
@@ -35430,7 +35430,7 @@
       <w:pPr>
         <w:pStyle w:val="Ttulo1"/>
       </w:pPr>
-      <w:bookmarkStart w:id="35" w:name="_Toc242198239"/>
+      <w:bookmarkStart w:id="35" w:name="_Toc242202626"/>
       <w:r>
         <w:lastRenderedPageBreak/>
         <w:t>7. INTERFAZ, ESCENARIOS Y ELEMENTOS AUDIOVISUALES</w:t>
@@ -35452,7 +35452,7 @@
       <w:pPr>
         <w:pStyle w:val="Ttulo2"/>
       </w:pPr>
-      <w:bookmarkStart w:id="36" w:name="_Toc242198240"/>
+      <w:bookmarkStart w:id="36" w:name="_Toc242202627"/>
       <w:r>
         <w:t>7.1 Pantallas del flujo</w:t>
       </w:r>
@@ -36489,7 +36489,7 @@
         </w:rPr>
         <w:lastRenderedPageBreak/>
         <w:drawing>
-          <wp:inline distT="0" distB="0" distL="0" distR="0" wp14:anchorId="06DF60C7" wp14:editId="4290580F">
+          <wp:inline distT="0" distB="0" distL="0" distR="0" wp14:anchorId="05506F22" wp14:editId="79C42019">
             <wp:extent cx="5759999" cy="3239999"/>
             <wp:effectExtent l="0" t="0" r="0" b="0"/>
             <wp:docPr id="46" name="Picture" descr="Figura 7.1. Pantalla de inicio: el título «Algoritmia» y el lema «Piensa el orden, enciende el fuego» sobre la tablilla marfil; debajo, el botón primario «Jugar», «Créditos» y «Salir» en una fila y «Progreso del equipo» en la siguiente, y a la derecha Algoritm en su forma de fuego. Los textos usan Baloo 2 y Nunito."/>
@@ -36584,7 +36584,7 @@
         </w:rPr>
         <w:lastRenderedPageBreak/>
         <w:drawing>
-          <wp:inline distT="0" distB="0" distL="0" distR="0" wp14:anchorId="368EFFE8" wp14:editId="26FC338F">
+          <wp:inline distT="0" distB="0" distL="0" distR="0" wp14:anchorId="74105A7C" wp14:editId="326C4D8B">
             <wp:extent cx="5759999" cy="3239999"/>
             <wp:effectExtent l="0" t="0" r="0" b="0"/>
             <wp:docPr id="49" name="Picture" descr="Figura 7.2. Menú de niveles con sus tres estados: el Nivel 1 completado, con el visto y el rótulo «Completado»; el Nivel 2 disponible, y el Nivel 3 bloqueado, con el botón oscurecido, el candado y el rótulo «Bloqueado» (RF-03, RNF-19). Cada tarjeta muestra la ilustración de su nivel: la cueva, el laberinto y el río."/>
@@ -36705,7 +36705,7 @@
       <w:pPr>
         <w:pStyle w:val="Ttulo2"/>
       </w:pPr>
-      <w:bookmarkStart w:id="37" w:name="_Toc242198241"/>
+      <w:bookmarkStart w:id="37" w:name="_Toc242202628"/>
       <w:r>
         <w:t>7.2 Escenarios, personajes y animación</w:t>
       </w:r>
@@ -37203,7 +37203,10 @@
         <w:t>feat/personajes-animados</w:t>
       </w:r>
       <w:r>
-        <w:t>, sin fusionar a la rama principal, añadió a los siete prefabs codos, rodillas, ojos y boca (cuello y cabeza, solo la familia), seis expresiones con parpadeo y habla (INC-131), el arte final frontal de la familia con la expresión neutra de los cuatro, un orden de dibujo de los brazos (INC-132) y el antebrazo delante del torso (INC-133); esa tanda levanta INC-108 solo para el arte final, y las capturas de este capítulo son del corte (Anexo F, apartados 2.6 a 2.10).</w:t>
+        <w:t>, sin fusionar a la rama principal, añadió a los siete prefabs codos, rodillas, ojos y boca (cuello y cabeza, solo la familia), seis expresiones con parpadeo y habla (INC-131), el arte final frontal de la familia con la expresión neutra de los cuatro, un orden de dibujo de los brazos (INC-132) y el antebrazo delante del torso (INC-133) y el pivote del hombro en el borde del torso, con los gestos junto a la cabeza que pueden cubrir la cara; esa tanda levanta INC-108 solo para</w:t>
+      </w:r>
+      <w:r>
+        <w:t xml:space="preserve"> el arte final, y las capturas de este capítulo son del corte (Anexo F, apartados 2.6 a 2.11).</w:t>
       </w:r>
     </w:p>
     <w:p>
@@ -37227,7 +37230,7 @@
         </w:rPr>
         <w:lastRenderedPageBreak/>
         <w:drawing>
-          <wp:inline distT="0" distB="0" distL="0" distR="0" wp14:anchorId="3452CB58" wp14:editId="674FB300">
+          <wp:inline distT="0" distB="0" distL="0" distR="0" wp14:anchorId="7FE7A921" wp14:editId="75505CCF">
             <wp:extent cx="5759999" cy="3239999"/>
             <wp:effectExtent l="0" t="0" r="0" b="0"/>
             <wp:docPr id="52" name="Picture" descr="Figura 7.3. Escena final del juego: la familia, ya en el poblado al atardecer, entre las chozas, con Algoritm en su forma de gota en el aire, sobre Papá y Mamá; a la derecha del Niño arden las fogatas, de las que sube humo. El cuadro de diálogo muestra el retrato y el nombre de Algoritm, que dice «En el bosque miraste muchas cosas y encontraste lo que tenían en común.» (recorte de la captura a pantalla completa)."/>
@@ -37327,7 +37330,7 @@
       <w:pPr>
         <w:pStyle w:val="Ttulo2"/>
       </w:pPr>
-      <w:bookmarkStart w:id="38" w:name="_Toc242198242"/>
+      <w:bookmarkStart w:id="38" w:name="_Toc242202629"/>
       <w:r>
         <w:t>7.3 Sonido</w:t>
       </w:r>
@@ -37922,7 +37925,7 @@
       <w:pPr>
         <w:pStyle w:val="Ttulo2"/>
       </w:pPr>
-      <w:bookmarkStart w:id="39" w:name="_Toc242198243"/>
+      <w:bookmarkStart w:id="39" w:name="_Toc242202630"/>
       <w:r>
         <w:t>7.4 Accesibilidad</w:t>
       </w:r>
@@ -38559,7 +38562,7 @@
         </w:rPr>
         <w:lastRenderedPageBreak/>
         <w:drawing>
-          <wp:inline distT="0" distB="0" distL="0" distR="0" wp14:anchorId="77930480" wp14:editId="5E20AC37">
+          <wp:inline distT="0" distB="0" distL="0" distR="0" wp14:anchorId="27055AED" wp14:editId="137DF4F7">
             <wp:extent cx="5759999" cy="3239999"/>
             <wp:effectExtent l="0" t="0" r="0" b="0"/>
             <wp:docPr id="55" name="Picture" descr="Figura 7.4. Orilla del Nivel 3 en escala de grises, con los materiales ya reunidos: sin color, las dos tareas hechas se distinguen de las pendientes por el visto dentro del círculo, y el mensaje («Ya tienes todos los materiales. Ve a la zona marcada junto al agua.») lleva su propio icono. Abajo a la derecha, la cruceta de botones de dirección en pantalla que sustituye al teclado (RNF-02, INC-01)."/>
@@ -38732,7 +38735,7 @@
       <w:pPr>
         <w:pStyle w:val="Ttulo1"/>
       </w:pPr>
-      <w:bookmarkStart w:id="40" w:name="_Toc242198244"/>
+      <w:bookmarkStart w:id="40" w:name="_Toc242202631"/>
       <w:r>
         <w:lastRenderedPageBreak/>
         <w:t>8. RENDIMIENTO Y OPTIMIZACIÓN</w:t>
@@ -38764,7 +38767,7 @@
       <w:pPr>
         <w:pStyle w:val="Ttulo2"/>
       </w:pPr>
-      <w:bookmarkStart w:id="41" w:name="_Toc242198245"/>
+      <w:bookmarkStart w:id="41" w:name="_Toc242202632"/>
       <w:r>
         <w:t>8.1 Presupuestos de rendimiento y mediciones</w:t>
       </w:r>
@@ -40799,7 +40802,7 @@
         <w:t>8cdd4c5</w:t>
       </w:r>
       <w:r>
-        <w:t xml:space="preserve">, 06/10/2026) la misma prueba pasó, y en la de </w:t>
+        <w:t xml:space="preserve">, 06/10/2026) la misma prueba pasó, y en las de </w:t>
       </w:r>
       <w:r>
         <w:rPr>
@@ -40808,10 +40811,19 @@
         <w:t>433603f</w:t>
       </w:r>
       <w:r>
-        <w:t xml:space="preserve"> (06/10/2026) falló con 2 161 MB en un Editor de larga duración. Son lecturas de la sesión del Editor, que depende de cuánto lleve abierto, y no del ejecutable: la memoria que verifica RNF-05 sigue s</w:t>
-      </w:r>
-      <w:r>
-        <w:t>iendo la de las mediciones del apartado 8.3.</w:t>
+        <w:t xml:space="preserve"> y </w:t>
+      </w:r>
+      <w:r>
+        <w:rPr>
+          <w:rStyle w:val="CdigoenlneaOE3"/>
+        </w:rPr>
+        <w:t>28337c0</w:t>
+      </w:r>
+      <w:r>
+        <w:t xml:space="preserve"> (06/10/2026) falló con 2 161 MB y 2 353 MB en un Editor de larga duración. Son lecturas de la sesión del Editor, que depende de cuánto lleve abierto, y no del ejecutable: la memoria que v</w:t>
+      </w:r>
+      <w:r>
+        <w:t>erifica RNF-05 sigue siendo la de las mediciones del apartado 8.3.</w:t>
       </w:r>
     </w:p>
     <w:p>
@@ -41063,7 +41075,7 @@
       <w:pPr>
         <w:pStyle w:val="Ttulo2"/>
       </w:pPr>
-      <w:bookmarkStart w:id="42" w:name="_Toc242198246"/>
+      <w:bookmarkStart w:id="42" w:name="_Toc242202633"/>
       <w:r>
         <w:t>8.2 Optimizaciones aplicadas</w:t>
       </w:r>
@@ -41286,7 +41298,7 @@
       <w:pPr>
         <w:pStyle w:val="Ttulo2"/>
       </w:pPr>
-      <w:bookmarkStart w:id="43" w:name="_Toc242198247"/>
+      <w:bookmarkStart w:id="43" w:name="_Toc242202634"/>
       <w:r>
         <w:t>8.3 Mediciones sobre el ejecutable</w:t>
       </w:r>
@@ -43081,7 +43093,7 @@
       <w:pPr>
         <w:pStyle w:val="Ttulo1"/>
       </w:pPr>
-      <w:bookmarkStart w:id="44" w:name="_Toc242198248"/>
+      <w:bookmarkStart w:id="44" w:name="_Toc242202635"/>
       <w:r>
         <w:lastRenderedPageBreak/>
         <w:t>9. VERIFICACIÓN DEL PROTOTIPO</w:t>
@@ -43103,7 +43115,7 @@
       <w:pPr>
         <w:pStyle w:val="Ttulo2"/>
       </w:pPr>
-      <w:bookmarkStart w:id="45" w:name="_Toc242198249"/>
+      <w:bookmarkStart w:id="45" w:name="_Toc242202636"/>
       <w:r>
         <w:t>9.1 Estrategia de pruebas</w:t>
       </w:r>
@@ -46766,7 +46778,7 @@
       <w:pPr>
         <w:pStyle w:val="Ttulo2"/>
       </w:pPr>
-      <w:bookmarkStart w:id="46" w:name="_Toc242198250"/>
+      <w:bookmarkStart w:id="46" w:name="_Toc242202637"/>
       <w:r>
         <w:t>9.2 Golden Path</w:t>
       </w:r>
@@ -46787,10 +46799,10 @@
         <w:t>Golden Path</w:t>
       </w:r>
       <w:r>
-        <w:t>) esté libre de obstáculos que impidan terminar la experiencia educativa. OE1 lo concreta en RNF-13, que pide completar la ruta principal de cada nivel sin bloqueos, cierres inesperados ni estados irrecuperables, y lo comprueba con «dos recorridos completos por nivel sin incidencias bloqueantes»; la especificación del proyecto adopta ese criterio de éxito. La verificación tiene dos partes: pruebas automatizadas en el Editor que recorren la ruta por tramos, y tres recorridos completos del juego so</w:t>
-      </w:r>
-      <w:r>
-        <w:t>bre el ejecutable.</w:t>
+        <w:t>) esté libre de obstáculos que impidan terminar la experiencia educativa. OE1 lo concreta en RNF-13, que pide completar la ruta principal de cada nivel sin bloqueos, cierres inesperados ni estados irrecuperables, y lo comprueba con «dos recorridos completos por nivel sin incidencias bloqueantes»; la especificación del proyecto adopta ese criterio de éxito. La verificación tiene dos partes: pruebas automatizadas en el Editor que recorren la ruta por tramos, y tres recorridos completos del juego sobre el ejec</w:t>
+      </w:r>
+      <w:r>
+        <w:t>utable.</w:t>
       </w:r>
     </w:p>
     <w:p>
@@ -47102,7 +47114,7 @@
       <w:pPr>
         <w:pStyle w:val="Ttulo2"/>
       </w:pPr>
-      <w:bookmarkStart w:id="47" w:name="_Toc242198251"/>
+      <w:bookmarkStart w:id="47" w:name="_Toc242202638"/>
       <w:r>
         <w:t>9.3 Resultado de la suite completa (01/10/2026)</w:t>
       </w:r>
@@ -47777,7 +47789,7 @@
       <w:pPr>
         <w:pStyle w:val="Ttulo2"/>
       </w:pPr>
-      <w:bookmarkStart w:id="48" w:name="_Toc242198252"/>
+      <w:bookmarkStart w:id="48" w:name="_Toc242202639"/>
       <w:r>
         <w:t>9.4 Trazabilidad de requerimientos a pruebas</w:t>
       </w:r>
@@ -48740,7 +48752,7 @@
       <w:pPr>
         <w:pStyle w:val="Ttulo2"/>
       </w:pPr>
-      <w:bookmarkStart w:id="49" w:name="_Toc242198253"/>
+      <w:bookmarkStart w:id="49" w:name="_Toc242202640"/>
       <w:r>
         <w:t>9.5 Verificación sobre el ejecutable</w:t>
       </w:r>
@@ -50288,7 +50300,7 @@
         <w:t>feat/personajes-animados</w:t>
       </w:r>
       <w:r>
-        <w:t xml:space="preserve"> registró cinco rondas de pruebas en los mensajes de sus commits. Ninguna toca las Tablas 9.1 a 9.5, que siguen siendo las del 01/10/2026: son corridas en el Editor sobre prefabs, clips y código de </w:t>
+        <w:t xml:space="preserve"> registró seis rondas de pruebas en los mensajes de sus commits. Ninguna toca las Tablas 9.1 a 9.5, que siguen siendo las del 01/10/2026: son corridas en el Editor sobre prefabs, clips y código de </w:t>
       </w:r>
       <w:r>
         <w:rPr>
@@ -51132,6 +51144,153 @@
           </w:p>
         </w:tc>
       </w:tr>
+      <w:tr>
+        <w:tc>
+          <w:tcPr>
+            <w:tcW w:w="504" w:type="pct"/>
+            <w:shd w:val="clear" w:color="auto" w:fill="auto"/>
+          </w:tcPr>
+          <w:p>
+            <w:pPr>
+              <w:pStyle w:val="CompactoOE3"/>
+              <w:spacing w:after="0"/>
+              <w:rPr>
+                <w:sz w:val="18"/>
+              </w:rPr>
+            </w:pPr>
+            <w:r>
+              <w:rPr>
+                <w:rStyle w:val="CdigoenlneaOE3"/>
+                <w:sz w:val="18"/>
+              </w:rPr>
+              <w:t>28337c0</w:t>
+            </w:r>
+          </w:p>
+        </w:tc>
+        <w:tc>
+          <w:tcPr>
+            <w:tcW w:w="809" w:type="pct"/>
+            <w:shd w:val="clear" w:color="auto" w:fill="auto"/>
+          </w:tcPr>
+          <w:p>
+            <w:pPr>
+              <w:pStyle w:val="CompactoOE3"/>
+              <w:spacing w:after="0"/>
+              <w:rPr>
+                <w:sz w:val="18"/>
+              </w:rPr>
+            </w:pPr>
+            <w:r>
+              <w:rPr>
+                <w:sz w:val="18"/>
+              </w:rPr>
+              <w:t>Pivote del hombro y gestos sobre la cara (decisiones del 06/10/2026); 11 sprites por prefab de la familia, 93 clips reescritos</w:t>
+            </w:r>
+          </w:p>
+        </w:tc>
+        <w:tc>
+          <w:tcPr>
+            <w:tcW w:w="1209" w:type="pct"/>
+            <w:shd w:val="clear" w:color="auto" w:fill="auto"/>
+          </w:tcPr>
+          <w:p>
+            <w:pPr>
+              <w:pStyle w:val="CompactoOE3"/>
+              <w:spacing w:after="0"/>
+              <w:rPr>
+                <w:sz w:val="18"/>
+              </w:rPr>
+            </w:pPr>
+            <w:r>
+              <w:rPr>
+                <w:sz w:val="18"/>
+              </w:rPr>
+              <w:t>278 de 278</w:t>
+            </w:r>
+          </w:p>
+        </w:tc>
+        <w:tc>
+          <w:tcPr>
+            <w:tcW w:w="767" w:type="pct"/>
+            <w:shd w:val="clear" w:color="auto" w:fill="auto"/>
+          </w:tcPr>
+          <w:p>
+            <w:pPr>
+              <w:pStyle w:val="CompactoOE3"/>
+              <w:spacing w:after="0"/>
+              <w:rPr>
+                <w:sz w:val="18"/>
+              </w:rPr>
+            </w:pPr>
+            <w:r>
+              <w:rPr>
+                <w:sz w:val="18"/>
+              </w:rPr>
+              <w:t>EditMode: 627 pasan, 1 omitida, 0 fallos; PlayMode: 376 de 377</w:t>
+            </w:r>
+          </w:p>
+        </w:tc>
+        <w:tc>
+          <w:tcPr>
+            <w:tcW w:w="1710" w:type="pct"/>
+            <w:shd w:val="clear" w:color="auto" w:fill="auto"/>
+          </w:tcPr>
+          <w:p>
+            <w:pPr>
+              <w:pStyle w:val="CompactoOE3"/>
+              <w:spacing w:after="0"/>
+              <w:rPr>
+                <w:sz w:val="18"/>
+              </w:rPr>
+            </w:pPr>
+            <w:r>
+              <w:rPr>
+                <w:sz w:val="18"/>
+              </w:rPr>
+              <w:t xml:space="preserve">Falla </w:t>
+            </w:r>
+            <w:r>
+              <w:rPr>
+                <w:rStyle w:val="CdigoenlneaOE3"/>
+                <w:sz w:val="18"/>
+              </w:rPr>
+              <w:t>RiverLevel_RNF05</w:t>
+            </w:r>
+            <w:r>
+              <w:rPr>
+                <w:sz w:val="18"/>
+              </w:rPr>
+              <w:t xml:space="preserve"> con 2 353 MB en un Editor de larga duración; </w:t>
+            </w:r>
+            <w:r>
+              <w:rPr>
+                <w:rStyle w:val="CdigoenlneaOE3"/>
+                <w:sz w:val="18"/>
+              </w:rPr>
+              <w:t>CharacterRigLimb</w:t>
+            </w:r>
+            <w:r>
+              <w:rPr>
+                <w:sz w:val="18"/>
+              </w:rPr>
+              <w:t xml:space="preserve"> 14 de 14 y </w:t>
+            </w:r>
+            <w:r>
+              <w:rPr>
+                <w:rStyle w:val="CdigoenlneaOE3"/>
+                <w:sz w:val="18"/>
+              </w:rPr>
+              <w:t>CharacterCapture</w:t>
+            </w:r>
+            <w:r>
+              <w:rPr>
+                <w:sz w:val="18"/>
+              </w:rPr>
+              <w:t xml:space="preserve"> 5 de 5</w:t>
+            </w:r>
+          </w:p>
+        </w:tc>
+      </w:tr>
     </w:tbl>
     <w:p>
       <w:pPr>
@@ -51147,7 +51306,7 @@
         <w:t>Personajes-Resultados.md</w:t>
       </w:r>
       <w:r>
-        <w:t xml:space="preserve"> (anexo C, apartados C.9 y C.10), y quien quiera reproducirlas debe volver a correr la suite. En las rondas de </w:t>
+        <w:t xml:space="preserve"> (anexo C, apartados C.9 a C.11), y quien quiera reproducirlas debe volver a correr la suite. En las rondas de </w:t>
       </w:r>
       <w:r>
         <w:rPr>
@@ -51174,10 +51333,7 @@
         <w:t>suite2.ps1</w:t>
       </w:r>
       <w:r>
-        <w:t xml:space="preserve"> </w:t>
-      </w:r>
-      <w:r>
-        <w:t xml:space="preserve">murió dos veces por memoria al abrir el segundo Editor, de modo que la suite completa se corrió en un solo Editor con </w:t>
+        <w:t xml:space="preserve"> murió dos veces por memoria al abrir el segundo Editor, de modo que la suite completa se corrió en un solo Editor con </w:t>
       </w:r>
       <w:r>
         <w:rPr>
@@ -51210,7 +51366,13 @@
         <w:rPr>
           <w:rStyle w:val="CdigoenlneaOE3"/>
         </w:rPr>
-        <w:t>ForestScene_RF22</w:t>
+        <w:t>ForestScene_RF2</w:t>
+      </w:r>
+      <w:r>
+        <w:rPr>
+          <w:rStyle w:val="CdigoenlneaOE3"/>
+        </w:rPr>
+        <w:t>2</w:t>
       </w:r>
       <w:r>
         <w:t xml:space="preserve"> falla cuando el ratón real del Editor cae sobre el tronco que rueda, y queda como tarea aparte del carril del Nivel 2; </w:t>
@@ -51222,10 +51384,7 @@
         <w:t>RiverLevel_RNF05</w:t>
       </w:r>
       <w:r>
-        <w:t xml:space="preserve"> falla por la memoria que ac</w:t>
-      </w:r>
-      <w:r>
-        <w:t>umula un Editor abierto muchas horas (apartado 8.1), y pasa con el Editor recién abierto.</w:t>
+        <w:t xml:space="preserve"> falla por la memoria que acumula un Editor abierto muchas horas (apartado 8.1), y pasa con el Editor recién abierto.</w:t>
       </w:r>
     </w:p>
     <w:p>
@@ -51237,7 +51396,7 @@
       <w:pPr>
         <w:pStyle w:val="Ttulo1"/>
       </w:pPr>
-      <w:bookmarkStart w:id="50" w:name="_Toc242198254"/>
+      <w:bookmarkStart w:id="50" w:name="_Toc242202641"/>
       <w:r>
         <w:lastRenderedPageBreak/>
         <w:t>10. LIMITACIONES Y TRABAJO PENDIENTE</w:t>
@@ -51259,7 +51418,7 @@
       <w:pPr>
         <w:pStyle w:val="Ttulo2"/>
       </w:pPr>
-      <w:bookmarkStart w:id="51" w:name="_Toc242198255"/>
+      <w:bookmarkStart w:id="51" w:name="_Toc242202642"/>
       <w:r>
         <w:t>10.1 Consistencia documental y puntos abiertos</w:t>
       </w:r>
@@ -52031,14 +52190,14 @@
               <w:rPr>
                 <w:sz w:val="18"/>
               </w:rPr>
-              <w:t xml:space="preserve">Arte final de las tres formas de Algoritm; demás expresiones y bocas del habla; decisiones de coreografía (gestos junto a la </w:t>
+              <w:t xml:space="preserve">Arte final de las tres formas de Algoritm; demás expresiones y bocas del habla; </w:t>
             </w:r>
             <w:r>
               <w:rPr>
                 <w:sz w:val="18"/>
               </w:rPr>
               <w:lastRenderedPageBreak/>
-              <w:t>cabeza, reposo en A); perfiles, retrato animado y emociones de las narrativas</w:t>
+              <w:t>perfiles, retrato animado y emociones de las narrativas</w:t>
             </w:r>
           </w:p>
         </w:tc>
@@ -52084,7 +52243,7 @@
       <w:pPr>
         <w:pStyle w:val="Ttulo2"/>
       </w:pPr>
-      <w:bookmarkStart w:id="52" w:name="_Toc242198256"/>
+      <w:bookmarkStart w:id="52" w:name="_Toc242202643"/>
       <w:r>
         <w:t>10.2 Verificaciones que dependen de otro equipo</w:t>
       </w:r>
@@ -52210,7 +52369,7 @@
       <w:pPr>
         <w:pStyle w:val="Ttulo2"/>
       </w:pPr>
-      <w:bookmarkStart w:id="53" w:name="_Toc242198257"/>
+      <w:bookmarkStart w:id="53" w:name="_Toc242202644"/>
       <w:r>
         <w:t>10.3 Sonido y arte por incorporar</w:t>
       </w:r>
@@ -52448,16 +52607,34 @@
         </w:numPr>
       </w:pPr>
       <w:r>
-        <w:t xml:space="preserve">Dos puntos de coreografía esperan decisión de Santiago Benavides Rey: los gestos cerca de la cabeza, que se abren a los lados, y el reposo en A de los brazos (de 40 a 72°). El caso del brazo de una pieza en </w:t>
+        <w:t>En los gestos junto a la cabeza el brazo del Niño queda de 25 a 33 px corto de la sien. Esos gestos y el reposo de los brazos dejaron de estar pendientes el 06/10/2026: Santiago Benavides Rey aceptó que la mano cubra la cara y que el pivote del hombro suba al borde del torso, y el reposo pasó de una A de 40 a 72° a entre 13 y 20° (</w:t>
       </w:r>
       <w:r>
         <w:rPr>
           <w:rStyle w:val="CdigoenlneaOE3"/>
         </w:rPr>
+        <w:t>6ed4d23</w:t>
+      </w:r>
+      <w:r>
+        <w:t xml:space="preserve"> y </w:t>
+      </w:r>
+      <w:r>
+        <w:rPr>
+          <w:rStyle w:val="CdigoenlneaOE3"/>
+        </w:rPr>
+        <w:t>28337c0</w:t>
+      </w:r>
+      <w:r>
+        <w:t xml:space="preserve">, Anexo F, apartado 2.11). El caso del brazo de una pieza en </w:t>
+      </w:r>
+      <w:r>
+        <w:rPr>
+          <w:rStyle w:val="CdigoenlneaOE3"/>
+        </w:rPr>
         <w:t>Strike</w:t>
       </w:r>
       <w:r>
-        <w:t xml:space="preserve"> dejó de darse en la familia porque los cuatro tienen el brazo partido; el choque se comprobó fuera del motor y no hay captura suya en el Editor.</w:t>
+        <w:t xml:space="preserve"> dejó de darse en la familia porque los cuatro tienen el brazo partido; el choque se comprobó fuera del motor y no hay captura suya en el Editor, como tampoco de los gestos sobre la frente.</w:t>
       </w:r>
     </w:p>
     <w:p>
@@ -52487,7 +52664,10 @@
         <w:t>false</w:t>
       </w:r>
       <w:r>
-        <w:t xml:space="preserve"> y los 18 assets narrativos no declaran ninguna emoción (Anexo F).</w:t>
+        <w:t xml:space="preserve"> </w:t>
+      </w:r>
+      <w:r>
+        <w:t>y los 18 assets narrativos no declaran ninguna emoción (Anexo F).</w:t>
       </w:r>
     </w:p>
     <w:p>
@@ -52515,8 +52695,9 @@
       <w:pPr>
         <w:pStyle w:val="Ttulo2"/>
       </w:pPr>
-      <w:bookmarkStart w:id="54" w:name="_Toc242198258"/>
-      <w:r>
+      <w:bookmarkStart w:id="54" w:name="_Toc242202645"/>
+      <w:r>
+        <w:lastRenderedPageBreak/>
         <w:t>10.4 Deuda técnica menor conocida</w:t>
       </w:r>
       <w:bookmarkEnd w:id="54"/>
@@ -52526,7 +52707,6 @@
         <w:pStyle w:val="PrimerprrafoOE3"/>
       </w:pPr>
       <w:r>
-        <w:lastRenderedPageBreak/>
         <w:t>Los documentos de resultados de los incrementos, en sus notas del 01/10/2026, y los resultados de la evaluación del OE4 registran los puntos siguientes. Ninguno afecta la ruta principal del juego, y ninguno se corrige en este corte, porque el ejecutable del corte es el verificado; cada uno lleva su arreglo propuesto:</w:t>
       </w:r>
     </w:p>
@@ -52677,11 +52857,11 @@
         </w:numPr>
       </w:pPr>
       <w:r>
-        <w:t xml:space="preserve">En el panel de perfiles y el guardado, el aviso del perfil ilegible sale en la columna «Perfil nuevo» y sigue ahí después de borrar ese perfil; corresponde mostrarlo junto a los perfiles guardados y limpiarlo al borrarlo o al elegir otro. La flecha de página que no lleva a ninguna parte se oculta, mientras que las del laberinto se apagan; basta </w:t>
+        <w:t xml:space="preserve">En el panel de perfiles y el guardado, el aviso del perfil ilegible sale en la columna «Perfil nuevo» y sigue ahí después de borrar ese perfil; corresponde mostrarlo junto a los perfiles guardados y limpiarlo al borrarlo o al elegir otro. La flecha de página que </w:t>
       </w:r>
       <w:r>
         <w:lastRenderedPageBreak/>
-        <w:t>dejarla visible y sin respuesta. Un temporal huérfano que otro proceso tenga abierto puede hacer fallar un guardado o un borrado, un caso muy improbable que se resuelve reintentando unas pocas veces. Ningún llamador del guardado captura un fallo de disco, un riesgo anterior a las correcciones del corte; se resuelve capturándolo en un solo sitio y mostrando un aviso sin culpa, como el del perfil ilegible.</w:t>
+        <w:t>no lleva a ninguna parte se oculta, mientras que las del laberinto se apagan; basta dejarla visible y sin respuesta. Un temporal huérfano que otro proceso tenga abierto puede hacer fallar un guardado o un borrado, un caso muy improbable que se resuelve reintentando unas pocas veces. Ningún llamador del guardado captura un fallo de disco, un riesgo anterior a las correcciones del corte; se resuelve capturándolo en un solo sitio y mostrando un aviso sin culpa, como el del perfil ilegible.</w:t>
       </w:r>
     </w:p>
     <w:p>
@@ -52816,7 +52996,11 @@
         <w:t>N1_Apertura</w:t>
       </w:r>
       <w:r>
-        <w:t xml:space="preserve">, donde la familia camina 7 s y la línea 1 la interrumpe). Corregirlo es marcar a esos personajes con </w:t>
+        <w:t xml:space="preserve">, donde la familia camina 7 s y la línea 1 la interrumpe). Corregirlo es </w:t>
+      </w:r>
+      <w:r>
+        <w:lastRenderedPageBreak/>
+        <w:t xml:space="preserve">marcar a esos personajes con </w:t>
       </w:r>
       <w:r>
         <w:rPr>
@@ -52837,7 +53021,6 @@
         </w:numPr>
       </w:pPr>
       <w:r>
-        <w:lastRenderedPageBreak/>
         <w:t>La escena 3.3 en el camino sin fallos queda así: con la balsa bien armada a la primera el juego salta la escena 3.2, como manda el guion, pero la 3.3 abre con «La familia sube a la balsa corregida» y Algoritm la cierra hablando de algo que falló y se arregló. Es el texto radicado del guion. Se corrige con una variante de la 3.3 para ese camino, elegida por la misma regla que decide la 3.2 (</w:t>
       </w:r>
       <w:r>
@@ -52997,7 +53180,10 @@
         <w:t>Single</w:t>
       </w:r>
       <w:r>
-        <w:t xml:space="preserve"> desde el motor o se retiran. El reproductor lleva dos bibliotecas que añade un paquete del Editor (</w:t>
+        <w:t xml:space="preserve"> </w:t>
+      </w:r>
+      <w:r>
+        <w:t>desde el motor o se retiran. El reproductor lleva dos bibliotecas que añade un paquete del Editor (</w:t>
       </w:r>
       <w:r>
         <w:rPr>
@@ -53015,10 +53201,7 @@
         <w:t>Unity.AI.Tracing</w:t>
       </w:r>
       <w:r>
-        <w:t>); no se observó qu</w:t>
-      </w:r>
-      <w:r>
-        <w:t>e abran conexiones (apartado 8.3), y excluirlas exige tocar el manifiesto, así que queda para cuando se revise la decisión D3.</w:t>
+        <w:t>); no se observó que abran conexiones (apartado 8.3), y excluirlas exige tocar el manifiesto, así que queda para cuando se revise la decisión D3.</w:t>
       </w:r>
     </w:p>
     <w:p>
@@ -53051,6 +53234,7 @@
         </w:numPr>
       </w:pPr>
       <w:r>
+        <w:lastRenderedPageBreak/>
         <w:t>La asociación de commits a tarjetas (CT-11) se cumple en parte (apartado 2.5).</w:t>
       </w:r>
     </w:p>
@@ -53058,9 +53242,8 @@
       <w:pPr>
         <w:pStyle w:val="Ttulo2"/>
       </w:pPr>
-      <w:bookmarkStart w:id="55" w:name="_Toc242198259"/>
-      <w:r>
-        <w:lastRenderedPageBreak/>
+      <w:bookmarkStart w:id="55" w:name="_Toc242202646"/>
+      <w:r>
         <w:t>10.5 Lo que pasa al objetivo específico 4</w:t>
       </w:r>
       <w:bookmarkEnd w:id="55"/>
@@ -53170,11 +53353,11 @@
         <w:pStyle w:val="PrimerprrafoOE3"/>
       </w:pPr>
       <w:r>
-        <w:t xml:space="preserve">La consulta del docente no lleva protección de acceso, porque ningún requerimiento la pide (acta D10). Los indicadores del objetivo específico 4, el 90 % de eficacia en las pruebas funcionales y la implementación de todos los requerimientos de prioridad alta, se medirán sobre el ejecutable del corte, el segundo candidato, que es el que se entrega. Las ocho </w:t>
+        <w:t xml:space="preserve">La consulta del docente no lleva protección de acceso, porque ningún requerimiento la pide (acta D10). Los indicadores del objetivo específico 4, el 90 % de eficacia en las pruebas </w:t>
       </w:r>
       <w:r>
         <w:lastRenderedPageBreak/>
-        <w:t>casillas que siguen abiertas en los tableros se marcan cuando Santiago Benavides Rey entregue esos resultados y no pasan a trabajos futuros.</w:t>
+        <w:t>funcionales y la implementación de todos los requerimientos de prioridad alta, se medirán sobre el ejecutable del corte, el segundo candidato, que es el que se entrega. Las ocho casillas que siguen abiertas en los tableros se marcan cuando Santiago Benavides Rey entregue esos resultados y no pasan a trabajos futuros.</w:t>
       </w:r>
     </w:p>
     <w:p>
@@ -53186,7 +53369,7 @@
       <w:pPr>
         <w:pStyle w:val="Ttulo1"/>
       </w:pPr>
-      <w:bookmarkStart w:id="56" w:name="_Toc242198260"/>
+      <w:bookmarkStart w:id="56" w:name="_Toc242202647"/>
       <w:r>
         <w:lastRenderedPageBreak/>
         <w:t>11. CONCLUSIONES</w:t>
@@ -53323,7 +53506,7 @@
       <w:pPr>
         <w:pStyle w:val="Ttulo1"/>
       </w:pPr>
-      <w:bookmarkStart w:id="57" w:name="_Toc242198261"/>
+      <w:bookmarkStart w:id="57" w:name="_Toc242202648"/>
       <w:r>
         <w:lastRenderedPageBreak/>
         <w:t>12. CONTROL DE CAMBIOS</w:t>
@@ -54026,6 +54209,123 @@
                 <w:sz w:val="18"/>
               </w:rPr>
               <w:t xml:space="preserve"> (Tabla 9.6); apartado 2.10 y Tabla F.13 del Anexo F; pendientes de personajes del apartado 10.3 al día; sin modificar las Tablas 1.2, 2.2, 4.12, 8.1, 8.2, 8.3 ni 9.1 a 9.5 ni el Anexo A</w:t>
+            </w:r>
+          </w:p>
+        </w:tc>
+        <w:tc>
+          <w:tcPr>
+            <w:tcW w:w="995" w:type="pct"/>
+            <w:shd w:val="clear" w:color="auto" w:fill="auto"/>
+          </w:tcPr>
+          <w:p>
+            <w:pPr>
+              <w:pStyle w:val="CompactoOE3"/>
+              <w:spacing w:after="0"/>
+              <w:rPr>
+                <w:sz w:val="18"/>
+              </w:rPr>
+            </w:pPr>
+            <w:r>
+              <w:rPr>
+                <w:sz w:val="18"/>
+              </w:rPr>
+              <w:t>Santiago Benavides Rey</w:t>
+            </w:r>
+          </w:p>
+        </w:tc>
+      </w:tr>
+      <w:tr>
+        <w:tc>
+          <w:tcPr>
+            <w:tcW w:w="711" w:type="pct"/>
+            <w:shd w:val="clear" w:color="auto" w:fill="auto"/>
+          </w:tcPr>
+          <w:p>
+            <w:pPr>
+              <w:pStyle w:val="CompactoOE3"/>
+              <w:spacing w:after="0"/>
+              <w:rPr>
+                <w:sz w:val="18"/>
+              </w:rPr>
+            </w:pPr>
+            <w:r>
+              <w:rPr>
+                <w:sz w:val="18"/>
+              </w:rPr>
+              <w:t>06/10/2026</w:t>
+            </w:r>
+          </w:p>
+        </w:tc>
+        <w:tc>
+          <w:tcPr>
+            <w:tcW w:w="3294" w:type="pct"/>
+            <w:shd w:val="clear" w:color="auto" w:fill="auto"/>
+          </w:tcPr>
+          <w:p>
+            <w:pPr>
+              <w:pStyle w:val="CompactoOE3"/>
+              <w:spacing w:after="0"/>
+              <w:rPr>
+                <w:sz w:val="18"/>
+              </w:rPr>
+            </w:pPr>
+            <w:r>
+              <w:rPr>
+                <w:sz w:val="18"/>
+              </w:rPr>
+              <w:t>Pivote del hombro y gestos sobre la cara (</w:t>
+            </w:r>
+            <w:r>
+              <w:rPr>
+                <w:rStyle w:val="CdigoenlneaOE3"/>
+                <w:sz w:val="18"/>
+              </w:rPr>
+              <w:t>6ed4d23</w:t>
+            </w:r>
+            <w:r>
+              <w:rPr>
+                <w:sz w:val="18"/>
+              </w:rPr>
+              <w:t xml:space="preserve"> y </w:t>
+            </w:r>
+            <w:r>
+              <w:rPr>
+                <w:rStyle w:val="CdigoenlneaOE3"/>
+                <w:sz w:val="18"/>
+              </w:rPr>
+              <w:t>28337c0</w:t>
+            </w:r>
+            <w:r>
+              <w:rPr>
+                <w:sz w:val="18"/>
+              </w:rPr>
+              <w:t xml:space="preserve">), con la ronda del Editor de </w:t>
+            </w:r>
+            <w:r>
+              <w:rPr>
+                <w:rStyle w:val="CdigoenlneaOE3"/>
+                <w:sz w:val="18"/>
+              </w:rPr>
+              <w:t>28337c0</w:t>
+            </w:r>
+            <w:r>
+              <w:rPr>
+                <w:sz w:val="18"/>
+              </w:rPr>
+              <w:t xml:space="preserve"> (Tabla 9.6); apartado 2.11 y Tabla F.13 del Anexo F, Figuras F.1 a F.3 regeneradas sobre el árbol de </w:t>
+            </w:r>
+            <w:r>
+              <w:rPr>
+                <w:rStyle w:val="CdigoenlneaOE3"/>
+                <w:sz w:val="18"/>
+              </w:rPr>
+              <w:t>28337c0</w:t>
+            </w:r>
+            <w:r>
+              <w:rPr>
+                <w:sz w:val="18"/>
+              </w:rPr>
+              <w:t>; pendientes de personajes del apartado 10.3 al día; sin modificar las Tablas 1.2, 2.2, 4.12, 8.1, 8.2, 8.3 ni 9.1 a 9.5 ni el Anexo A</w:t>
             </w:r>
           </w:p>
         </w:tc>
@@ -54251,7 +54551,7 @@
   <w:abstractNum w:abstractNumId="0" w15:restartNumberingAfterBreak="0">
     <w:nsid w:val="0000A990"/>
     <w:multiLevelType w:val="multilevel"/>
-    <w:tmpl w:val="C7A8F40C"/>
+    <w:tmpl w:val="BED8F52A"/>
     <w:lvl w:ilvl="0">
       <w:numFmt w:val="bullet"/>
       <w:lvlText w:val=" "/>
@@ -54328,7 +54628,7 @@
   <w:abstractNum w:abstractNumId="1" w15:restartNumberingAfterBreak="0">
     <w:nsid w:val="0000A991"/>
     <w:multiLevelType w:val="multilevel"/>
-    <w:tmpl w:val="471EAD00"/>
+    <w:tmpl w:val="CB58809A"/>
     <w:lvl w:ilvl="0">
       <w:numFmt w:val="bullet"/>
       <w:lvlText w:val=""/>
@@ -54628,64 +54928,64 @@
       </w:pPr>
     </w:lvl>
   </w:abstractNum>
-  <w:num w:numId="1" w16cid:durableId="86080455">
+  <w:num w:numId="1" w16cid:durableId="1902014190">
     <w:abstractNumId w:val="2"/>
   </w:num>
-  <w:num w:numId="2" w16cid:durableId="897085922">
+  <w:num w:numId="2" w16cid:durableId="1495678106">
     <w:abstractNumId w:val="3"/>
     <w:lvlOverride w:ilvl="0">
       <w:startOverride w:val="1"/>
     </w:lvlOverride>
   </w:num>
-  <w:num w:numId="3" w16cid:durableId="516122578">
+  <w:num w:numId="3" w16cid:durableId="818307205">
     <w:abstractNumId w:val="0"/>
   </w:num>
-  <w:num w:numId="4" w16cid:durableId="1552616775">
+  <w:num w:numId="4" w16cid:durableId="659312792">
     <w:abstractNumId w:val="1"/>
   </w:num>
-  <w:num w:numId="5" w16cid:durableId="1211334367">
+  <w:num w:numId="5" w16cid:durableId="1533223544">
     <w:abstractNumId w:val="1"/>
   </w:num>
-  <w:num w:numId="6" w16cid:durableId="1412849560">
+  <w:num w:numId="6" w16cid:durableId="1233467980">
     <w:abstractNumId w:val="1"/>
   </w:num>
-  <w:num w:numId="7" w16cid:durableId="311057107">
+  <w:num w:numId="7" w16cid:durableId="43524027">
     <w:abstractNumId w:val="1"/>
   </w:num>
-  <w:num w:numId="8" w16cid:durableId="159394183">
+  <w:num w:numId="8" w16cid:durableId="1678575670">
     <w:abstractNumId w:val="1"/>
   </w:num>
-  <w:num w:numId="9" w16cid:durableId="622998481">
+  <w:num w:numId="9" w16cid:durableId="1574240269">
     <w:abstractNumId w:val="1"/>
   </w:num>
-  <w:num w:numId="10" w16cid:durableId="483861159">
+  <w:num w:numId="10" w16cid:durableId="957686451">
     <w:abstractNumId w:val="1"/>
   </w:num>
-  <w:num w:numId="11" w16cid:durableId="1228148761">
+  <w:num w:numId="11" w16cid:durableId="826557410">
     <w:abstractNumId w:val="1"/>
   </w:num>
-  <w:num w:numId="12" w16cid:durableId="1319458829">
+  <w:num w:numId="12" w16cid:durableId="1305741370">
     <w:abstractNumId w:val="1"/>
   </w:num>
-  <w:num w:numId="13" w16cid:durableId="726952240">
+  <w:num w:numId="13" w16cid:durableId="544025645">
     <w:abstractNumId w:val="1"/>
   </w:num>
-  <w:num w:numId="14" w16cid:durableId="1462767626">
+  <w:num w:numId="14" w16cid:durableId="3557831">
     <w:abstractNumId w:val="1"/>
   </w:num>
-  <w:num w:numId="15" w16cid:durableId="666397257">
+  <w:num w:numId="15" w16cid:durableId="1474370514">
     <w:abstractNumId w:val="1"/>
   </w:num>
-  <w:num w:numId="16" w16cid:durableId="876963519">
+  <w:num w:numId="16" w16cid:durableId="655260732">
     <w:abstractNumId w:val="1"/>
   </w:num>
-  <w:num w:numId="17" w16cid:durableId="84108850">
+  <w:num w:numId="17" w16cid:durableId="660474017">
     <w:abstractNumId w:val="1"/>
   </w:num>
-  <w:num w:numId="18" w16cid:durableId="111411836">
+  <w:num w:numId="18" w16cid:durableId="67240250">
     <w:abstractNumId w:val="1"/>
   </w:num>
-  <w:num w:numId="19" w16cid:durableId="297608754">
+  <w:num w:numId="19" w16cid:durableId="1176504512">
     <w:abstractNumId w:val="1"/>
   </w:num>
 </w:numbering>
@@ -55491,7 +55791,7 @@
     <w:link w:val="EncabezadoCar"/>
     <w:uiPriority w:val="99"/>
     <w:unhideWhenUsed/>
-    <w:rsid w:val="00455F36"/>
+    <w:rsid w:val="00702633"/>
     <w:pPr>
       <w:tabs>
         <w:tab w:val="center" w:pos="4419"/>
@@ -55505,7 +55805,7 @@
     <w:basedOn w:val="Fuentedeprrafopredeter"/>
     <w:link w:val="Encabezado"/>
     <w:uiPriority w:val="99"/>
-    <w:rsid w:val="00455F36"/>
+    <w:rsid w:val="00702633"/>
   </w:style>
   <w:style w:type="paragraph" w:styleId="Piedepgina">
     <w:name w:val="footer"/>
@@ -55513,7 +55813,7 @@
     <w:link w:val="PiedepginaCar"/>
     <w:uiPriority w:val="99"/>
     <w:unhideWhenUsed/>
-    <w:rsid w:val="00455F36"/>
+    <w:rsid w:val="00702633"/>
     <w:pPr>
       <w:tabs>
         <w:tab w:val="center" w:pos="4419"/>
@@ -55527,7 +55827,7 @@
     <w:basedOn w:val="Fuentedeprrafopredeter"/>
     <w:link w:val="Piedepgina"/>
     <w:uiPriority w:val="99"/>
-    <w:rsid w:val="00455F36"/>
+    <w:rsid w:val="00702633"/>
   </w:style>
   <w:style w:type="character" w:styleId="Nmerodepgina">
     <w:name w:val="page number"/>
@@ -55535,7 +55835,7 @@
     <w:uiPriority w:val="99"/>
     <w:semiHidden/>
     <w:unhideWhenUsed/>
-    <w:rsid w:val="00455F36"/>
+    <w:rsid w:val="00702633"/>
   </w:style>
 </w:styles>
 </file>

</xml_diff>